<commit_message>
Correccion 04 - OK hasta Zuñiga
</commit_message>
<xml_diff>
--- a/Practicos/Notas y Devoluciones 04.docx
+++ b/Practicos/Notas y Devoluciones 04.docx
@@ -1,6 +1,6 @@
 
 <file path=word/document.xml><?xml version="1.0" encoding="utf-8"?>
-<w:document xmlns:wpc="http://schemas.microsoft.com/office/word/2010/wordprocessingCanvas" xmlns:cx="http://schemas.microsoft.com/office/drawing/2014/chartex" xmlns:cx1="http://schemas.microsoft.com/office/drawing/2015/9/8/chartex" xmlns:cx2="http://schemas.microsoft.com/office/drawing/2015/10/21/chartex" xmlns:cx3="http://schemas.microsoft.com/office/drawing/2016/5/9/chartex" xmlns:cx4="http://schemas.microsoft.com/office/drawing/2016/5/10/chartex" xmlns:cx5="http://schemas.microsoft.com/office/drawing/2016/5/11/chartex" xmlns:cx6="http://schemas.microsoft.com/office/drawing/2016/5/12/chartex" xmlns:cx7="http://schemas.microsoft.com/office/drawing/2016/5/13/chartex" xmlns:cx8="http://schemas.microsoft.com/office/drawing/2016/5/14/chartex" xmlns:mc="http://schemas.openxmlformats.org/markup-compatibility/2006" xmlns:aink="http://schemas.microsoft.com/office/drawing/2016/ink" xmlns:am3d="http://schemas.microsoft.com/office/drawing/2017/model3d" xmlns:o="urn:schemas-microsoft-com:office:office" xmlns:oel="http://schemas.microsoft.com/office/2019/extlst" xmlns:r="http://schemas.openxmlformats.org/officeDocument/2006/relationships" xmlns:m="http://schemas.openxmlformats.org/officeDocument/2006/math" xmlns:v="urn:schemas-microsoft-com:vml" xmlns:wp14="http://schemas.microsoft.com/office/word/2010/wordprocessingDrawing" xmlns:wp="http://schemas.openxmlformats.org/drawingml/2006/wordprocessingDrawing" xmlns:w10="urn:schemas-microsoft-com:office:word" xmlns:w="http://schemas.openxmlformats.org/wordprocessingml/2006/main" xmlns:w14="http://schemas.microsoft.com/office/word/2010/wordml" xmlns:w15="http://schemas.microsoft.com/office/word/2012/wordml" xmlns:w16cex="http://schemas.microsoft.com/office/word/2018/wordml/cex" xmlns:w16cid="http://schemas.microsoft.com/office/word/2016/wordml/cid" xmlns:w16="http://schemas.microsoft.com/office/word/2018/wordml" xmlns:w16du="http://schemas.microsoft.com/office/word/2023/wordml/word16du" xmlns:w16sdtdh="http://schemas.microsoft.com/office/word/2020/wordml/sdtdatahash" xmlns:w16sdtfl="http://schemas.microsoft.com/office/word/2024/wordml/sdtformatlock" xmlns:w16se="http://schemas.microsoft.com/office/word/2015/wordml/symex" xmlns:wpg="http://schemas.microsoft.com/office/word/2010/wordprocessingGroup" xmlns:wpi="http://schemas.microsoft.com/office/word/2010/wordprocessingInk" xmlns:wne="http://schemas.microsoft.com/office/word/2006/wordml" xmlns:wps="http://schemas.microsoft.com/office/word/2010/wordprocessingShape" mc:Ignorable="w14 w15 w16se w16cid w16 w16cex w16sdtdh w16sdtfl w16du wp14">
+<w:document xmlns:wpc="http://schemas.microsoft.com/office/word/2010/wordprocessingCanvas" xmlns:cx="http://schemas.microsoft.com/office/drawing/2014/chartex" xmlns:cx1="http://schemas.microsoft.com/office/drawing/2015/9/8/chartex" xmlns:cx2="http://schemas.microsoft.com/office/drawing/2015/10/21/chartex" xmlns:cx3="http://schemas.microsoft.com/office/drawing/2016/5/9/chartex" xmlns:cx4="http://schemas.microsoft.com/office/drawing/2016/5/10/chartex" xmlns:cx5="http://schemas.microsoft.com/office/drawing/2016/5/11/chartex" xmlns:cx6="http://schemas.microsoft.com/office/drawing/2016/5/12/chartex" xmlns:cx7="http://schemas.microsoft.com/office/drawing/2016/5/13/chartex" xmlns:cx8="http://schemas.microsoft.com/office/drawing/2016/5/14/chartex" xmlns:mc="http://schemas.openxmlformats.org/markup-compatibility/2006" xmlns:aink="http://schemas.microsoft.com/office/drawing/2016/ink" xmlns:am3d="http://schemas.microsoft.com/office/drawing/2017/model3d" xmlns:o="urn:schemas-microsoft-com:office:office" xmlns:oel="http://schemas.microsoft.com/office/2019/extlst" xmlns:r="http://schemas.openxmlformats.org/officeDocument/2006/relationships" xmlns:m="http://schemas.openxmlformats.org/officeDocument/2006/math" xmlns:v="urn:schemas-microsoft-com:vml" xmlns:wp14="http://schemas.microsoft.com/office/word/2010/wordprocessingDrawing" xmlns:wp="http://schemas.openxmlformats.org/drawingml/2006/wordprocessingDrawing" xmlns:w10="urn:schemas-microsoft-com:office:word" xmlns:w="http://schemas.openxmlformats.org/wordprocessingml/2006/main" xmlns:w14="http://schemas.microsoft.com/office/word/2010/wordml" xmlns:w15="http://schemas.microsoft.com/office/word/2012/wordml" xmlns:w16cex="http://schemas.microsoft.com/office/word/2018/wordml/cex" xmlns:w16cid="http://schemas.microsoft.com/office/word/2016/wordml/cid" xmlns:w16="http://schemas.microsoft.com/office/word/2018/wordml" xmlns:w16sdtdh="http://schemas.microsoft.com/office/word/2020/wordml/sdtdatahash" xmlns:w16se="http://schemas.microsoft.com/office/word/2015/wordml/symex" xmlns:wpg="http://schemas.microsoft.com/office/word/2010/wordprocessingGroup" xmlns:wpi="http://schemas.microsoft.com/office/word/2010/wordprocessingInk" xmlns:wne="http://schemas.microsoft.com/office/word/2006/wordml" xmlns:wps="http://schemas.microsoft.com/office/word/2010/wordprocessingShape" mc:Ignorable="w14 w15 w16se w16cid w16 w16cex w16sdtdh wp14">
   <w:body>
     <w:p>
       <w:pPr>
@@ -35,6 +35,7 @@
           <w:rFonts w:ascii="Segoe UI Emoji" w:hAnsi="Segoe UI Emoji" w:cs="Segoe UI Emoji"/>
         </w:rPr>
       </w:pPr>
+      <w:proofErr w:type="gramStart"/>
       <w:r>
         <w:rPr>
           <w:rFonts w:ascii="Segoe UI Emoji" w:hAnsi="Segoe UI Emoji" w:cs="Segoe UI Emoji"/>
@@ -42,7 +43,11 @@
         <w:t>🎉</w:t>
       </w:r>
       <w:r>
-        <w:t xml:space="preserve">¡Felicitaciones por la entrega del Desafío 04! </w:t>
+        <w:t>¡</w:t>
+      </w:r>
+      <w:proofErr w:type="gramEnd"/>
+      <w:r>
+        <w:t xml:space="preserve">Felicitaciones por la entrega del Desafío 04! </w:t>
       </w:r>
       <w:r>
         <w:rPr>
@@ -54,16 +59,37 @@
     <w:p/>
     <w:p>
       <w:r>
-        <w:t>Facundo</w:t>
-      </w:r>
-      <w:r>
-        <w:t>, excelente trabajo, te felicito. Destaco la prolijidad de tu proyecto.</w:t>
-      </w:r>
-    </w:p>
-    <w:p/>
-    <w:p>
-      <w:r>
-        <w:t>La estructura HTML esta impecable, destaco la correcta implementación de contenedores semánticos como main, section, footer, etc.</w:t>
+        <w:t>Facundo, excelente trabajo, te felicito. Destaco la prolijidad de tu proyecto.</w:t>
+      </w:r>
+    </w:p>
+    <w:p/>
+    <w:p>
+      <w:r>
+        <w:t xml:space="preserve">La estructura HTML esta impecable, destaco la correcta implementación de contenedores semánticos como </w:t>
+      </w:r>
+      <w:proofErr w:type="spellStart"/>
+      <w:r>
+        <w:t>main</w:t>
+      </w:r>
+      <w:proofErr w:type="spellEnd"/>
+      <w:r>
+        <w:t xml:space="preserve">, </w:t>
+      </w:r>
+      <w:proofErr w:type="spellStart"/>
+      <w:r>
+        <w:t>section</w:t>
+      </w:r>
+      <w:proofErr w:type="spellEnd"/>
+      <w:r>
+        <w:t xml:space="preserve">, </w:t>
+      </w:r>
+      <w:proofErr w:type="spellStart"/>
+      <w:r>
+        <w:t>footer</w:t>
+      </w:r>
+      <w:proofErr w:type="spellEnd"/>
+      <w:r>
+        <w:t>, etc.</w:t>
       </w:r>
     </w:p>
     <w:p/>
@@ -75,7 +101,15 @@
     <w:p/>
     <w:p>
       <w:r>
-        <w:t>La disposición de elementos en la landing page quedo tal cual lo solicitado con la herramienta Flex.</w:t>
+        <w:t xml:space="preserve">La disposición de elementos en la </w:t>
+      </w:r>
+      <w:proofErr w:type="spellStart"/>
+      <w:r>
+        <w:t>landing</w:t>
+      </w:r>
+      <w:proofErr w:type="spellEnd"/>
+      <w:r>
+        <w:t xml:space="preserve"> page quedo tal cual lo solicitado con la herramienta Flex.</w:t>
       </w:r>
     </w:p>
     <w:p/>
@@ -133,6 +167,7 @@
           <w:bCs/>
         </w:rPr>
       </w:pPr>
+      <w:proofErr w:type="spellStart"/>
       <w:r>
         <w:rPr>
           <w:rFonts w:ascii="Segoe UI Emoji" w:hAnsi="Segoe UI Emoji" w:cs="Segoe UI Emoji"/>
@@ -155,24 +190,44 @@
           <w:b/>
           <w:bCs/>
         </w:rPr>
-        <w:t>lez Diego Gaston</w:t>
-      </w:r>
-    </w:p>
-    <w:p>
-      <w:pPr>
-        <w:rPr>
-          <w:rFonts w:ascii="Segoe UI Emoji" w:hAnsi="Segoe UI Emoji" w:cs="Segoe UI Emoji"/>
-          <w:b/>
-          <w:bCs/>
-        </w:rPr>
-      </w:pPr>
-    </w:p>
-    <w:p>
-      <w:pPr>
-        <w:rPr>
-          <w:rFonts w:ascii="Segoe UI Emoji" w:hAnsi="Segoe UI Emoji" w:cs="Segoe UI Emoji"/>
-        </w:rPr>
-      </w:pPr>
+        <w:t>lez</w:t>
+      </w:r>
+      <w:proofErr w:type="spellEnd"/>
+      <w:r>
+        <w:rPr>
+          <w:rFonts w:ascii="Segoe UI Emoji" w:hAnsi="Segoe UI Emoji" w:cs="Segoe UI Emoji"/>
+          <w:b/>
+          <w:bCs/>
+        </w:rPr>
+        <w:t xml:space="preserve"> Diego </w:t>
+      </w:r>
+      <w:proofErr w:type="spellStart"/>
+      <w:r>
+        <w:rPr>
+          <w:rFonts w:ascii="Segoe UI Emoji" w:hAnsi="Segoe UI Emoji" w:cs="Segoe UI Emoji"/>
+          <w:b/>
+          <w:bCs/>
+        </w:rPr>
+        <w:t>Gaston</w:t>
+      </w:r>
+      <w:proofErr w:type="spellEnd"/>
+    </w:p>
+    <w:p>
+      <w:pPr>
+        <w:rPr>
+          <w:rFonts w:ascii="Segoe UI Emoji" w:hAnsi="Segoe UI Emoji" w:cs="Segoe UI Emoji"/>
+          <w:b/>
+          <w:bCs/>
+        </w:rPr>
+      </w:pPr>
+    </w:p>
+    <w:p>
+      <w:pPr>
+        <w:rPr>
+          <w:rFonts w:ascii="Segoe UI Emoji" w:hAnsi="Segoe UI Emoji" w:cs="Segoe UI Emoji"/>
+        </w:rPr>
+      </w:pPr>
+      <w:proofErr w:type="gramStart"/>
       <w:r>
         <w:rPr>
           <w:rFonts w:ascii="Segoe UI Emoji" w:hAnsi="Segoe UI Emoji" w:cs="Segoe UI Emoji"/>
@@ -180,7 +235,11 @@
         <w:t>🎉</w:t>
       </w:r>
       <w:r>
-        <w:t xml:space="preserve">¡Felicitaciones por la entrega del Desafío 03! </w:t>
+        <w:t>¡</w:t>
+      </w:r>
+      <w:proofErr w:type="gramEnd"/>
+      <w:r>
+        <w:t xml:space="preserve">Felicitaciones por la entrega del Desafío 03! </w:t>
       </w:r>
       <w:r>
         <w:rPr>
@@ -198,13 +257,45 @@
     <w:p/>
     <w:p>
       <w:r>
-        <w:t>La estructura HTML esta impecable, destaco la correcta implementación de contenedores semánticos como main, section, footer, etc. El manejo de listas, textos y títulos es correcto.</w:t>
-      </w:r>
-    </w:p>
-    <w:p/>
-    <w:p>
-      <w:r>
-        <w:t>La barra de navegación principal quedo ok, los links configurados con estado hover como se solicitó.</w:t>
+        <w:t xml:space="preserve">La estructura HTML esta impecable, destaco la correcta implementación de contenedores semánticos como </w:t>
+      </w:r>
+      <w:proofErr w:type="spellStart"/>
+      <w:r>
+        <w:t>main</w:t>
+      </w:r>
+      <w:proofErr w:type="spellEnd"/>
+      <w:r>
+        <w:t xml:space="preserve">, </w:t>
+      </w:r>
+      <w:proofErr w:type="spellStart"/>
+      <w:r>
+        <w:t>section</w:t>
+      </w:r>
+      <w:proofErr w:type="spellEnd"/>
+      <w:r>
+        <w:t xml:space="preserve">, </w:t>
+      </w:r>
+      <w:proofErr w:type="spellStart"/>
+      <w:r>
+        <w:t>footer</w:t>
+      </w:r>
+      <w:proofErr w:type="spellEnd"/>
+      <w:r>
+        <w:t>, etc. El manejo de listas, textos y títulos es correcto.</w:t>
+      </w:r>
+    </w:p>
+    <w:p/>
+    <w:p>
+      <w:r>
+        <w:t xml:space="preserve">La barra de navegación principal quedo ok, los links configurados con estado </w:t>
+      </w:r>
+      <w:proofErr w:type="spellStart"/>
+      <w:r>
+        <w:t>hover</w:t>
+      </w:r>
+      <w:proofErr w:type="spellEnd"/>
+      <w:r>
+        <w:t xml:space="preserve"> como se solicitó.</w:t>
       </w:r>
     </w:p>
     <w:p/>
@@ -216,7 +307,23 @@
         <w:t xml:space="preserve">La implementación de Formularios es correcta, los campos con sus tipos de datos respectivos. Acá </w:t>
       </w:r>
       <w:r>
-        <w:t xml:space="preserve">la asociación de label e input a través de atributo for </w:t>
+        <w:t xml:space="preserve">la asociación de </w:t>
+      </w:r>
+      <w:proofErr w:type="spellStart"/>
+      <w:r>
+        <w:t>label</w:t>
+      </w:r>
+      <w:proofErr w:type="spellEnd"/>
+      <w:r>
+        <w:t xml:space="preserve"> e input a través de atributo </w:t>
+      </w:r>
+      <w:proofErr w:type="spellStart"/>
+      <w:r>
+        <w:t>for</w:t>
+      </w:r>
+      <w:proofErr w:type="spellEnd"/>
+      <w:r>
+        <w:t xml:space="preserve"> </w:t>
       </w:r>
       <w:r>
         <w:t>e</w:t>
@@ -228,7 +335,23 @@
     <w:p/>
     <w:p>
       <w:r>
-        <w:t>Los estilos solicitados tanto en colores, fuentes y dimensiones quedaron ok, también aplicaste correctamente las propiedades de box model. EL layout quedó responsivo como se solicitó en enunciado.</w:t>
+        <w:t xml:space="preserve">Los estilos solicitados tanto en colores, fuentes y dimensiones quedaron ok, también aplicaste correctamente las propiedades de box </w:t>
+      </w:r>
+      <w:proofErr w:type="spellStart"/>
+      <w:r>
+        <w:t>model</w:t>
+      </w:r>
+      <w:proofErr w:type="spellEnd"/>
+      <w:r>
+        <w:t xml:space="preserve">. EL </w:t>
+      </w:r>
+      <w:proofErr w:type="spellStart"/>
+      <w:r>
+        <w:t>layout</w:t>
+      </w:r>
+      <w:proofErr w:type="spellEnd"/>
+      <w:r>
+        <w:t xml:space="preserve"> quedó responsivo como se solicitó en enunciado.</w:t>
       </w:r>
     </w:p>
     <w:p/>
@@ -262,30 +385,51 @@
           <w:u w:val="single"/>
         </w:rPr>
       </w:pPr>
-      <w:r>
-        <w:rPr>
-          <w:rFonts w:ascii="Segoe UI Emoji" w:hAnsi="Segoe UI Emoji" w:cs="Segoe UI Emoji"/>
-          <w:b/>
-          <w:bCs/>
-        </w:rPr>
-        <w:t>Albarracin Agustin</w:t>
-      </w:r>
-    </w:p>
-    <w:p>
-      <w:pPr>
-        <w:rPr>
-          <w:rFonts w:ascii="Segoe UI Emoji" w:hAnsi="Segoe UI Emoji" w:cs="Segoe UI Emoji"/>
-          <w:b/>
-          <w:bCs/>
-        </w:rPr>
-      </w:pPr>
-    </w:p>
-    <w:p>
-      <w:pPr>
-        <w:rPr>
-          <w:rFonts w:ascii="Segoe UI Emoji" w:hAnsi="Segoe UI Emoji" w:cs="Segoe UI Emoji"/>
-        </w:rPr>
-      </w:pPr>
+      <w:proofErr w:type="spellStart"/>
+      <w:r>
+        <w:rPr>
+          <w:rFonts w:ascii="Segoe UI Emoji" w:hAnsi="Segoe UI Emoji" w:cs="Segoe UI Emoji"/>
+          <w:b/>
+          <w:bCs/>
+        </w:rPr>
+        <w:t>Albarracin</w:t>
+      </w:r>
+      <w:proofErr w:type="spellEnd"/>
+      <w:r>
+        <w:rPr>
+          <w:rFonts w:ascii="Segoe UI Emoji" w:hAnsi="Segoe UI Emoji" w:cs="Segoe UI Emoji"/>
+          <w:b/>
+          <w:bCs/>
+        </w:rPr>
+        <w:t xml:space="preserve"> </w:t>
+      </w:r>
+      <w:proofErr w:type="spellStart"/>
+      <w:r>
+        <w:rPr>
+          <w:rFonts w:ascii="Segoe UI Emoji" w:hAnsi="Segoe UI Emoji" w:cs="Segoe UI Emoji"/>
+          <w:b/>
+          <w:bCs/>
+        </w:rPr>
+        <w:t>Agustin</w:t>
+      </w:r>
+      <w:proofErr w:type="spellEnd"/>
+    </w:p>
+    <w:p>
+      <w:pPr>
+        <w:rPr>
+          <w:rFonts w:ascii="Segoe UI Emoji" w:hAnsi="Segoe UI Emoji" w:cs="Segoe UI Emoji"/>
+          <w:b/>
+          <w:bCs/>
+        </w:rPr>
+      </w:pPr>
+    </w:p>
+    <w:p>
+      <w:pPr>
+        <w:rPr>
+          <w:rFonts w:ascii="Segoe UI Emoji" w:hAnsi="Segoe UI Emoji" w:cs="Segoe UI Emoji"/>
+        </w:rPr>
+      </w:pPr>
+      <w:proofErr w:type="gramStart"/>
       <w:r>
         <w:rPr>
           <w:rFonts w:ascii="Segoe UI Emoji" w:hAnsi="Segoe UI Emoji" w:cs="Segoe UI Emoji"/>
@@ -293,7 +437,11 @@
         <w:t>🎉</w:t>
       </w:r>
       <w:r>
-        <w:t xml:space="preserve">¡Felicitaciones por la entrega del Desafío 04! </w:t>
+        <w:t>¡</w:t>
+      </w:r>
+      <w:proofErr w:type="gramEnd"/>
+      <w:r>
+        <w:t xml:space="preserve">Felicitaciones por la entrega del Desafío 04! </w:t>
       </w:r>
       <w:r>
         <w:rPr>
@@ -304,9 +452,11 @@
     </w:p>
     <w:p/>
     <w:p>
+      <w:proofErr w:type="spellStart"/>
       <w:r>
         <w:t>Agustin</w:t>
       </w:r>
+      <w:proofErr w:type="spellEnd"/>
       <w:r>
         <w:t>, excelente trabajo, te felicito. Destaco la prolijidad de tu proyecto.</w:t>
       </w:r>
@@ -314,7 +464,31 @@
     <w:p/>
     <w:p>
       <w:r>
-        <w:t>La estructura HTML esta impecable, destaco la correcta implementación de contenedores semánticos como main, section, footer, etc.</w:t>
+        <w:t xml:space="preserve">La estructura HTML esta impecable, destaco la correcta implementación de contenedores semánticos como </w:t>
+      </w:r>
+      <w:proofErr w:type="spellStart"/>
+      <w:r>
+        <w:t>main</w:t>
+      </w:r>
+      <w:proofErr w:type="spellEnd"/>
+      <w:r>
+        <w:t xml:space="preserve">, </w:t>
+      </w:r>
+      <w:proofErr w:type="spellStart"/>
+      <w:r>
+        <w:t>section</w:t>
+      </w:r>
+      <w:proofErr w:type="spellEnd"/>
+      <w:r>
+        <w:t xml:space="preserve">, </w:t>
+      </w:r>
+      <w:proofErr w:type="spellStart"/>
+      <w:r>
+        <w:t>footer</w:t>
+      </w:r>
+      <w:proofErr w:type="spellEnd"/>
+      <w:r>
+        <w:t>, etc.</w:t>
       </w:r>
     </w:p>
     <w:p/>
@@ -326,7 +500,15 @@
     <w:p/>
     <w:p>
       <w:r>
-        <w:t>La disposición de elementos en la landing page quedo tal cual lo solicitado con la herramienta Flex.</w:t>
+        <w:t xml:space="preserve">La disposición de elementos en la </w:t>
+      </w:r>
+      <w:proofErr w:type="spellStart"/>
+      <w:r>
+        <w:t>landing</w:t>
+      </w:r>
+      <w:proofErr w:type="spellEnd"/>
+      <w:r>
+        <w:t xml:space="preserve"> page quedo tal cual lo solicitado con la herramienta Flex.</w:t>
       </w:r>
     </w:p>
     <w:p/>
@@ -419,6 +601,7 @@
           <w:rFonts w:ascii="Segoe UI Emoji" w:hAnsi="Segoe UI Emoji" w:cs="Segoe UI Emoji"/>
         </w:rPr>
       </w:pPr>
+      <w:proofErr w:type="gramStart"/>
       <w:r>
         <w:rPr>
           <w:rFonts w:ascii="Segoe UI Emoji" w:hAnsi="Segoe UI Emoji" w:cs="Segoe UI Emoji"/>
@@ -426,7 +609,11 @@
         <w:t>🎉</w:t>
       </w:r>
       <w:r>
-        <w:t xml:space="preserve">¡Felicitaciones por la entrega del Desafío 03! </w:t>
+        <w:t>¡</w:t>
+      </w:r>
+      <w:proofErr w:type="gramEnd"/>
+      <w:r>
+        <w:t xml:space="preserve">Felicitaciones por la entrega del Desafío 04! </w:t>
       </w:r>
       <w:r>
         <w:rPr>
@@ -441,19 +628,459 @@
         <w:t>Santiago</w:t>
       </w:r>
       <w:r>
+        <w:t>, excelente trabajo, te felicito. Destaco la prolijidad de tu proyecto.</w:t>
+      </w:r>
+    </w:p>
+    <w:p/>
+    <w:p>
+      <w:r>
+        <w:t xml:space="preserve">La estructura HTML esta impecable, destaco la correcta implementación de contenedores semánticos como </w:t>
+      </w:r>
+      <w:proofErr w:type="spellStart"/>
+      <w:r>
+        <w:t>main</w:t>
+      </w:r>
+      <w:proofErr w:type="spellEnd"/>
+      <w:r>
+        <w:t xml:space="preserve">, </w:t>
+      </w:r>
+      <w:proofErr w:type="spellStart"/>
+      <w:r>
+        <w:t>section</w:t>
+      </w:r>
+      <w:proofErr w:type="spellEnd"/>
+      <w:r>
+        <w:t xml:space="preserve">, </w:t>
+      </w:r>
+      <w:proofErr w:type="spellStart"/>
+      <w:r>
+        <w:t>footer</w:t>
+      </w:r>
+      <w:proofErr w:type="spellEnd"/>
+      <w:r>
+        <w:t>, etc.</w:t>
+      </w:r>
+    </w:p>
+    <w:p/>
+    <w:p>
+      <w:r>
+        <w:t xml:space="preserve">La implementación de position para superponer el banner quedo perfecto. </w:t>
+      </w:r>
+    </w:p>
+    <w:p/>
+    <w:p>
+      <w:r>
+        <w:t xml:space="preserve">La disposición de elementos en la </w:t>
+      </w:r>
+      <w:proofErr w:type="spellStart"/>
+      <w:r>
+        <w:t>landing</w:t>
+      </w:r>
+      <w:proofErr w:type="spellEnd"/>
+      <w:r>
+        <w:t xml:space="preserve"> page quedo tal cual lo solicitado con la herramienta Flex.</w:t>
+      </w:r>
+    </w:p>
+    <w:p/>
+    <w:p>
+      <w:r>
+        <w:t>Correctamente creadas la tabla y recurso de video. Los estilos tal cual los solicitados en imágenes de referencia.</w:t>
+      </w:r>
+    </w:p>
+    <w:p/>
+    <w:p/>
+    <w:p>
+      <w:r>
+        <w:t>Excelente trabajo ¡</w:t>
+      </w:r>
+    </w:p>
+    <w:p/>
+    <w:p>
+      <w:r>
+        <w:t xml:space="preserve">Tu nota en el Desafío 04 es: </w:t>
+      </w:r>
+      <w:r>
+        <w:rPr>
+          <w:b/>
+          <w:bCs/>
+        </w:rPr>
+        <w:t>10</w:t>
+      </w:r>
+    </w:p>
+    <w:p>
+      <w:pPr>
+        <w:pBdr>
+          <w:bottom w:val="single" w:sz="6" w:space="1" w:color="auto"/>
+        </w:pBdr>
+      </w:pPr>
+    </w:p>
+    <w:p>
+      <w:pPr>
+        <w:pBdr>
+          <w:bottom w:val="single" w:sz="6" w:space="1" w:color="auto"/>
+        </w:pBdr>
+      </w:pPr>
+    </w:p>
+    <w:p/>
+    <w:p>
+      <w:pPr>
+        <w:rPr>
+          <w:rFonts w:ascii="Segoe UI Emoji" w:hAnsi="Segoe UI Emoji" w:cs="Segoe UI Emoji"/>
+          <w:b/>
+          <w:bCs/>
+        </w:rPr>
+      </w:pPr>
+      <w:r>
+        <w:rPr>
+          <w:rFonts w:ascii="Segoe UI Emoji" w:hAnsi="Segoe UI Emoji" w:cs="Segoe UI Emoji"/>
+          <w:b/>
+          <w:bCs/>
+        </w:rPr>
+        <w:t xml:space="preserve">Figueroa Maidana </w:t>
+      </w:r>
+      <w:proofErr w:type="spellStart"/>
+      <w:r>
+        <w:rPr>
+          <w:rFonts w:ascii="Segoe UI Emoji" w:hAnsi="Segoe UI Emoji" w:cs="Segoe UI Emoji"/>
+          <w:b/>
+          <w:bCs/>
+        </w:rPr>
+        <w:t>Belen</w:t>
+      </w:r>
+      <w:proofErr w:type="spellEnd"/>
+      <w:r>
+        <w:rPr>
+          <w:rFonts w:ascii="Segoe UI Emoji" w:hAnsi="Segoe UI Emoji" w:cs="Segoe UI Emoji"/>
+          <w:b/>
+          <w:bCs/>
+        </w:rPr>
+        <w:t xml:space="preserve"> </w:t>
+      </w:r>
+      <w:r>
+        <w:rPr>
+          <w:rFonts w:ascii="Segoe UI Emoji" w:hAnsi="Segoe UI Emoji" w:cs="Segoe UI Emoji"/>
+          <w:b/>
+          <w:bCs/>
+        </w:rPr>
+        <w:t>Agostina</w:t>
+      </w:r>
+    </w:p>
+    <w:p>
+      <w:pPr>
+        <w:rPr>
+          <w:rFonts w:ascii="Segoe UI Emoji" w:hAnsi="Segoe UI Emoji" w:cs="Segoe UI Emoji"/>
+          <w:b/>
+          <w:bCs/>
+        </w:rPr>
+      </w:pPr>
+    </w:p>
+    <w:p>
+      <w:pPr>
+        <w:rPr>
+          <w:rFonts w:ascii="Segoe UI Emoji" w:hAnsi="Segoe UI Emoji" w:cs="Segoe UI Emoji"/>
+        </w:rPr>
+      </w:pPr>
+      <w:proofErr w:type="gramStart"/>
+      <w:r>
+        <w:rPr>
+          <w:rFonts w:ascii="Segoe UI Emoji" w:hAnsi="Segoe UI Emoji" w:cs="Segoe UI Emoji"/>
+        </w:rPr>
+        <w:lastRenderedPageBreak/>
+        <w:t>🎉</w:t>
+      </w:r>
+      <w:r>
+        <w:t>¡</w:t>
+      </w:r>
+      <w:proofErr w:type="gramEnd"/>
+      <w:r>
+        <w:t>Felicitaciones por la entrega del Desafío 0</w:t>
+      </w:r>
+      <w:r>
+        <w:t>4</w:t>
+      </w:r>
+      <w:r>
+        <w:t xml:space="preserve">! </w:t>
+      </w:r>
+      <w:r>
+        <w:rPr>
+          <w:rFonts w:ascii="Segoe UI Emoji" w:hAnsi="Segoe UI Emoji" w:cs="Segoe UI Emoji"/>
+        </w:rPr>
+        <w:t>🎉</w:t>
+      </w:r>
+    </w:p>
+    <w:p/>
+    <w:p>
+      <w:proofErr w:type="spellStart"/>
+      <w:r>
+        <w:t>Belen</w:t>
+      </w:r>
+      <w:proofErr w:type="spellEnd"/>
+      <w:r>
+        <w:t xml:space="preserve">, </w:t>
+      </w:r>
+      <w:r>
+        <w:t>excelente trabajo, te felicito.</w:t>
+      </w:r>
+      <w:r>
+        <w:t xml:space="preserve"> </w:t>
+      </w:r>
+      <w:r>
+        <w:t>Destaco la prolijidad de tu proyecto.</w:t>
+      </w:r>
+    </w:p>
+    <w:p/>
+    <w:p>
+      <w:r>
+        <w:t xml:space="preserve">La estructura HTML esta impecable, destaco la correcta implementación de contenedores semánticos como </w:t>
+      </w:r>
+      <w:proofErr w:type="spellStart"/>
+      <w:r>
+        <w:t>main</w:t>
+      </w:r>
+      <w:proofErr w:type="spellEnd"/>
+      <w:r>
+        <w:t xml:space="preserve">, </w:t>
+      </w:r>
+      <w:proofErr w:type="spellStart"/>
+      <w:r>
+        <w:t>section</w:t>
+      </w:r>
+      <w:proofErr w:type="spellEnd"/>
+      <w:r>
+        <w:t xml:space="preserve">, </w:t>
+      </w:r>
+      <w:proofErr w:type="spellStart"/>
+      <w:r>
+        <w:t>footer</w:t>
+      </w:r>
+      <w:proofErr w:type="spellEnd"/>
+      <w:r>
+        <w:t>,</w:t>
+      </w:r>
+      <w:r>
+        <w:t xml:space="preserve"> etc.</w:t>
+      </w:r>
+    </w:p>
+    <w:p/>
+    <w:p>
+      <w:r>
+        <w:t xml:space="preserve">La implementación de </w:t>
+      </w:r>
+      <w:r>
+        <w:t>position para superponer el banner quedo perfecto.</w:t>
+      </w:r>
+      <w:r>
+        <w:t xml:space="preserve"> </w:t>
+      </w:r>
+    </w:p>
+    <w:p/>
+    <w:p>
+      <w:r>
+        <w:t xml:space="preserve">La disposición de elementos en la </w:t>
+      </w:r>
+      <w:proofErr w:type="spellStart"/>
+      <w:r>
+        <w:t>landing</w:t>
+      </w:r>
+      <w:proofErr w:type="spellEnd"/>
+      <w:r>
+        <w:t xml:space="preserve"> page quedo tal cual lo solicitado con la herramienta Flex.</w:t>
+      </w:r>
+    </w:p>
+    <w:p/>
+    <w:p>
+      <w:r>
+        <w:t>Correctamente creadas la tabla y recurso de video</w:t>
+      </w:r>
+      <w:r>
+        <w:t>. Los estilos tal cual los solicitados en imágenes de referencia.</w:t>
+      </w:r>
+    </w:p>
+    <w:p/>
+    <w:p/>
+    <w:p>
+      <w:r>
+        <w:t>Excelente trabajo ¡</w:t>
+      </w:r>
+    </w:p>
+    <w:p/>
+    <w:p>
+      <w:r>
+        <w:t>Tu nota en el Desafío 0</w:t>
+      </w:r>
+      <w:r>
+        <w:t>4</w:t>
+      </w:r>
+      <w:r>
+        <w:t xml:space="preserve"> es: </w:t>
+      </w:r>
+      <w:r>
+        <w:rPr>
+          <w:b/>
+          <w:bCs/>
+        </w:rPr>
+        <w:t>10</w:t>
+      </w:r>
+    </w:p>
+    <w:p>
+      <w:pPr>
+        <w:pBdr>
+          <w:bottom w:val="single" w:sz="6" w:space="1" w:color="auto"/>
+        </w:pBdr>
+      </w:pPr>
+    </w:p>
+    <w:p>
+      <w:pPr>
+        <w:pBdr>
+          <w:bottom w:val="single" w:sz="6" w:space="1" w:color="auto"/>
+        </w:pBdr>
+      </w:pPr>
+    </w:p>
+    <w:p/>
+    <w:p>
+      <w:pPr>
+        <w:rPr>
+          <w:rFonts w:ascii="Segoe UI Emoji" w:hAnsi="Segoe UI Emoji" w:cs="Segoe UI Emoji"/>
+          <w:b/>
+          <w:bCs/>
+          <w:u w:val="single"/>
+        </w:rPr>
+      </w:pPr>
+      <w:r>
+        <w:rPr>
+          <w:rFonts w:ascii="Segoe UI Emoji" w:hAnsi="Segoe UI Emoji" w:cs="Segoe UI Emoji"/>
+          <w:b/>
+          <w:bCs/>
+        </w:rPr>
+        <w:t xml:space="preserve">Segovia </w:t>
+      </w:r>
+      <w:proofErr w:type="spellStart"/>
+      <w:r>
+        <w:rPr>
+          <w:rFonts w:ascii="Segoe UI Emoji" w:hAnsi="Segoe UI Emoji" w:cs="Segoe UI Emoji"/>
+          <w:b/>
+          <w:bCs/>
+        </w:rPr>
+        <w:t>Rodriguez</w:t>
+      </w:r>
+      <w:proofErr w:type="spellEnd"/>
+      <w:r>
+        <w:rPr>
+          <w:rFonts w:ascii="Segoe UI Emoji" w:hAnsi="Segoe UI Emoji" w:cs="Segoe UI Emoji"/>
+          <w:b/>
+          <w:bCs/>
+        </w:rPr>
+        <w:t xml:space="preserve"> </w:t>
+      </w:r>
+      <w:proofErr w:type="spellStart"/>
+      <w:r>
+        <w:rPr>
+          <w:rFonts w:ascii="Segoe UI Emoji" w:hAnsi="Segoe UI Emoji" w:cs="Segoe UI Emoji"/>
+          <w:b/>
+          <w:bCs/>
+        </w:rPr>
+        <w:t>Estefani</w:t>
+      </w:r>
+      <w:proofErr w:type="spellEnd"/>
+      <w:r>
+        <w:rPr>
+          <w:rFonts w:ascii="Segoe UI Emoji" w:hAnsi="Segoe UI Emoji" w:cs="Segoe UI Emoji"/>
+          <w:b/>
+          <w:bCs/>
+        </w:rPr>
+        <w:t xml:space="preserve"> Lujan</w:t>
+      </w:r>
+    </w:p>
+    <w:p>
+      <w:pPr>
+        <w:rPr>
+          <w:rFonts w:ascii="Segoe UI Emoji" w:hAnsi="Segoe UI Emoji" w:cs="Segoe UI Emoji"/>
+          <w:b/>
+          <w:bCs/>
+        </w:rPr>
+      </w:pPr>
+    </w:p>
+    <w:p>
+      <w:pPr>
+        <w:rPr>
+          <w:rFonts w:ascii="Segoe UI Emoji" w:hAnsi="Segoe UI Emoji" w:cs="Segoe UI Emoji"/>
+        </w:rPr>
+      </w:pPr>
+      <w:proofErr w:type="gramStart"/>
+      <w:r>
+        <w:rPr>
+          <w:rFonts w:ascii="Segoe UI Emoji" w:hAnsi="Segoe UI Emoji" w:cs="Segoe UI Emoji"/>
+        </w:rPr>
+        <w:t>🎉</w:t>
+      </w:r>
+      <w:r>
+        <w:t>¡</w:t>
+      </w:r>
+      <w:proofErr w:type="gramEnd"/>
+      <w:r>
+        <w:t xml:space="preserve">Felicitaciones por la entrega del Desafío 03! </w:t>
+      </w:r>
+      <w:r>
+        <w:rPr>
+          <w:rFonts w:ascii="Segoe UI Emoji" w:hAnsi="Segoe UI Emoji" w:cs="Segoe UI Emoji"/>
+        </w:rPr>
+        <w:t>🎉</w:t>
+      </w:r>
+    </w:p>
+    <w:p/>
+    <w:p>
+      <w:proofErr w:type="spellStart"/>
+      <w:r>
+        <w:t>Estefani</w:t>
+      </w:r>
+      <w:proofErr w:type="spellEnd"/>
+      <w:r>
         <w:t>, el trabajo realizado es excelente.</w:t>
       </w:r>
     </w:p>
     <w:p/>
     <w:p>
       <w:r>
-        <w:t>La estructura HTML esta impecable, destaco la correcta implementación de contenedores semánticos como main, section, footer, etc. El manejo de listas, textos y títulos es correcto.</w:t>
-      </w:r>
-    </w:p>
-    <w:p/>
-    <w:p>
-      <w:r>
-        <w:t>La barra de navegación principal quedo ok, los links configurados con estado hover como se solicitó.</w:t>
+        <w:t xml:space="preserve">La estructura HTML esta impecable, destaco la correcta implementación de contenedores semánticos como </w:t>
+      </w:r>
+      <w:proofErr w:type="spellStart"/>
+      <w:r>
+        <w:t>main</w:t>
+      </w:r>
+      <w:proofErr w:type="spellEnd"/>
+      <w:r>
+        <w:t xml:space="preserve">, </w:t>
+      </w:r>
+      <w:proofErr w:type="spellStart"/>
+      <w:r>
+        <w:t>section</w:t>
+      </w:r>
+      <w:proofErr w:type="spellEnd"/>
+      <w:r>
+        <w:t xml:space="preserve">, </w:t>
+      </w:r>
+      <w:proofErr w:type="spellStart"/>
+      <w:r>
+        <w:t>footer</w:t>
+      </w:r>
+      <w:proofErr w:type="spellEnd"/>
+      <w:r>
+        <w:t>, etc. El manejo de listas, textos y títulos es correcto.</w:t>
+      </w:r>
+    </w:p>
+    <w:p/>
+    <w:p>
+      <w:r>
+        <w:lastRenderedPageBreak/>
+        <w:t xml:space="preserve">La barra de navegación principal quedo ok, los links configurados con estado </w:t>
+      </w:r>
+      <w:proofErr w:type="spellStart"/>
+      <w:r>
+        <w:t>hover</w:t>
+      </w:r>
+      <w:proofErr w:type="spellEnd"/>
+      <w:r>
+        <w:t xml:space="preserve"> como se solicitó.</w:t>
       </w:r>
     </w:p>
     <w:p/>
@@ -465,7 +1092,23 @@
     <w:p/>
     <w:p>
       <w:r>
-        <w:t>Los estilos solicitados tanto en colores, fuentes y dimensiones quedaron ok, también aplicaste correctamente las propiedades de box model. EL layout quedó responsivo como se solicitó en enunciado.</w:t>
+        <w:t xml:space="preserve">Los estilos solicitados tanto en colores, fuentes y dimensiones quedaron ok, también aplicaste correctamente las propiedades de box </w:t>
+      </w:r>
+      <w:proofErr w:type="spellStart"/>
+      <w:r>
+        <w:t>model</w:t>
+      </w:r>
+      <w:proofErr w:type="spellEnd"/>
+      <w:r>
+        <w:t xml:space="preserve">. EL </w:t>
+      </w:r>
+      <w:proofErr w:type="spellStart"/>
+      <w:r>
+        <w:t>layout</w:t>
+      </w:r>
+      <w:proofErr w:type="spellEnd"/>
+      <w:r>
+        <w:t xml:space="preserve"> quedó responsivo como se solicitó en enunciado.</w:t>
       </w:r>
     </w:p>
     <w:p/>
@@ -475,11 +1118,7 @@
         <w:t>Observaciones:</w:t>
       </w:r>
     </w:p>
-    <w:p>
-      <w:pPr>
-        <w:pStyle w:val="Prrafodelista"/>
-      </w:pPr>
-    </w:p>
+    <w:p/>
     <w:p>
       <w:pPr>
         <w:pStyle w:val="Prrafodelista"/>
@@ -488,54 +1127,42 @@
           <w:numId w:val="1"/>
         </w:numPr>
       </w:pPr>
-      <w:r>
-        <w:t>Mejora la accesibilidad de tu formulario asociar la etiqueta &lt;label&gt; con el elemento &lt;input&gt; (a través del atributo for en el label y el id en el input ) :</w:t>
+      <w:proofErr w:type="spellStart"/>
+      <w:r>
+        <w:t>Recordá</w:t>
+      </w:r>
+      <w:proofErr w:type="spellEnd"/>
+      <w:r>
+        <w:t xml:space="preserve"> cambiar el lenguaje a español &lt;</w:t>
+      </w:r>
+      <w:proofErr w:type="spellStart"/>
+      <w:r>
+        <w:t>html</w:t>
+      </w:r>
+      <w:proofErr w:type="spellEnd"/>
+      <w:r>
+        <w:t xml:space="preserve"> </w:t>
+      </w:r>
+      <w:proofErr w:type="spellStart"/>
+      <w:r>
+        <w:t>lang</w:t>
+      </w:r>
+      <w:proofErr w:type="spellEnd"/>
+      <w:r>
+        <w:t xml:space="preserve">="es"&gt; porque esto </w:t>
+      </w:r>
+      <w:proofErr w:type="gramStart"/>
+      <w:r>
+        <w:t>le</w:t>
+      </w:r>
+      <w:proofErr w:type="gramEnd"/>
+      <w:r>
+        <w:t xml:space="preserve"> dice a los motores de búsqueda en que idioma esta tu sitio web.</w:t>
       </w:r>
     </w:p>
     <w:p>
       <w:pPr>
         <w:pStyle w:val="Prrafodelista"/>
-      </w:pPr>
-    </w:p>
-    <w:p>
-      <w:pPr>
-        <w:pStyle w:val="Prrafodelista"/>
-        <w:ind w:left="1416"/>
-      </w:pPr>
-      <w:r>
-        <w:t>&lt;label for="email"&gt;Correo electrónico:&lt;/label&gt;</w:t>
-      </w:r>
-    </w:p>
-    <w:p>
-      <w:pPr>
-        <w:pStyle w:val="Prrafodelista"/>
-        <w:ind w:left="1416"/>
-        <w:rPr>
-          <w:lang w:val="en-US"/>
-        </w:rPr>
-      </w:pPr>
-      <w:r>
-        <w:rPr>
-          <w:lang w:val="en-US"/>
-        </w:rPr>
-        <w:t>&lt;input type="email" id="email" placeholder="tumail@correo.com" /&gt;</w:t>
-      </w:r>
-    </w:p>
-    <w:p>
-      <w:pPr>
-        <w:pStyle w:val="Prrafodelista"/>
-        <w:ind w:left="1416"/>
-        <w:rPr>
-          <w:lang w:val="en-US"/>
-        </w:rPr>
-      </w:pPr>
-    </w:p>
-    <w:p>
-      <w:pPr>
-        <w:pStyle w:val="Prrafodelista"/>
-        <w:rPr>
-          <w:lang w:val="en-US"/>
-        </w:rPr>
       </w:pPr>
     </w:p>
     <w:p>
@@ -547,57 +1174,43 @@
         </w:numPr>
       </w:pPr>
       <w:r>
-        <w:lastRenderedPageBreak/>
-        <w:t>Al redimensionar la pantalla te quedaron pegados los bordes de los contenedores a los márgenes ahi te convendria mejor aplicar solo un padding de 10px de izquierda y derecha a la etiqueta &lt;main&gt; y sacarle el width:100%:</w:t>
-      </w:r>
-    </w:p>
-    <w:p>
-      <w:pPr>
-        <w:ind w:left="1416"/>
-      </w:pPr>
-    </w:p>
-    <w:p>
-      <w:r>
-        <w:t xml:space="preserve">                       main{</w:t>
-      </w:r>
-      <w:r>
-        <w:tab/>
-      </w:r>
-    </w:p>
-    <w:p>
-      <w:pPr>
-        <w:ind w:left="708" w:firstLine="708"/>
-      </w:pPr>
-      <w:r>
-        <w:t>…</w:t>
-      </w:r>
-      <w:r>
-        <w:tab/>
-      </w:r>
-      <w:r>
-        <w:tab/>
-      </w:r>
-    </w:p>
-    <w:p>
-      <w:pPr>
-        <w:ind w:left="1416"/>
-      </w:pPr>
-      <w:r>
-        <w:t xml:space="preserve">padding: 0 10px; </w:t>
-      </w:r>
-    </w:p>
-    <w:p>
-      <w:pPr>
-        <w:pStyle w:val="Prrafodelista"/>
-      </w:pPr>
-      <w:r>
-        <w:t xml:space="preserve">         }</w:t>
-      </w:r>
-    </w:p>
-    <w:p>
-      <w:pPr>
-        <w:pStyle w:val="Prrafodelista"/>
-      </w:pPr>
+        <w:t>M</w:t>
+      </w:r>
+      <w:r>
+        <w:t>ejora la accesibilidad de tu formulario asociar la etiqueta &lt;</w:t>
+      </w:r>
+      <w:proofErr w:type="spellStart"/>
+      <w:r>
+        <w:t>label</w:t>
+      </w:r>
+      <w:proofErr w:type="spellEnd"/>
+      <w:r>
+        <w:t xml:space="preserve">&gt; con el elemento &lt;input&gt; (a través del atributo </w:t>
+      </w:r>
+      <w:proofErr w:type="spellStart"/>
+      <w:r>
+        <w:t>for</w:t>
+      </w:r>
+      <w:proofErr w:type="spellEnd"/>
+      <w:r>
+        <w:t xml:space="preserve"> en el </w:t>
+      </w:r>
+      <w:proofErr w:type="spellStart"/>
+      <w:r>
+        <w:t>label</w:t>
+      </w:r>
+      <w:proofErr w:type="spellEnd"/>
+      <w:r>
+        <w:t xml:space="preserve"> y el id en el </w:t>
+      </w:r>
+      <w:proofErr w:type="gramStart"/>
+      <w:r>
+        <w:t>input )</w:t>
+      </w:r>
+      <w:proofErr w:type="gramEnd"/>
+      <w:r>
+        <w:t xml:space="preserve"> :</w:t>
+      </w:r>
     </w:p>
     <w:p>
       <w:pPr>
@@ -610,8 +1223,56 @@
         <w:ind w:left="1416"/>
       </w:pPr>
     </w:p>
-    <w:p/>
-    <w:p/>
+    <w:p>
+      <w:pPr>
+        <w:ind w:left="2124"/>
+        <w:rPr>
+          <w:lang w:val="en-US"/>
+        </w:rPr>
+      </w:pPr>
+      <w:r>
+        <w:rPr>
+          <w:lang w:val="en-US"/>
+        </w:rPr>
+        <w:t>&lt;label for="email"&gt;Email&lt;/label&gt;</w:t>
+      </w:r>
+    </w:p>
+    <w:p>
+      <w:pPr>
+        <w:ind w:left="2124"/>
+        <w:rPr>
+          <w:lang w:val="en-US"/>
+        </w:rPr>
+      </w:pPr>
+      <w:r>
+        <w:rPr>
+          <w:lang w:val="en-US"/>
+        </w:rPr>
+        <w:t>&lt;input type="email" id="email" required placeholder="ejemplo@correo.com" &gt;</w:t>
+      </w:r>
+    </w:p>
+    <w:p>
+      <w:pPr>
+        <w:ind w:left="1416"/>
+        <w:rPr>
+          <w:lang w:val="en-US"/>
+        </w:rPr>
+      </w:pPr>
+    </w:p>
+    <w:p>
+      <w:pPr>
+        <w:rPr>
+          <w:lang w:val="en-US"/>
+        </w:rPr>
+      </w:pPr>
+    </w:p>
+    <w:p>
+      <w:pPr>
+        <w:rPr>
+          <w:lang w:val="en-US"/>
+        </w:rPr>
+      </w:pPr>
+    </w:p>
     <w:p>
       <w:r>
         <w:t xml:space="preserve">Tu nota en el Desafío 03 es: </w:t>
@@ -624,6 +1285,8 @@
         <w:t>9</w:t>
       </w:r>
     </w:p>
+    <w:p/>
+    <w:p/>
     <w:p>
       <w:pPr>
         <w:pBdr>
@@ -631,6 +1294,147 @@
         </w:pBdr>
       </w:pPr>
     </w:p>
+    <w:p/>
+    <w:p/>
+    <w:p>
+      <w:pPr>
+        <w:rPr>
+          <w:rFonts w:ascii="Segoe UI Emoji" w:hAnsi="Segoe UI Emoji" w:cs="Segoe UI Emoji"/>
+          <w:b/>
+          <w:bCs/>
+        </w:rPr>
+      </w:pPr>
+      <w:r>
+        <w:rPr>
+          <w:rFonts w:ascii="Segoe UI Emoji" w:hAnsi="Segoe UI Emoji" w:cs="Segoe UI Emoji"/>
+          <w:b/>
+          <w:bCs/>
+        </w:rPr>
+        <w:t>Ulate Carlos</w:t>
+      </w:r>
+    </w:p>
+    <w:p>
+      <w:pPr>
+        <w:rPr>
+          <w:rFonts w:ascii="Segoe UI Emoji" w:hAnsi="Segoe UI Emoji" w:cs="Segoe UI Emoji"/>
+          <w:b/>
+          <w:bCs/>
+        </w:rPr>
+      </w:pPr>
+    </w:p>
+    <w:p>
+      <w:pPr>
+        <w:rPr>
+          <w:rFonts w:ascii="Segoe UI Emoji" w:hAnsi="Segoe UI Emoji" w:cs="Segoe UI Emoji"/>
+        </w:rPr>
+      </w:pPr>
+      <w:proofErr w:type="gramStart"/>
+      <w:r>
+        <w:rPr>
+          <w:rFonts w:ascii="Segoe UI Emoji" w:hAnsi="Segoe UI Emoji" w:cs="Segoe UI Emoji"/>
+        </w:rPr>
+        <w:t>🎉</w:t>
+      </w:r>
+      <w:r>
+        <w:t>¡</w:t>
+      </w:r>
+      <w:proofErr w:type="gramEnd"/>
+      <w:r>
+        <w:t xml:space="preserve">Felicitaciones por la entrega del Desafío 04! </w:t>
+      </w:r>
+      <w:r>
+        <w:rPr>
+          <w:rFonts w:ascii="Segoe UI Emoji" w:hAnsi="Segoe UI Emoji" w:cs="Segoe UI Emoji"/>
+        </w:rPr>
+        <w:t>🎉</w:t>
+      </w:r>
+    </w:p>
+    <w:p/>
+    <w:p>
+      <w:r>
+        <w:t>Carlos</w:t>
+      </w:r>
+      <w:r>
+        <w:t xml:space="preserve">, excelente trabajo, te felicito. </w:t>
+      </w:r>
+    </w:p>
+    <w:p/>
+    <w:p>
+      <w:r>
+        <w:t xml:space="preserve">La estructura HTML esta impecable, destaco la correcta implementación de contenedores semánticos como </w:t>
+      </w:r>
+      <w:proofErr w:type="spellStart"/>
+      <w:r>
+        <w:t>main</w:t>
+      </w:r>
+      <w:proofErr w:type="spellEnd"/>
+      <w:r>
+        <w:t xml:space="preserve">, </w:t>
+      </w:r>
+      <w:proofErr w:type="spellStart"/>
+      <w:r>
+        <w:t>section</w:t>
+      </w:r>
+      <w:proofErr w:type="spellEnd"/>
+      <w:r>
+        <w:t xml:space="preserve">, </w:t>
+      </w:r>
+      <w:proofErr w:type="spellStart"/>
+      <w:r>
+        <w:t>footer</w:t>
+      </w:r>
+      <w:proofErr w:type="spellEnd"/>
+      <w:r>
+        <w:t>, etc.</w:t>
+      </w:r>
+    </w:p>
+    <w:p/>
+    <w:p>
+      <w:r>
+        <w:t xml:space="preserve">La implementación de position para superponer el banner quedo perfecto. </w:t>
+      </w:r>
+    </w:p>
+    <w:p/>
+    <w:p>
+      <w:r>
+        <w:t xml:space="preserve">La disposición de elementos en la </w:t>
+      </w:r>
+      <w:proofErr w:type="spellStart"/>
+      <w:r>
+        <w:t>landing</w:t>
+      </w:r>
+      <w:proofErr w:type="spellEnd"/>
+      <w:r>
+        <w:t xml:space="preserve"> page quedo tal cual lo solicitado con la herramienta Flex.</w:t>
+      </w:r>
+    </w:p>
+    <w:p/>
+    <w:p>
+      <w:r>
+        <w:t>Correctamente creadas la tabla y recurso de video. Los estilos tal cual los solicitados en imágenes de referencia.</w:t>
+      </w:r>
+    </w:p>
+    <w:p/>
+    <w:p/>
+    <w:p>
+      <w:r>
+        <w:t>Excelente trabajo ¡</w:t>
+      </w:r>
+    </w:p>
+    <w:p/>
+    <w:p>
+      <w:r>
+        <w:t xml:space="preserve">Tu nota en el Desafío 04 es: </w:t>
+      </w:r>
+      <w:r>
+        <w:rPr>
+          <w:b/>
+          <w:bCs/>
+        </w:rPr>
+        <w:t>10</w:t>
+      </w:r>
+    </w:p>
+    <w:p/>
     <w:p>
       <w:pPr>
         <w:pBdr>
@@ -647,38 +1451,41 @@
           <w:bCs/>
         </w:rPr>
       </w:pPr>
-      <w:r>
-        <w:rPr>
-          <w:rFonts w:ascii="Segoe UI Emoji" w:hAnsi="Segoe UI Emoji" w:cs="Segoe UI Emoji"/>
-          <w:b/>
-          <w:bCs/>
-        </w:rPr>
-        <w:t xml:space="preserve">Figueroa Maidana Belen </w:t>
-      </w:r>
-      <w:r>
-        <w:rPr>
-          <w:rFonts w:ascii="Segoe UI Emoji" w:hAnsi="Segoe UI Emoji" w:cs="Segoe UI Emoji"/>
-          <w:b/>
-          <w:bCs/>
-        </w:rPr>
-        <w:t>Agostina</w:t>
-      </w:r>
-    </w:p>
-    <w:p>
-      <w:pPr>
-        <w:rPr>
-          <w:rFonts w:ascii="Segoe UI Emoji" w:hAnsi="Segoe UI Emoji" w:cs="Segoe UI Emoji"/>
-          <w:b/>
-          <w:bCs/>
-        </w:rPr>
-      </w:pPr>
-    </w:p>
-    <w:p>
-      <w:pPr>
-        <w:rPr>
-          <w:rFonts w:ascii="Segoe UI Emoji" w:hAnsi="Segoe UI Emoji" w:cs="Segoe UI Emoji"/>
-        </w:rPr>
-      </w:pPr>
+      <w:proofErr w:type="spellStart"/>
+      <w:r>
+        <w:rPr>
+          <w:rFonts w:ascii="Segoe UI Emoji" w:hAnsi="Segoe UI Emoji" w:cs="Segoe UI Emoji"/>
+          <w:b/>
+          <w:bCs/>
+        </w:rPr>
+        <w:t>Chiapello</w:t>
+      </w:r>
+      <w:proofErr w:type="spellEnd"/>
+      <w:r>
+        <w:rPr>
+          <w:rFonts w:ascii="Segoe UI Emoji" w:hAnsi="Segoe UI Emoji" w:cs="Segoe UI Emoji"/>
+          <w:b/>
+          <w:bCs/>
+        </w:rPr>
+        <w:t xml:space="preserve"> Gianluca</w:t>
+      </w:r>
+    </w:p>
+    <w:p>
+      <w:pPr>
+        <w:rPr>
+          <w:rFonts w:ascii="Segoe UI Emoji" w:hAnsi="Segoe UI Emoji" w:cs="Segoe UI Emoji"/>
+          <w:b/>
+          <w:bCs/>
+        </w:rPr>
+      </w:pPr>
+    </w:p>
+    <w:p>
+      <w:pPr>
+        <w:rPr>
+          <w:rFonts w:ascii="Segoe UI Emoji" w:hAnsi="Segoe UI Emoji" w:cs="Segoe UI Emoji"/>
+        </w:rPr>
+      </w:pPr>
+      <w:proofErr w:type="gramStart"/>
       <w:r>
         <w:rPr>
           <w:rFonts w:ascii="Segoe UI Emoji" w:hAnsi="Segoe UI Emoji" w:cs="Segoe UI Emoji"/>
@@ -686,13 +1493,11 @@
         <w:t>🎉</w:t>
       </w:r>
       <w:r>
-        <w:t>¡Felicitaciones por la entrega del Desafío 0</w:t>
-      </w:r>
-      <w:r>
-        <w:t>4</w:t>
-      </w:r>
-      <w:r>
-        <w:t xml:space="preserve">! </w:t>
+        <w:t>¡</w:t>
+      </w:r>
+      <w:proofErr w:type="gramEnd"/>
+      <w:r>
+        <w:t xml:space="preserve">Felicitaciones por la entrega del Desafío 04! </w:t>
       </w:r>
       <w:r>
         <w:rPr>
@@ -704,52 +1509,64 @@
     <w:p/>
     <w:p>
       <w:r>
-        <w:t xml:space="preserve">Belen, </w:t>
-      </w:r>
-      <w:r>
-        <w:t>excelente trabajo, te felicito.</w:t>
-      </w:r>
-      <w:r>
-        <w:t xml:space="preserve"> </w:t>
-      </w:r>
-      <w:r>
-        <w:t>Destaco la prolijidad de tu proyecto.</w:t>
-      </w:r>
-    </w:p>
-    <w:p/>
-    <w:p>
-      <w:r>
-        <w:t>La estructura HTML esta impecable, destaco la correcta implementación de contenedores semánticos como main, section, footer,</w:t>
-      </w:r>
-      <w:r>
-        <w:t xml:space="preserve"> etc.</w:t>
-      </w:r>
-    </w:p>
-    <w:p/>
-    <w:p>
-      <w:r>
-        <w:t xml:space="preserve">La implementación de </w:t>
-      </w:r>
-      <w:r>
-        <w:t>position para superponer el banner quedo perfecto.</w:t>
-      </w:r>
-      <w:r>
-        <w:t xml:space="preserve"> </w:t>
-      </w:r>
-    </w:p>
-    <w:p/>
-    <w:p>
-      <w:r>
-        <w:t>La disposición de elementos en la landing page quedo tal cual lo solicitado con la herramienta Flex.</w:t>
-      </w:r>
-    </w:p>
-    <w:p/>
-    <w:p>
-      <w:r>
-        <w:t>Correctamente creadas la tabla y recurso de video</w:t>
-      </w:r>
-      <w:r>
-        <w:t>. Los estilos tal cual los solicitados en imágenes de referencia.</w:t>
+        <w:t>Gianluca, excelente trabajo, te felicito. Destaco la prolijidad de tu proyecto.</w:t>
+      </w:r>
+    </w:p>
+    <w:p/>
+    <w:p>
+      <w:r>
+        <w:t xml:space="preserve">La estructura HTML esta impecable, destaco la correcta implementación de contenedores semánticos como </w:t>
+      </w:r>
+      <w:proofErr w:type="spellStart"/>
+      <w:r>
+        <w:t>main</w:t>
+      </w:r>
+      <w:proofErr w:type="spellEnd"/>
+      <w:r>
+        <w:t xml:space="preserve">, </w:t>
+      </w:r>
+      <w:proofErr w:type="spellStart"/>
+      <w:r>
+        <w:t>section</w:t>
+      </w:r>
+      <w:proofErr w:type="spellEnd"/>
+      <w:r>
+        <w:t xml:space="preserve">, </w:t>
+      </w:r>
+      <w:proofErr w:type="spellStart"/>
+      <w:r>
+        <w:t>footer</w:t>
+      </w:r>
+      <w:proofErr w:type="spellEnd"/>
+      <w:r>
+        <w:t>, etc.</w:t>
+      </w:r>
+    </w:p>
+    <w:p/>
+    <w:p>
+      <w:r>
+        <w:t xml:space="preserve">La implementación de position para superponer el banner quedo perfecto. </w:t>
+      </w:r>
+    </w:p>
+    <w:p/>
+    <w:p>
+      <w:r>
+        <w:lastRenderedPageBreak/>
+        <w:t xml:space="preserve">La disposición de elementos en la </w:t>
+      </w:r>
+      <w:proofErr w:type="spellStart"/>
+      <w:r>
+        <w:t>landing</w:t>
+      </w:r>
+      <w:proofErr w:type="spellEnd"/>
+      <w:r>
+        <w:t xml:space="preserve"> page quedo tal cual lo solicitado con la herramienta Flex.</w:t>
+      </w:r>
+    </w:p>
+    <w:p/>
+    <w:p>
+      <w:r>
+        <w:t>Correctamente creadas la tabla y recurso de video. Los estilos tal cual los solicitados en imágenes de referencia.</w:t>
       </w:r>
     </w:p>
     <w:p/>
@@ -762,13 +1579,7 @@
     <w:p/>
     <w:p>
       <w:r>
-        <w:t>Tu nota en el Desafío 0</w:t>
-      </w:r>
-      <w:r>
-        <w:t>4</w:t>
-      </w:r>
-      <w:r>
-        <w:t xml:space="preserve"> es: </w:t>
+        <w:t xml:space="preserve">Tu nota en el Desafío 04 es: </w:t>
       </w:r>
       <w:r>
         <w:rPr>
@@ -778,6 +1589,7 @@
         <w:t>10</w:t>
       </w:r>
     </w:p>
+    <w:p/>
     <w:p>
       <w:pPr>
         <w:pBdr>
@@ -785,6 +1597,8 @@
         </w:pBdr>
       </w:pPr>
     </w:p>
+    <w:p/>
+    <w:p/>
     <w:p>
       <w:pPr>
         <w:pBdr>
@@ -799,68 +1613,73 @@
           <w:rFonts w:ascii="Segoe UI Emoji" w:hAnsi="Segoe UI Emoji" w:cs="Segoe UI Emoji"/>
           <w:b/>
           <w:bCs/>
-          <w:u w:val="single"/>
-        </w:rPr>
-      </w:pPr>
-      <w:r>
-        <w:rPr>
-          <w:rFonts w:ascii="Segoe UI Emoji" w:hAnsi="Segoe UI Emoji" w:cs="Segoe UI Emoji"/>
-          <w:b/>
-          <w:bCs/>
-        </w:rPr>
-        <w:t>Segovia Rodriguez Estefani Lujan</w:t>
-      </w:r>
-    </w:p>
-    <w:p>
-      <w:pPr>
-        <w:rPr>
-          <w:rFonts w:ascii="Segoe UI Emoji" w:hAnsi="Segoe UI Emoji" w:cs="Segoe UI Emoji"/>
-          <w:b/>
-          <w:bCs/>
-        </w:rPr>
-      </w:pPr>
-    </w:p>
-    <w:p>
-      <w:pPr>
-        <w:rPr>
-          <w:rFonts w:ascii="Segoe UI Emoji" w:hAnsi="Segoe UI Emoji" w:cs="Segoe UI Emoji"/>
-        </w:rPr>
-      </w:pPr>
-      <w:r>
-        <w:rPr>
-          <w:rFonts w:ascii="Segoe UI Emoji" w:hAnsi="Segoe UI Emoji" w:cs="Segoe UI Emoji"/>
-        </w:rPr>
-        <w:t>🎉</w:t>
-      </w:r>
-      <w:r>
-        <w:t xml:space="preserve">¡Felicitaciones por la entrega del Desafío 03! </w:t>
-      </w:r>
-      <w:r>
-        <w:rPr>
-          <w:rFonts w:ascii="Segoe UI Emoji" w:hAnsi="Segoe UI Emoji" w:cs="Segoe UI Emoji"/>
-        </w:rPr>
-        <w:t>🎉</w:t>
-      </w:r>
-    </w:p>
-    <w:p/>
-    <w:p>
-      <w:r>
-        <w:t>Estefani</w:t>
-      </w:r>
-      <w:r>
-        <w:t>, el trabajo realizado es excelente.</w:t>
-      </w:r>
-    </w:p>
-    <w:p/>
-    <w:p>
-      <w:r>
-        <w:t>La estructura HTML esta impecable, destaco la correcta implementación de contenedores semánticos como main, section, footer, etc. El manejo de listas, textos y títulos es correcto.</w:t>
-      </w:r>
-    </w:p>
-    <w:p/>
-    <w:p>
-      <w:r>
-        <w:t>La barra de navegación principal quedo ok, los links configurados con estado hover como se solicitó.</w:t>
+        </w:rPr>
+      </w:pPr>
+      <w:r>
+        <w:rPr>
+          <w:rFonts w:ascii="Segoe UI Emoji" w:hAnsi="Segoe UI Emoji" w:cs="Segoe UI Emoji"/>
+          <w:b/>
+          <w:bCs/>
+        </w:rPr>
+        <w:t>Capone Santino</w:t>
+      </w:r>
+    </w:p>
+    <w:p>
+      <w:pPr>
+        <w:rPr>
+          <w:rFonts w:ascii="Segoe UI Emoji" w:hAnsi="Segoe UI Emoji" w:cs="Segoe UI Emoji"/>
+          <w:b/>
+          <w:bCs/>
+        </w:rPr>
+      </w:pPr>
+    </w:p>
+    <w:p>
+      <w:r>
+        <w:t>Santino, el resultado logrado es muy bueno, te felicito.</w:t>
+      </w:r>
+    </w:p>
+    <w:p/>
+    <w:p>
+      <w:r>
+        <w:t xml:space="preserve">La estructura HTML esta impecable, destaco la correcta implementación de contenedores semánticos como </w:t>
+      </w:r>
+      <w:proofErr w:type="spellStart"/>
+      <w:r>
+        <w:t>main</w:t>
+      </w:r>
+      <w:proofErr w:type="spellEnd"/>
+      <w:r>
+        <w:t xml:space="preserve">, </w:t>
+      </w:r>
+      <w:proofErr w:type="spellStart"/>
+      <w:r>
+        <w:t>section</w:t>
+      </w:r>
+      <w:proofErr w:type="spellEnd"/>
+      <w:r>
+        <w:t xml:space="preserve">, </w:t>
+      </w:r>
+      <w:proofErr w:type="spellStart"/>
+      <w:r>
+        <w:t>footer</w:t>
+      </w:r>
+      <w:proofErr w:type="spellEnd"/>
+      <w:r>
+        <w:t>, etc. El manejo de listas, textos y títulos es correcto.</w:t>
+      </w:r>
+    </w:p>
+    <w:p/>
+    <w:p>
+      <w:r>
+        <w:t xml:space="preserve">La barra de navegación principal quedo ok, los links configurados con estado </w:t>
+      </w:r>
+      <w:proofErr w:type="spellStart"/>
+      <w:r>
+        <w:t>hover</w:t>
+      </w:r>
+      <w:proofErr w:type="spellEnd"/>
+      <w:r>
+        <w:t xml:space="preserve"> como se solicitó.</w:t>
       </w:r>
     </w:p>
     <w:p/>
@@ -872,413 +1691,30 @@
     <w:p/>
     <w:p>
       <w:r>
-        <w:t>Los estilos solicitados tanto en colores, fuentes y dimensiones quedaron ok, también aplicaste correctamente las propiedades de box model. EL layout quedó responsivo como se solicitó en enunciado.</w:t>
-      </w:r>
-    </w:p>
-    <w:p/>
-    <w:p/>
-    <w:p>
-      <w:r>
-        <w:t>Observaciones:</w:t>
-      </w:r>
-    </w:p>
-    <w:p/>
-    <w:p>
-      <w:pPr>
-        <w:pStyle w:val="Prrafodelista"/>
-        <w:numPr>
-          <w:ilvl w:val="0"/>
-          <w:numId w:val="1"/>
-        </w:numPr>
-      </w:pPr>
-      <w:r>
-        <w:t>Recordá cambiar el lenguaje a español &lt;html lang="es"&gt; porque esto le dice a los motores de búsqueda en que idioma esta tu sitio web.</w:t>
-      </w:r>
-    </w:p>
-    <w:p>
-      <w:pPr>
-        <w:pStyle w:val="Prrafodelista"/>
-      </w:pPr>
-    </w:p>
-    <w:p>
-      <w:pPr>
-        <w:pStyle w:val="Prrafodelista"/>
-        <w:numPr>
-          <w:ilvl w:val="0"/>
-          <w:numId w:val="1"/>
-        </w:numPr>
-      </w:pPr>
-      <w:r>
-        <w:t>M</w:t>
-      </w:r>
-      <w:r>
-        <w:t>ejora la accesibilidad de tu formulario asociar la etiqueta &lt;label&gt; con el elemento &lt;input&gt; (a través del atributo for en el label y el id en el input ) :</w:t>
-      </w:r>
-    </w:p>
-    <w:p>
-      <w:pPr>
-        <w:pStyle w:val="Prrafodelista"/>
-      </w:pPr>
-    </w:p>
-    <w:p>
-      <w:pPr>
-        <w:pStyle w:val="Prrafodelista"/>
-        <w:ind w:left="1416"/>
-      </w:pPr>
-    </w:p>
-    <w:p>
-      <w:pPr>
-        <w:ind w:left="2124"/>
-        <w:rPr>
-          <w:lang w:val="en-US"/>
-        </w:rPr>
-      </w:pPr>
-      <w:r>
-        <w:rPr>
-          <w:lang w:val="en-US"/>
-        </w:rPr>
-        <w:t>&lt;label for="email"&gt;Email&lt;/label&gt;</w:t>
-      </w:r>
-    </w:p>
-    <w:p>
-      <w:pPr>
-        <w:ind w:left="2124"/>
-        <w:rPr>
-          <w:lang w:val="en-US"/>
-        </w:rPr>
-      </w:pPr>
-      <w:r>
-        <w:rPr>
-          <w:lang w:val="en-US"/>
-        </w:rPr>
-        <w:t>&lt;input type="email" id="email" required placeholder="ejemplo@correo.com" &gt;</w:t>
-      </w:r>
-    </w:p>
-    <w:p>
-      <w:pPr>
-        <w:ind w:left="1416"/>
-        <w:rPr>
-          <w:lang w:val="en-US"/>
-        </w:rPr>
-      </w:pPr>
-    </w:p>
-    <w:p>
-      <w:pPr>
-        <w:rPr>
-          <w:lang w:val="en-US"/>
-        </w:rPr>
-      </w:pPr>
-    </w:p>
-    <w:p>
-      <w:pPr>
-        <w:rPr>
-          <w:lang w:val="en-US"/>
-        </w:rPr>
-      </w:pPr>
-    </w:p>
-    <w:p>
-      <w:r>
-        <w:t xml:space="preserve">Tu nota en el Desafío 03 es: </w:t>
-      </w:r>
-      <w:r>
-        <w:rPr>
-          <w:b/>
-          <w:bCs/>
-        </w:rPr>
-        <w:t>9</w:t>
-      </w:r>
-    </w:p>
-    <w:p/>
-    <w:p/>
-    <w:p>
-      <w:pPr>
-        <w:pBdr>
-          <w:bottom w:val="single" w:sz="6" w:space="1" w:color="auto"/>
-        </w:pBdr>
-      </w:pPr>
-    </w:p>
-    <w:p/>
-    <w:p/>
-    <w:p>
-      <w:pPr>
-        <w:rPr>
-          <w:rFonts w:ascii="Segoe UI Emoji" w:hAnsi="Segoe UI Emoji" w:cs="Segoe UI Emoji"/>
-          <w:b/>
-          <w:bCs/>
-        </w:rPr>
-      </w:pPr>
-      <w:r>
-        <w:rPr>
-          <w:rFonts w:ascii="Segoe UI Emoji" w:hAnsi="Segoe UI Emoji" w:cs="Segoe UI Emoji"/>
-          <w:b/>
-          <w:bCs/>
-        </w:rPr>
-        <w:t>Ulate Carlos</w:t>
-      </w:r>
-    </w:p>
-    <w:p>
-      <w:pPr>
-        <w:rPr>
-          <w:rFonts w:ascii="Segoe UI Emoji" w:hAnsi="Segoe UI Emoji" w:cs="Segoe UI Emoji"/>
-          <w:b/>
-          <w:bCs/>
-        </w:rPr>
-      </w:pPr>
-    </w:p>
-    <w:p>
-      <w:pPr>
-        <w:rPr>
-          <w:rFonts w:ascii="Segoe UI Emoji" w:hAnsi="Segoe UI Emoji" w:cs="Segoe UI Emoji"/>
-        </w:rPr>
-      </w:pPr>
-      <w:r>
-        <w:rPr>
-          <w:rFonts w:ascii="Segoe UI Emoji" w:hAnsi="Segoe UI Emoji" w:cs="Segoe UI Emoji"/>
-        </w:rPr>
-        <w:t>🎉</w:t>
-      </w:r>
-      <w:r>
-        <w:t xml:space="preserve">¡Felicitaciones por la entrega del Desafío 03! </w:t>
-      </w:r>
-      <w:r>
-        <w:rPr>
-          <w:rFonts w:ascii="Segoe UI Emoji" w:hAnsi="Segoe UI Emoji" w:cs="Segoe UI Emoji"/>
-        </w:rPr>
-        <w:t>🎉</w:t>
-      </w:r>
-    </w:p>
-    <w:p/>
-    <w:p>
-      <w:r>
-        <w:t>Carlos, el trabajo realizado es excelente. Destaco la prolijidad del documento ¡</w:t>
-      </w:r>
-    </w:p>
-    <w:p/>
-    <w:p>
-      <w:r>
-        <w:t>La estructura HTML esta impecable, destaco la correcta implementación de contenedores semánticos como main, section, footer, etc. El manejo de listas, textos y títulos es correcto.</w:t>
-      </w:r>
-    </w:p>
-    <w:p/>
-    <w:p>
-      <w:r>
-        <w:t>La barra de navegación principal quedo ok, los links configurados con estado hover como se solicitó.</w:t>
-      </w:r>
-    </w:p>
-    <w:p/>
-    <w:p>
-      <w:r>
-        <w:t xml:space="preserve">La implementación de Formularios es correcta, los campos con sus tipos de datos respectivos. </w:t>
-      </w:r>
-    </w:p>
-    <w:p/>
-    <w:p>
-      <w:r>
-        <w:t>Los estilos solicitados tanto en colores, fuentes y dimensiones quedaron ok, también aplicaste correctamente las propiedades de box model. EL layout quedó responsivo como se solicitó en enunciado.</w:t>
-      </w:r>
-    </w:p>
-    <w:p/>
-    <w:p/>
-    <w:p>
-      <w:r>
-        <w:t xml:space="preserve">Tu nota en el Desafío 03 es: </w:t>
-      </w:r>
-      <w:r>
-        <w:rPr>
-          <w:b/>
-          <w:bCs/>
-        </w:rPr>
-        <w:t>10</w:t>
-      </w:r>
-    </w:p>
-    <w:p/>
-    <w:p>
-      <w:pPr>
-        <w:pBdr>
-          <w:bottom w:val="single" w:sz="6" w:space="1" w:color="auto"/>
-        </w:pBdr>
-      </w:pPr>
-    </w:p>
-    <w:p/>
-    <w:p>
-      <w:pPr>
-        <w:rPr>
-          <w:rFonts w:ascii="Segoe UI Emoji" w:hAnsi="Segoe UI Emoji" w:cs="Segoe UI Emoji"/>
-          <w:b/>
-          <w:bCs/>
-        </w:rPr>
-      </w:pPr>
-      <w:r>
-        <w:rPr>
-          <w:rFonts w:ascii="Segoe UI Emoji" w:hAnsi="Segoe UI Emoji" w:cs="Segoe UI Emoji"/>
-          <w:b/>
-          <w:bCs/>
-        </w:rPr>
-        <w:t>Chiapello Gianluca</w:t>
-      </w:r>
-    </w:p>
-    <w:p>
-      <w:pPr>
-        <w:rPr>
-          <w:rFonts w:ascii="Segoe UI Emoji" w:hAnsi="Segoe UI Emoji" w:cs="Segoe UI Emoji"/>
-          <w:b/>
-          <w:bCs/>
-        </w:rPr>
-      </w:pPr>
-    </w:p>
-    <w:p>
-      <w:pPr>
-        <w:rPr>
-          <w:rFonts w:ascii="Segoe UI Emoji" w:hAnsi="Segoe UI Emoji" w:cs="Segoe UI Emoji"/>
-        </w:rPr>
-      </w:pPr>
-      <w:r>
-        <w:rPr>
-          <w:rFonts w:ascii="Segoe UI Emoji" w:hAnsi="Segoe UI Emoji" w:cs="Segoe UI Emoji"/>
-        </w:rPr>
-        <w:t>🎉</w:t>
-      </w:r>
-      <w:r>
-        <w:t xml:space="preserve">¡Felicitaciones por la entrega del Desafío 04! </w:t>
-      </w:r>
-      <w:r>
-        <w:rPr>
-          <w:rFonts w:ascii="Segoe UI Emoji" w:hAnsi="Segoe UI Emoji" w:cs="Segoe UI Emoji"/>
-        </w:rPr>
-        <w:t>🎉</w:t>
-      </w:r>
-    </w:p>
-    <w:p/>
-    <w:p>
-      <w:r>
-        <w:t>Gianluca</w:t>
-      </w:r>
-      <w:r>
-        <w:t>, excelente trabajo, te felicito. Destaco la prolijidad de tu proyecto.</w:t>
-      </w:r>
-    </w:p>
-    <w:p/>
-    <w:p>
-      <w:r>
-        <w:t>La estructura HTML esta impecable, destaco la correcta implementación de contenedores semánticos como main, section, footer, etc.</w:t>
-      </w:r>
-    </w:p>
-    <w:p/>
-    <w:p>
-      <w:r>
-        <w:t xml:space="preserve">La implementación de position para superponer el banner quedo perfecto. </w:t>
-      </w:r>
-    </w:p>
-    <w:p/>
-    <w:p>
-      <w:r>
-        <w:t>La disposición de elementos en la landing page quedo tal cual lo solicitado con la herramienta Flex.</w:t>
-      </w:r>
-    </w:p>
-    <w:p/>
-    <w:p>
-      <w:r>
-        <w:t>Correctamente creadas la tabla y recurso de video. Los estilos tal cual los solicitados en imágenes de referencia.</w:t>
-      </w:r>
-    </w:p>
-    <w:p/>
-    <w:p/>
-    <w:p>
-      <w:r>
-        <w:t>Excelente trabajo ¡</w:t>
-      </w:r>
-    </w:p>
-    <w:p/>
-    <w:p>
-      <w:r>
-        <w:t xml:space="preserve">Tu nota en el Desafío 04 es: </w:t>
-      </w:r>
-      <w:r>
-        <w:rPr>
-          <w:b/>
-          <w:bCs/>
-        </w:rPr>
-        <w:t>10</w:t>
-      </w:r>
-    </w:p>
-    <w:p/>
-    <w:p>
-      <w:pPr>
-        <w:pBdr>
-          <w:bottom w:val="single" w:sz="6" w:space="1" w:color="auto"/>
-        </w:pBdr>
-      </w:pPr>
-    </w:p>
-    <w:p/>
-    <w:p/>
-    <w:p>
-      <w:pPr>
-        <w:pBdr>
-          <w:bottom w:val="single" w:sz="6" w:space="1" w:color="auto"/>
-        </w:pBdr>
-      </w:pPr>
-    </w:p>
-    <w:p/>
-    <w:p>
-      <w:pPr>
-        <w:rPr>
-          <w:rFonts w:ascii="Segoe UI Emoji" w:hAnsi="Segoe UI Emoji" w:cs="Segoe UI Emoji"/>
-          <w:b/>
-          <w:bCs/>
-        </w:rPr>
-      </w:pPr>
-      <w:r>
-        <w:rPr>
-          <w:rFonts w:ascii="Segoe UI Emoji" w:hAnsi="Segoe UI Emoji" w:cs="Segoe UI Emoji"/>
-          <w:b/>
-          <w:bCs/>
-        </w:rPr>
-        <w:t>Capone Santino</w:t>
-      </w:r>
-    </w:p>
-    <w:p>
-      <w:pPr>
-        <w:rPr>
-          <w:rFonts w:ascii="Segoe UI Emoji" w:hAnsi="Segoe UI Emoji" w:cs="Segoe UI Emoji"/>
-          <w:b/>
-          <w:bCs/>
-        </w:rPr>
-      </w:pPr>
-    </w:p>
+        <w:t xml:space="preserve">Los estilos solicitados tanto en colores, fuentes y dimensiones quedaron ok, también aplicaste correctamente las propiedades de box </w:t>
+      </w:r>
+      <w:proofErr w:type="spellStart"/>
+      <w:r>
+        <w:t>model</w:t>
+      </w:r>
+      <w:proofErr w:type="spellEnd"/>
+      <w:r>
+        <w:t xml:space="preserve">. EL </w:t>
+      </w:r>
+      <w:proofErr w:type="spellStart"/>
+      <w:r>
+        <w:t>layout</w:t>
+      </w:r>
+      <w:proofErr w:type="spellEnd"/>
+      <w:r>
+        <w:t xml:space="preserve"> quedó responsivo como se solicitó en enunciado.</w:t>
+      </w:r>
+    </w:p>
+    <w:p/>
+    <w:p/>
     <w:p>
       <w:r>
         <w:lastRenderedPageBreak/>
-        <w:t>Santino, el resultado logrado es muy bueno, te felicito.</w:t>
-      </w:r>
-    </w:p>
-    <w:p/>
-    <w:p>
-      <w:r>
-        <w:t>La estructura HTML esta impecable, destaco la correcta implementación de contenedores semánticos como main, section, footer, etc. El manejo de listas, textos y títulos es correcto.</w:t>
-      </w:r>
-    </w:p>
-    <w:p/>
-    <w:p>
-      <w:r>
-        <w:t>La barra de navegación principal quedo ok, los links configurados con estado hover como se solicitó.</w:t>
-      </w:r>
-    </w:p>
-    <w:p/>
-    <w:p>
-      <w:r>
-        <w:t xml:space="preserve">La implementación de Formularios es correcta, los campos con sus tipos de datos respectivos. </w:t>
-      </w:r>
-    </w:p>
-    <w:p/>
-    <w:p>
-      <w:r>
-        <w:t>Los estilos solicitados tanto en colores, fuentes y dimensiones quedaron ok, también aplicaste correctamente las propiedades de box model. EL layout quedó responsivo como se solicitó en enunciado.</w:t>
-      </w:r>
-    </w:p>
-    <w:p/>
-    <w:p/>
-    <w:p>
-      <w:r>
         <w:t>Observaciones:</w:t>
       </w:r>
     </w:p>
@@ -1297,7 +1733,39 @@
         </w:numPr>
       </w:pPr>
       <w:r>
-        <w:t>Las imágenes están bien creadas, destaco que completaste el atributo alt de las mismas, una mejora para que no se deformen al redimensionar la pantalla es aplicar por css la propiedad “object-fit: cover” con esto te aseguras que sin importar que las proporciones de la imagen y el contenedor coincidan de ultima que la imagen se recorte pero que no llegue a deformarse.</w:t>
+        <w:t xml:space="preserve">Las imágenes están bien creadas, destaco que completaste el atributo </w:t>
+      </w:r>
+      <w:proofErr w:type="spellStart"/>
+      <w:r>
+        <w:t>alt</w:t>
+      </w:r>
+      <w:proofErr w:type="spellEnd"/>
+      <w:r>
+        <w:t xml:space="preserve"> de las mismas, una mejora para que no se deformen al redimensionar la pantalla es aplicar por </w:t>
+      </w:r>
+      <w:proofErr w:type="spellStart"/>
+      <w:r>
+        <w:t>css</w:t>
+      </w:r>
+      <w:proofErr w:type="spellEnd"/>
+      <w:r>
+        <w:t xml:space="preserve"> la propiedad “</w:t>
+      </w:r>
+      <w:proofErr w:type="spellStart"/>
+      <w:r>
+        <w:t>object-fit</w:t>
+      </w:r>
+      <w:proofErr w:type="spellEnd"/>
+      <w:r>
+        <w:t xml:space="preserve">: </w:t>
+      </w:r>
+      <w:proofErr w:type="spellStart"/>
+      <w:r>
+        <w:t>cover</w:t>
+      </w:r>
+      <w:proofErr w:type="spellEnd"/>
+      <w:r>
+        <w:t>” con esto te aseguras que sin importar que las proporciones de la imagen y el contenedor coincidan de ultima que la imagen se recorte pero que no llegue a deformarse.</w:t>
       </w:r>
     </w:p>
     <w:p/>
@@ -1331,30 +1799,51 @@
           <w:bCs/>
         </w:rPr>
       </w:pPr>
-      <w:r>
-        <w:rPr>
-          <w:rFonts w:ascii="Segoe UI Emoji" w:hAnsi="Segoe UI Emoji" w:cs="Segoe UI Emoji"/>
-          <w:b/>
-          <w:bCs/>
-        </w:rPr>
-        <w:t>Vernengo Hipolito</w:t>
-      </w:r>
-    </w:p>
-    <w:p>
-      <w:pPr>
-        <w:rPr>
-          <w:rFonts w:ascii="Segoe UI Emoji" w:hAnsi="Segoe UI Emoji" w:cs="Segoe UI Emoji"/>
-          <w:b/>
-          <w:bCs/>
-        </w:rPr>
-      </w:pPr>
-    </w:p>
-    <w:p>
-      <w:pPr>
-        <w:rPr>
-          <w:rFonts w:ascii="Segoe UI Emoji" w:hAnsi="Segoe UI Emoji" w:cs="Segoe UI Emoji"/>
-        </w:rPr>
-      </w:pPr>
+      <w:proofErr w:type="spellStart"/>
+      <w:r>
+        <w:rPr>
+          <w:rFonts w:ascii="Segoe UI Emoji" w:hAnsi="Segoe UI Emoji" w:cs="Segoe UI Emoji"/>
+          <w:b/>
+          <w:bCs/>
+        </w:rPr>
+        <w:t>Vernengo</w:t>
+      </w:r>
+      <w:proofErr w:type="spellEnd"/>
+      <w:r>
+        <w:rPr>
+          <w:rFonts w:ascii="Segoe UI Emoji" w:hAnsi="Segoe UI Emoji" w:cs="Segoe UI Emoji"/>
+          <w:b/>
+          <w:bCs/>
+        </w:rPr>
+        <w:t xml:space="preserve"> </w:t>
+      </w:r>
+      <w:proofErr w:type="spellStart"/>
+      <w:r>
+        <w:rPr>
+          <w:rFonts w:ascii="Segoe UI Emoji" w:hAnsi="Segoe UI Emoji" w:cs="Segoe UI Emoji"/>
+          <w:b/>
+          <w:bCs/>
+        </w:rPr>
+        <w:t>Hipolito</w:t>
+      </w:r>
+      <w:proofErr w:type="spellEnd"/>
+    </w:p>
+    <w:p>
+      <w:pPr>
+        <w:rPr>
+          <w:rFonts w:ascii="Segoe UI Emoji" w:hAnsi="Segoe UI Emoji" w:cs="Segoe UI Emoji"/>
+          <w:b/>
+          <w:bCs/>
+        </w:rPr>
+      </w:pPr>
+    </w:p>
+    <w:p>
+      <w:pPr>
+        <w:rPr>
+          <w:rFonts w:ascii="Segoe UI Emoji" w:hAnsi="Segoe UI Emoji" w:cs="Segoe UI Emoji"/>
+        </w:rPr>
+      </w:pPr>
+      <w:proofErr w:type="gramStart"/>
       <w:r>
         <w:rPr>
           <w:rFonts w:ascii="Segoe UI Emoji" w:hAnsi="Segoe UI Emoji" w:cs="Segoe UI Emoji"/>
@@ -1362,7 +1851,11 @@
         <w:t>🎉</w:t>
       </w:r>
       <w:r>
-        <w:t xml:space="preserve">¡Felicitaciones por la entrega del Desafío 03! </w:t>
+        <w:t>¡</w:t>
+      </w:r>
+      <w:proofErr w:type="gramEnd"/>
+      <w:r>
+        <w:t xml:space="preserve">Felicitaciones por la entrega del Desafío 04! </w:t>
       </w:r>
       <w:r>
         <w:rPr>
@@ -1373,39 +1866,83 @@
     </w:p>
     <w:p/>
     <w:p>
-      <w:r>
-        <w:t>Hipolito, el trabajo realizado es excelente. Destaco la prolijidad del documento ¡</w:t>
-      </w:r>
-    </w:p>
-    <w:p/>
-    <w:p>
-      <w:r>
-        <w:t>La estructura HTML esta impecable, destaco la correcta implementación de contenedores semánticos como main, section, footer, etc. El manejo de listas, textos y títulos es correcto.</w:t>
-      </w:r>
-    </w:p>
-    <w:p/>
-    <w:p>
-      <w:r>
-        <w:t>La barra de navegación principal quedo ok, los links configurados con estado hover como se solicitó.</w:t>
-      </w:r>
-    </w:p>
-    <w:p/>
-    <w:p>
-      <w:r>
-        <w:t xml:space="preserve">La implementación de Formularios es correcta, los campos con sus tipos de datos respectivos. </w:t>
-      </w:r>
-    </w:p>
-    <w:p/>
-    <w:p>
-      <w:r>
-        <w:t>Los estilos solicitados tanto en colores, fuentes y dimensiones quedaron ok, también aplicaste correctamente las propiedades de box model. EL layout quedó responsivo como se solicitó en enunciado.</w:t>
-      </w:r>
-    </w:p>
-    <w:p/>
-    <w:p/>
-    <w:p>
-      <w:r>
-        <w:t xml:space="preserve">Tu nota en el Desafío 03 es: </w:t>
+      <w:proofErr w:type="spellStart"/>
+      <w:r>
+        <w:t>Hipolito</w:t>
+      </w:r>
+      <w:proofErr w:type="spellEnd"/>
+      <w:r>
+        <w:t xml:space="preserve">, excelente trabajo, te felicito. </w:t>
+      </w:r>
+    </w:p>
+    <w:p/>
+    <w:p>
+      <w:r>
+        <w:t xml:space="preserve">La estructura HTML esta impecable, destaco la correcta implementación de contenedores semánticos como </w:t>
+      </w:r>
+      <w:proofErr w:type="spellStart"/>
+      <w:r>
+        <w:t>main</w:t>
+      </w:r>
+      <w:proofErr w:type="spellEnd"/>
+      <w:r>
+        <w:t xml:space="preserve">, </w:t>
+      </w:r>
+      <w:proofErr w:type="spellStart"/>
+      <w:r>
+        <w:t>section</w:t>
+      </w:r>
+      <w:proofErr w:type="spellEnd"/>
+      <w:r>
+        <w:t xml:space="preserve">, </w:t>
+      </w:r>
+      <w:proofErr w:type="spellStart"/>
+      <w:r>
+        <w:t>footer</w:t>
+      </w:r>
+      <w:proofErr w:type="spellEnd"/>
+      <w:r>
+        <w:t>, etc.</w:t>
+      </w:r>
+    </w:p>
+    <w:p/>
+    <w:p>
+      <w:r>
+        <w:t xml:space="preserve">La implementación de position para superponer el banner quedo perfecto. </w:t>
+      </w:r>
+    </w:p>
+    <w:p/>
+    <w:p>
+      <w:r>
+        <w:t xml:space="preserve">La disposición de elementos en la </w:t>
+      </w:r>
+      <w:proofErr w:type="spellStart"/>
+      <w:r>
+        <w:t>landing</w:t>
+      </w:r>
+      <w:proofErr w:type="spellEnd"/>
+      <w:r>
+        <w:t xml:space="preserve"> page quedo tal cual lo solicitado con la herramienta Flex.</w:t>
+      </w:r>
+    </w:p>
+    <w:p/>
+    <w:p>
+      <w:r>
+        <w:t>Correctamente creadas la tabla y recurso de video. Los estilos tal cual los solicitados en imágenes de referencia.</w:t>
+      </w:r>
+    </w:p>
+    <w:p/>
+    <w:p/>
+    <w:p>
+      <w:r>
+        <w:t>Excelente trabajo ¡</w:t>
+      </w:r>
+    </w:p>
+    <w:p/>
+    <w:p>
+      <w:r>
+        <w:lastRenderedPageBreak/>
+        <w:t xml:space="preserve">Tu nota en el Desafío 04 es: </w:t>
       </w:r>
       <w:r>
         <w:rPr>
@@ -1462,6 +1999,7 @@
           <w:rFonts w:ascii="Segoe UI Emoji" w:hAnsi="Segoe UI Emoji" w:cs="Segoe UI Emoji"/>
         </w:rPr>
       </w:pPr>
+      <w:proofErr w:type="gramStart"/>
       <w:r>
         <w:rPr>
           <w:rFonts w:ascii="Segoe UI Emoji" w:hAnsi="Segoe UI Emoji" w:cs="Segoe UI Emoji"/>
@@ -1469,7 +2007,11 @@
         <w:t>🎉</w:t>
       </w:r>
       <w:r>
-        <w:t xml:space="preserve">¡Felicitaciones por la entrega del Desafío 04! </w:t>
+        <w:t>¡</w:t>
+      </w:r>
+      <w:proofErr w:type="gramEnd"/>
+      <w:r>
+        <w:t xml:space="preserve">Felicitaciones por la entrega del Desafío 04! </w:t>
       </w:r>
       <w:r>
         <w:rPr>
@@ -1481,28 +2023,37 @@
     <w:p/>
     <w:p>
       <w:r>
-        <w:t>Tomas</w:t>
-      </w:r>
-      <w:r>
-        <w:t xml:space="preserve">, </w:t>
-      </w:r>
-      <w:r>
-        <w:t>muy buen</w:t>
-      </w:r>
-      <w:r>
-        <w:t xml:space="preserve"> trabajo, te felicito</w:t>
-      </w:r>
-      <w:r>
-        <w:t xml:space="preserve"> por el compromiso en realizar las entregas.</w:t>
-      </w:r>
-    </w:p>
-    <w:p/>
-    <w:p>
-      <w:r>
-        <w:t xml:space="preserve">La estructura HTML </w:t>
-      </w:r>
-      <w:r>
-        <w:t>presenta algunos errores, el contenedor header no tiene cierre. En este caso con el uso de un solo contenedor Footer esta correcto.</w:t>
+        <w:t>Tomas, muy buen trabajo, te felicito por el compromiso en realizar las entregas.</w:t>
+      </w:r>
+    </w:p>
+    <w:p/>
+    <w:p>
+      <w:r>
+        <w:t xml:space="preserve">La estructura HTML presenta algunos errores, el contenedor </w:t>
+      </w:r>
+      <w:proofErr w:type="spellStart"/>
+      <w:r>
+        <w:t>header</w:t>
+      </w:r>
+      <w:proofErr w:type="spellEnd"/>
+      <w:r>
+        <w:t xml:space="preserve"> no tiene cierre. En este caso con el uso de un solo contenedor </w:t>
+      </w:r>
+      <w:proofErr w:type="spellStart"/>
+      <w:r>
+        <w:t>Footer</w:t>
+      </w:r>
+      <w:proofErr w:type="spellEnd"/>
+      <w:r>
+        <w:t xml:space="preserve"> </w:t>
+      </w:r>
+      <w:proofErr w:type="spellStart"/>
+      <w:r>
+        <w:t>esta</w:t>
+      </w:r>
+      <w:proofErr w:type="spellEnd"/>
+      <w:r>
+        <w:t xml:space="preserve"> correcto.</w:t>
       </w:r>
     </w:p>
     <w:p/>
@@ -1514,13 +2065,20 @@
     <w:p/>
     <w:p>
       <w:r>
-        <w:t>La disposición de elementos en la landing page quedo tal cual lo solicitado con la herramienta Flex.</w:t>
-      </w:r>
-    </w:p>
-    <w:p/>
-    <w:p>
-      <w:r>
-        <w:lastRenderedPageBreak/>
+        <w:t xml:space="preserve">La disposición de elementos en la </w:t>
+      </w:r>
+      <w:proofErr w:type="spellStart"/>
+      <w:r>
+        <w:t>landing</w:t>
+      </w:r>
+      <w:proofErr w:type="spellEnd"/>
+      <w:r>
+        <w:t xml:space="preserve"> page quedo tal cual lo solicitado con la herramienta Flex.</w:t>
+      </w:r>
+    </w:p>
+    <w:p/>
+    <w:p>
+      <w:r>
         <w:t>Correctamente creadas la tabla y recurso de video. Los estilos tal cual los solicitados en imágenes de referencia.</w:t>
       </w:r>
     </w:p>
@@ -1594,6 +2152,7 @@
           <w:rFonts w:ascii="Segoe UI Emoji" w:hAnsi="Segoe UI Emoji" w:cs="Segoe UI Emoji"/>
         </w:rPr>
       </w:pPr>
+      <w:proofErr w:type="gramStart"/>
       <w:r>
         <w:rPr>
           <w:rFonts w:ascii="Segoe UI Emoji" w:hAnsi="Segoe UI Emoji" w:cs="Segoe UI Emoji"/>
@@ -1601,7 +2160,11 @@
         <w:t>🎉</w:t>
       </w:r>
       <w:r>
-        <w:t xml:space="preserve">¡Felicitaciones por la entrega del Desafío 04! </w:t>
+        <w:t>¡</w:t>
+      </w:r>
+      <w:proofErr w:type="gramEnd"/>
+      <w:r>
+        <w:t xml:space="preserve">Felicitaciones por la entrega del Desafío 04! </w:t>
       </w:r>
       <w:r>
         <w:rPr>
@@ -1613,22 +2176,38 @@
     <w:p/>
     <w:p>
       <w:r>
-        <w:t>Ariana</w:t>
-      </w:r>
+        <w:lastRenderedPageBreak/>
+        <w:t>Ariana, muy buen trabajo, te felicito. Destaco la prolijidad de tu proyecto.</w:t>
+      </w:r>
+    </w:p>
+    <w:p/>
+    <w:p>
+      <w:r>
+        <w:t xml:space="preserve">La estructura HTML esta impecable, destaco la correcta implementación de contenedores semánticos como </w:t>
+      </w:r>
+      <w:proofErr w:type="spellStart"/>
+      <w:r>
+        <w:t>main</w:t>
+      </w:r>
+      <w:proofErr w:type="spellEnd"/>
       <w:r>
         <w:t xml:space="preserve">, </w:t>
       </w:r>
-      <w:r>
-        <w:t>muy buen</w:t>
-      </w:r>
-      <w:r>
-        <w:t xml:space="preserve"> trabajo, te felicito. Destaco la prolijidad de tu proyecto.</w:t>
-      </w:r>
-    </w:p>
-    <w:p/>
-    <w:p>
-      <w:r>
-        <w:t>La estructura HTML esta impecable, destaco la correcta implementación de contenedores semánticos como main, section, footer, etc.</w:t>
+      <w:proofErr w:type="spellStart"/>
+      <w:r>
+        <w:t>section</w:t>
+      </w:r>
+      <w:proofErr w:type="spellEnd"/>
+      <w:r>
+        <w:t xml:space="preserve">, </w:t>
+      </w:r>
+      <w:proofErr w:type="spellStart"/>
+      <w:r>
+        <w:t>footer</w:t>
+      </w:r>
+      <w:proofErr w:type="spellEnd"/>
+      <w:r>
+        <w:t>, etc.</w:t>
       </w:r>
     </w:p>
     <w:p/>
@@ -1640,7 +2219,15 @@
     <w:p/>
     <w:p>
       <w:r>
-        <w:t>La disposición de elementos en la landing page quedo tal cual lo solicitado con la herramienta Flex.</w:t>
+        <w:t xml:space="preserve">La disposición de elementos en la </w:t>
+      </w:r>
+      <w:proofErr w:type="spellStart"/>
+      <w:r>
+        <w:t>landing</w:t>
+      </w:r>
+      <w:proofErr w:type="spellEnd"/>
+      <w:r>
+        <w:t xml:space="preserve"> page quedo tal cual lo solicitado con la herramienta Flex.</w:t>
       </w:r>
     </w:p>
     <w:p/>
@@ -1652,7 +2239,23 @@
     <w:p/>
     <w:p>
       <w:r>
-        <w:t>En los estilos los colores, tipografías y espaciado quedaron ok, falto agregar efectos hover en la barra de navegación principal y en las cards de productos.</w:t>
+        <w:t xml:space="preserve">En los estilos los colores, tipografías y espaciado quedaron ok, falto agregar efectos </w:t>
+      </w:r>
+      <w:proofErr w:type="spellStart"/>
+      <w:r>
+        <w:t>hover</w:t>
+      </w:r>
+      <w:proofErr w:type="spellEnd"/>
+      <w:r>
+        <w:t xml:space="preserve"> en la barra de navegación principal y en las </w:t>
+      </w:r>
+      <w:proofErr w:type="spellStart"/>
+      <w:r>
+        <w:t>cards</w:t>
+      </w:r>
+      <w:proofErr w:type="spellEnd"/>
+      <w:r>
+        <w:t xml:space="preserve"> de productos.</w:t>
       </w:r>
     </w:p>
     <w:p/>
@@ -1665,14 +2268,7 @@
     <w:p/>
     <w:p>
       <w:r>
-        <w:lastRenderedPageBreak/>
-        <w:t>Tu nota en el Desafío 0</w:t>
-      </w:r>
-      <w:r>
-        <w:t>4</w:t>
-      </w:r>
-      <w:r>
-        <w:t xml:space="preserve"> es: </w:t>
+        <w:t xml:space="preserve">Tu nota en el Desafío 04 es: </w:t>
       </w:r>
       <w:r>
         <w:rPr>
@@ -1699,109 +2295,144 @@
           <w:bCs/>
         </w:rPr>
       </w:pPr>
-      <w:r>
-        <w:rPr>
-          <w:rFonts w:ascii="Segoe UI Emoji" w:hAnsi="Segoe UI Emoji" w:cs="Segoe UI Emoji"/>
-          <w:b/>
-          <w:bCs/>
-        </w:rPr>
-        <w:t>Perezlindo Franco</w:t>
-      </w:r>
-    </w:p>
-    <w:p>
-      <w:pPr>
-        <w:rPr>
-          <w:rFonts w:ascii="Segoe UI Emoji" w:hAnsi="Segoe UI Emoji" w:cs="Segoe UI Emoji"/>
-          <w:b/>
-          <w:bCs/>
-        </w:rPr>
-      </w:pPr>
-    </w:p>
-    <w:p>
-      <w:r>
-        <w:t>Franco, el resultado logrado es muy bueno, te felicito.</w:t>
-      </w:r>
-    </w:p>
-    <w:p/>
-    <w:p>
-      <w:r>
-        <w:t>La estructura HTML esta impecable, destaco la correcta implementación de contenedores semánticos como main, section, footer, etc. El manejo de listas, textos y títulos es correcto.</w:t>
-      </w:r>
-    </w:p>
-    <w:p/>
-    <w:p>
-      <w:r>
-        <w:t>La barra de navegación principal quedo ok, los links configurados con estado hover como se solicitó.</w:t>
-      </w:r>
-    </w:p>
-    <w:p/>
-    <w:p>
-      <w:r>
-        <w:t xml:space="preserve">La implementación de Formularios es correcta, los campos con sus tipos de datos respectivos. </w:t>
-      </w:r>
-    </w:p>
-    <w:p/>
-    <w:p>
-      <w:r>
-        <w:t>Los estilos solicitados tanto en colores, fuentes y dimensiones quedaron ok, también aplicaste correctamente las propiedades de box model. EL layout quedó responsivo como se solicitó en enunciado.</w:t>
-      </w:r>
-    </w:p>
-    <w:p/>
-    <w:p/>
-    <w:p>
-      <w:r>
-        <w:t>Observaciones:</w:t>
-      </w:r>
-    </w:p>
-    <w:p/>
-    <w:p>
-      <w:pPr>
-        <w:pStyle w:val="Prrafodelista"/>
-      </w:pPr>
-    </w:p>
-    <w:p>
-      <w:pPr>
-        <w:pStyle w:val="Prrafodelista"/>
-        <w:numPr>
-          <w:ilvl w:val="0"/>
-          <w:numId w:val="3"/>
-        </w:numPr>
-      </w:pPr>
-      <w:r>
-        <w:t>Las imágenes están bien creadas, destaco que completaste el atributo alt de las mismas, una mejora para que no se deformen al redimensionar la pantalla es aplicar por css la propiedad “object-fit: cover” con esto te aseguras que sin importar que las proporciones de la imagen y el contenedor coincidan de ultima que la imagen se recorte pero que no llegue a deformarse.</w:t>
-      </w:r>
-    </w:p>
-    <w:p>
-      <w:pPr>
-        <w:pStyle w:val="Prrafodelista"/>
-      </w:pPr>
-    </w:p>
-    <w:p>
-      <w:pPr>
-        <w:pStyle w:val="Prrafodelista"/>
-        <w:numPr>
-          <w:ilvl w:val="0"/>
-          <w:numId w:val="1"/>
-        </w:numPr>
-      </w:pPr>
-      <w:r>
-        <w:t>Es recomendable utilizar en lugar de un div la etiqueta &lt;form&gt; que tiene valor semántico y ayuda a los lectores entender que esa parte es un formulario.</w:t>
-      </w:r>
-    </w:p>
-    <w:p/>
-    <w:p/>
-    <w:p/>
-    <w:p>
-      <w:r>
-        <w:lastRenderedPageBreak/>
-        <w:t xml:space="preserve">Tu nota en el Desafío 03 es: </w:t>
-      </w:r>
-      <w:r>
-        <w:rPr>
-          <w:b/>
-          <w:bCs/>
-        </w:rPr>
-        <w:t>9</w:t>
+      <w:proofErr w:type="spellStart"/>
+      <w:r>
+        <w:rPr>
+          <w:rFonts w:ascii="Segoe UI Emoji" w:hAnsi="Segoe UI Emoji" w:cs="Segoe UI Emoji"/>
+          <w:b/>
+          <w:bCs/>
+        </w:rPr>
+        <w:t>Perezlindo</w:t>
+      </w:r>
+      <w:proofErr w:type="spellEnd"/>
+      <w:r>
+        <w:rPr>
+          <w:rFonts w:ascii="Segoe UI Emoji" w:hAnsi="Segoe UI Emoji" w:cs="Segoe UI Emoji"/>
+          <w:b/>
+          <w:bCs/>
+        </w:rPr>
+        <w:t xml:space="preserve"> Franco</w:t>
+      </w:r>
+    </w:p>
+    <w:p>
+      <w:pPr>
+        <w:rPr>
+          <w:rFonts w:ascii="Segoe UI Emoji" w:hAnsi="Segoe UI Emoji" w:cs="Segoe UI Emoji"/>
+          <w:b/>
+          <w:bCs/>
+        </w:rPr>
+      </w:pPr>
+    </w:p>
+    <w:p>
+      <w:pPr>
+        <w:rPr>
+          <w:rFonts w:ascii="Segoe UI Emoji" w:hAnsi="Segoe UI Emoji" w:cs="Segoe UI Emoji"/>
+        </w:rPr>
+      </w:pPr>
+      <w:proofErr w:type="gramStart"/>
+      <w:r>
+        <w:rPr>
+          <w:rFonts w:ascii="Segoe UI Emoji" w:hAnsi="Segoe UI Emoji" w:cs="Segoe UI Emoji"/>
+        </w:rPr>
+        <w:t>🎉</w:t>
+      </w:r>
+      <w:r>
+        <w:t>¡</w:t>
+      </w:r>
+      <w:proofErr w:type="gramEnd"/>
+      <w:r>
+        <w:t xml:space="preserve">Felicitaciones por la entrega del Desafío 04! </w:t>
+      </w:r>
+      <w:r>
+        <w:rPr>
+          <w:rFonts w:ascii="Segoe UI Emoji" w:hAnsi="Segoe UI Emoji" w:cs="Segoe UI Emoji"/>
+        </w:rPr>
+        <w:t>🎉</w:t>
+      </w:r>
+    </w:p>
+    <w:p/>
+    <w:p>
+      <w:r>
+        <w:t>Franco</w:t>
+      </w:r>
+      <w:r>
+        <w:t xml:space="preserve">, excelente trabajo, te felicito. </w:t>
+      </w:r>
+    </w:p>
+    <w:p/>
+    <w:p>
+      <w:r>
+        <w:t xml:space="preserve">La estructura HTML esta impecable, destaco la correcta implementación de contenedores semánticos como </w:t>
+      </w:r>
+      <w:proofErr w:type="spellStart"/>
+      <w:r>
+        <w:t>main</w:t>
+      </w:r>
+      <w:proofErr w:type="spellEnd"/>
+      <w:r>
+        <w:t xml:space="preserve">, </w:t>
+      </w:r>
+      <w:proofErr w:type="spellStart"/>
+      <w:r>
+        <w:t>section</w:t>
+      </w:r>
+      <w:proofErr w:type="spellEnd"/>
+      <w:r>
+        <w:t xml:space="preserve">, </w:t>
+      </w:r>
+      <w:proofErr w:type="spellStart"/>
+      <w:r>
+        <w:t>footer</w:t>
+      </w:r>
+      <w:proofErr w:type="spellEnd"/>
+      <w:r>
+        <w:t>, etc.</w:t>
+      </w:r>
+    </w:p>
+    <w:p/>
+    <w:p>
+      <w:r>
+        <w:t xml:space="preserve">La implementación de position para superponer el banner quedo perfecto. </w:t>
+      </w:r>
+    </w:p>
+    <w:p/>
+    <w:p>
+      <w:r>
+        <w:t xml:space="preserve">La disposición de elementos en la </w:t>
+      </w:r>
+      <w:proofErr w:type="spellStart"/>
+      <w:r>
+        <w:t>landing</w:t>
+      </w:r>
+      <w:proofErr w:type="spellEnd"/>
+      <w:r>
+        <w:t xml:space="preserve"> page quedo tal cual lo solicitado con la herramienta Flex.</w:t>
+      </w:r>
+    </w:p>
+    <w:p/>
+    <w:p>
+      <w:r>
+        <w:t>Correctamente creadas la tabla y recurso de video. Los estilos tal cual los solicitados en imágenes de referencia.</w:t>
+      </w:r>
+    </w:p>
+    <w:p/>
+    <w:p/>
+    <w:p>
+      <w:r>
+        <w:t>Excelente trabajo ¡</w:t>
+      </w:r>
+    </w:p>
+    <w:p/>
+    <w:p>
+      <w:r>
+        <w:t xml:space="preserve">Tu nota en el Desafío 04 es: </w:t>
+      </w:r>
+      <w:r>
+        <w:rPr>
+          <w:b/>
+          <w:bCs/>
+        </w:rPr>
+        <w:t>10</w:t>
       </w:r>
     </w:p>
     <w:p>
@@ -1827,30 +2458,71 @@
           <w:bCs/>
         </w:rPr>
       </w:pPr>
-      <w:r>
-        <w:rPr>
-          <w:rFonts w:ascii="Segoe UI Emoji" w:hAnsi="Segoe UI Emoji" w:cs="Segoe UI Emoji"/>
-          <w:b/>
-          <w:bCs/>
-        </w:rPr>
-        <w:t>Zuñiga Hernandez Carlos Andres</w:t>
-      </w:r>
-    </w:p>
-    <w:p>
-      <w:pPr>
-        <w:rPr>
-          <w:rFonts w:ascii="Segoe UI Emoji" w:hAnsi="Segoe UI Emoji" w:cs="Segoe UI Emoji"/>
-          <w:b/>
-          <w:bCs/>
-        </w:rPr>
-      </w:pPr>
-    </w:p>
-    <w:p>
-      <w:pPr>
-        <w:rPr>
-          <w:rFonts w:ascii="Segoe UI Emoji" w:hAnsi="Segoe UI Emoji" w:cs="Segoe UI Emoji"/>
-        </w:rPr>
-      </w:pPr>
+      <w:proofErr w:type="spellStart"/>
+      <w:r>
+        <w:rPr>
+          <w:rFonts w:ascii="Segoe UI Emoji" w:hAnsi="Segoe UI Emoji" w:cs="Segoe UI Emoji"/>
+          <w:b/>
+          <w:bCs/>
+        </w:rPr>
+        <w:t>Zuñiga</w:t>
+      </w:r>
+      <w:proofErr w:type="spellEnd"/>
+      <w:r>
+        <w:rPr>
+          <w:rFonts w:ascii="Segoe UI Emoji" w:hAnsi="Segoe UI Emoji" w:cs="Segoe UI Emoji"/>
+          <w:b/>
+          <w:bCs/>
+        </w:rPr>
+        <w:t xml:space="preserve"> </w:t>
+      </w:r>
+      <w:proofErr w:type="spellStart"/>
+      <w:r>
+        <w:rPr>
+          <w:rFonts w:ascii="Segoe UI Emoji" w:hAnsi="Segoe UI Emoji" w:cs="Segoe UI Emoji"/>
+          <w:b/>
+          <w:bCs/>
+        </w:rPr>
+        <w:t>Hernandez</w:t>
+      </w:r>
+      <w:proofErr w:type="spellEnd"/>
+      <w:r>
+        <w:rPr>
+          <w:rFonts w:ascii="Segoe UI Emoji" w:hAnsi="Segoe UI Emoji" w:cs="Segoe UI Emoji"/>
+          <w:b/>
+          <w:bCs/>
+        </w:rPr>
+        <w:t xml:space="preserve"> Carlos </w:t>
+      </w:r>
+      <w:proofErr w:type="spellStart"/>
+      <w:r>
+        <w:rPr>
+          <w:rFonts w:ascii="Segoe UI Emoji" w:hAnsi="Segoe UI Emoji" w:cs="Segoe UI Emoji"/>
+          <w:b/>
+          <w:bCs/>
+        </w:rPr>
+        <w:t>Andres</w:t>
+      </w:r>
+      <w:proofErr w:type="spellEnd"/>
+    </w:p>
+    <w:p>
+      <w:pPr>
+        <w:ind w:left="708" w:hanging="708"/>
+        <w:rPr>
+          <w:rFonts w:ascii="Segoe UI Emoji" w:hAnsi="Segoe UI Emoji" w:cs="Segoe UI Emoji"/>
+          <w:b/>
+          <w:bCs/>
+        </w:rPr>
+      </w:pPr>
+    </w:p>
+    <w:p>
+      <w:pPr>
+        <w:ind w:left="708" w:hanging="708"/>
+        <w:rPr>
+          <w:rFonts w:ascii="Segoe UI Emoji" w:hAnsi="Segoe UI Emoji" w:cs="Segoe UI Emoji"/>
+        </w:rPr>
+      </w:pPr>
+      <w:proofErr w:type="gramStart"/>
       <w:r>
         <w:rPr>
           <w:rFonts w:ascii="Segoe UI Emoji" w:hAnsi="Segoe UI Emoji" w:cs="Segoe UI Emoji"/>
@@ -1858,7 +2530,11 @@
         <w:t>🎉</w:t>
       </w:r>
       <w:r>
-        <w:t xml:space="preserve">¡Felicitaciones por la entrega del Desafío 03! </w:t>
+        <w:t>¡</w:t>
+      </w:r>
+      <w:proofErr w:type="gramEnd"/>
+      <w:r>
+        <w:t xml:space="preserve">Felicitaciones por la entrega del Desafío 04! </w:t>
       </w:r>
       <w:r>
         <w:rPr>
@@ -1867,127 +2543,20 @@
         <w:t>🎉</w:t>
       </w:r>
     </w:p>
-    <w:p/>
-    <w:p>
-      <w:r>
-        <w:t>Carlos, el trabajo realizado es excelente.</w:t>
-      </w:r>
-    </w:p>
-    <w:p/>
-    <w:p>
-      <w:r>
-        <w:t>La estructura HTML esta impecable, destaco la correcta implementación de contenedores semánticos como main, section, footer, etc. El manejo de listas, textos y títulos es correcto.</w:t>
-      </w:r>
-    </w:p>
-    <w:p/>
-    <w:p>
-      <w:r>
-        <w:t>La barra de navegación principal quedo ok, los links configurados con estado hover como se solicitó.</w:t>
-      </w:r>
-    </w:p>
-    <w:p/>
-    <w:p>
-      <w:r>
-        <w:t xml:space="preserve">La implementación de Formularios es correcta, los campos con sus tipos de datos respectivos. </w:t>
-      </w:r>
-    </w:p>
-    <w:p/>
-    <w:p>
-      <w:r>
-        <w:t>Los estilos solicitados tanto en colores, fuentes y dimensiones quedaron ok, también aplicaste correctamente las propiedades de box model. EL layout quedó responsivo como se solicitó en enunciado.</w:t>
-      </w:r>
-    </w:p>
-    <w:p/>
-    <w:p/>
-    <w:p>
-      <w:r>
-        <w:t>Observaciones:</w:t>
-      </w:r>
-    </w:p>
-    <w:p>
-      <w:pPr>
-        <w:pStyle w:val="Prrafodelista"/>
-      </w:pPr>
-    </w:p>
-    <w:p>
-      <w:pPr>
-        <w:pStyle w:val="Prrafodelista"/>
-        <w:numPr>
-          <w:ilvl w:val="0"/>
-          <w:numId w:val="1"/>
-        </w:numPr>
-      </w:pPr>
-      <w:r>
-        <w:t>Mejora la accesibilidad de tu formulario asociar la etiqueta &lt;label&gt; con el elemento &lt;input&gt; (a través del atributo for en el label y el id en el input ) :</w:t>
-      </w:r>
-    </w:p>
-    <w:p>
-      <w:pPr>
-        <w:pStyle w:val="Prrafodelista"/>
-      </w:pPr>
-    </w:p>
-    <w:p>
-      <w:pPr>
-        <w:pStyle w:val="Prrafodelista"/>
-        <w:ind w:left="1416"/>
-      </w:pPr>
-      <w:r>
-        <w:t>&lt;label for="email"&gt;Correo electrónico:&lt;/label&gt;</w:t>
-      </w:r>
-    </w:p>
-    <w:p>
-      <w:pPr>
-        <w:pStyle w:val="Prrafodelista"/>
-        <w:ind w:left="1416"/>
-        <w:rPr>
-          <w:lang w:val="en-US"/>
-        </w:rPr>
-      </w:pPr>
-      <w:r>
-        <w:rPr>
-          <w:lang w:val="en-US"/>
-        </w:rPr>
-        <w:t>&lt;input type="email" id="email" placeholder="tumail@correo.com" /&gt;</w:t>
-      </w:r>
-    </w:p>
-    <w:p>
-      <w:pPr>
-        <w:pStyle w:val="Prrafodelista"/>
-        <w:ind w:left="1416"/>
-        <w:rPr>
-          <w:lang w:val="en-US"/>
-        </w:rPr>
-      </w:pPr>
-    </w:p>
-    <w:p>
-      <w:pPr>
-        <w:pStyle w:val="Prrafodelista"/>
-        <w:rPr>
-          <w:lang w:val="en-US"/>
-        </w:rPr>
-      </w:pPr>
-    </w:p>
-    <w:p>
-      <w:pPr>
-        <w:pStyle w:val="Prrafodelista"/>
-        <w:numPr>
-          <w:ilvl w:val="0"/>
-          <w:numId w:val="1"/>
-        </w:numPr>
-      </w:pPr>
-      <w:r>
-        <w:t>Al redimensionar la pantalla te quedaron pegados los bordes de los contenedores a los márgenes ahi te convendria mejor aplicar solo un padding de 10px de izquierda y derecha a la etiqueta &lt;main&gt; y sacarle el width:100%:</w:t>
-      </w:r>
-    </w:p>
-    <w:p>
-      <w:pPr>
-        <w:ind w:left="1416"/>
-      </w:pPr>
-    </w:p>
-    <w:p>
-      <w:r>
-        <w:lastRenderedPageBreak/>
-        <w:t xml:space="preserve">                       main{</w:t>
+    <w:p>
+      <w:pPr>
+        <w:ind w:left="708" w:hanging="708"/>
+      </w:pPr>
+    </w:p>
+    <w:p>
+      <w:pPr>
+        <w:tabs>
+          <w:tab w:val="left" w:pos="5660"/>
+        </w:tabs>
+        <w:ind w:left="708" w:hanging="708"/>
+      </w:pPr>
+      <w:r>
+        <w:t xml:space="preserve">Carlos, excelente trabajo, te felicito. </w:t>
       </w:r>
       <w:r>
         <w:tab/>
@@ -1995,62 +2564,124 @@
     </w:p>
     <w:p>
       <w:pPr>
-        <w:ind w:left="708" w:firstLine="708"/>
-      </w:pPr>
-      <w:r>
-        <w:t>…</w:t>
-      </w:r>
-      <w:r>
-        <w:tab/>
-      </w:r>
-      <w:r>
-        <w:tab/>
-      </w:r>
-    </w:p>
-    <w:p>
-      <w:pPr>
-        <w:ind w:left="1416"/>
-      </w:pPr>
-      <w:r>
-        <w:t xml:space="preserve">padding: 0 10px; </w:t>
-      </w:r>
-    </w:p>
-    <w:p>
-      <w:pPr>
-        <w:pStyle w:val="Prrafodelista"/>
-      </w:pPr>
-      <w:r>
-        <w:t xml:space="preserve">         }</w:t>
-      </w:r>
-    </w:p>
-    <w:p>
-      <w:pPr>
-        <w:pStyle w:val="Prrafodelista"/>
-      </w:pPr>
-    </w:p>
-    <w:p>
-      <w:pPr>
-        <w:pStyle w:val="Prrafodelista"/>
-      </w:pPr>
-    </w:p>
-    <w:p>
-      <w:pPr>
-        <w:pStyle w:val="Prrafodelista"/>
-        <w:ind w:left="1416"/>
-      </w:pPr>
-    </w:p>
-    <w:p/>
-    <w:p/>
-    <w:p>
-      <w:r>
-        <w:t xml:space="preserve">Tu nota en el Desafío 03 es: </w:t>
-      </w:r>
-      <w:r>
-        <w:rPr>
-          <w:b/>
-          <w:bCs/>
-        </w:rPr>
-        <w:t>9</w:t>
+        <w:ind w:left="708" w:hanging="708"/>
+      </w:pPr>
+    </w:p>
+    <w:p>
+      <w:pPr>
+        <w:ind w:left="708" w:hanging="708"/>
+      </w:pPr>
+      <w:r>
+        <w:t xml:space="preserve">La estructura HTML esta impecable, destaco la correcta implementación de contenedores semánticos como </w:t>
+      </w:r>
+      <w:proofErr w:type="spellStart"/>
+      <w:r>
+        <w:t>main</w:t>
+      </w:r>
+      <w:proofErr w:type="spellEnd"/>
+      <w:r>
+        <w:t xml:space="preserve">, </w:t>
+      </w:r>
+      <w:proofErr w:type="spellStart"/>
+      <w:r>
+        <w:t>section</w:t>
+      </w:r>
+      <w:proofErr w:type="spellEnd"/>
+      <w:r>
+        <w:t xml:space="preserve">, </w:t>
+      </w:r>
+      <w:proofErr w:type="spellStart"/>
+      <w:r>
+        <w:t>footer</w:t>
+      </w:r>
+      <w:proofErr w:type="spellEnd"/>
+      <w:r>
+        <w:t>, etc.</w:t>
+      </w:r>
+    </w:p>
+    <w:p>
+      <w:pPr>
+        <w:ind w:left="708" w:hanging="708"/>
+      </w:pPr>
+    </w:p>
+    <w:p>
+      <w:pPr>
+        <w:ind w:left="708" w:hanging="708"/>
+      </w:pPr>
+      <w:r>
+        <w:t xml:space="preserve">La implementación de position para superponer el banner quedo perfecto. </w:t>
+      </w:r>
+    </w:p>
+    <w:p>
+      <w:pPr>
+        <w:ind w:left="708" w:hanging="708"/>
+      </w:pPr>
+    </w:p>
+    <w:p>
+      <w:pPr>
+        <w:ind w:left="708" w:hanging="708"/>
+      </w:pPr>
+      <w:r>
+        <w:t xml:space="preserve">La disposición de elementos en la </w:t>
+      </w:r>
+      <w:proofErr w:type="spellStart"/>
+      <w:r>
+        <w:t>landing</w:t>
+      </w:r>
+      <w:proofErr w:type="spellEnd"/>
+      <w:r>
+        <w:t xml:space="preserve"> page quedo tal cual lo solicitado con la herramienta Flex.</w:t>
+      </w:r>
+    </w:p>
+    <w:p>
+      <w:pPr>
+        <w:ind w:left="708" w:hanging="708"/>
+      </w:pPr>
+    </w:p>
+    <w:p>
+      <w:pPr>
+        <w:ind w:left="708" w:hanging="708"/>
+      </w:pPr>
+      <w:r>
+        <w:t>Correctamente creadas la tabla y recurso de video. Los estilos tal cual los solicitados en imágenes de referencia.</w:t>
+      </w:r>
+    </w:p>
+    <w:p>
+      <w:pPr>
+        <w:ind w:left="708" w:hanging="708"/>
+      </w:pPr>
+    </w:p>
+    <w:p>
+      <w:pPr>
+        <w:ind w:left="708" w:hanging="708"/>
+      </w:pPr>
+    </w:p>
+    <w:p>
+      <w:pPr>
+        <w:ind w:left="708" w:hanging="708"/>
+      </w:pPr>
+      <w:r>
+        <w:t>Excelente trabajo ¡</w:t>
+      </w:r>
+    </w:p>
+    <w:p>
+      <w:pPr>
+        <w:ind w:left="708" w:hanging="708"/>
+      </w:pPr>
+    </w:p>
+    <w:p>
+      <w:pPr>
+        <w:ind w:left="708" w:hanging="708"/>
+      </w:pPr>
+      <w:r>
+        <w:t xml:space="preserve">Tu nota en el Desafío 04 es: </w:t>
+      </w:r>
+      <w:r>
+        <w:rPr>
+          <w:b/>
+          <w:bCs/>
+        </w:rPr>
+        <w:t>10</w:t>
       </w:r>
     </w:p>
     <w:p>
@@ -2099,6 +2730,7 @@
           <w:rFonts w:ascii="Segoe UI Emoji" w:hAnsi="Segoe UI Emoji" w:cs="Segoe UI Emoji"/>
         </w:rPr>
       </w:pPr>
+      <w:proofErr w:type="gramStart"/>
       <w:r>
         <w:rPr>
           <w:rFonts w:ascii="Segoe UI Emoji" w:hAnsi="Segoe UI Emoji" w:cs="Segoe UI Emoji"/>
@@ -2106,7 +2738,11 @@
         <w:t>🎉</w:t>
       </w:r>
       <w:r>
-        <w:t xml:space="preserve">¡Felicitaciones por la entrega del Desafío 01! </w:t>
+        <w:t>¡</w:t>
+      </w:r>
+      <w:proofErr w:type="gramEnd"/>
+      <w:r>
+        <w:t xml:space="preserve">Felicitaciones por la entrega del Desafío 01! </w:t>
       </w:r>
       <w:r>
         <w:rPr>
@@ -2136,7 +2772,23 @@
     <w:p/>
     <w:p>
       <w:r>
-        <w:t xml:space="preserve">Buenísimo que aplicaste etiquetas &lt;b&gt; para resaltar en negrita textos, te falto aplicar palabras claves con etiquetas &lt;strong&gt;, recorda que ayudan para que los motores de búsqueda entiendan mejor el contenido de tu documento web. </w:t>
+        <w:t>Buenísimo que aplicaste etiquetas &lt;b&gt; para resaltar en negrita textos, te falto aplicar palabras claves con etiquetas &lt;</w:t>
+      </w:r>
+      <w:proofErr w:type="spellStart"/>
+      <w:r>
+        <w:t>strong</w:t>
+      </w:r>
+      <w:proofErr w:type="spellEnd"/>
+      <w:r>
+        <w:t xml:space="preserve">&gt;, </w:t>
+      </w:r>
+      <w:proofErr w:type="spellStart"/>
+      <w:r>
+        <w:t>recorda</w:t>
+      </w:r>
+      <w:proofErr w:type="spellEnd"/>
+      <w:r>
+        <w:t xml:space="preserve"> que ayudan para que los motores de búsqueda entiendan mejor el contenido de tu documento web. </w:t>
       </w:r>
     </w:p>
     <w:p/>
@@ -2182,33 +2834,52 @@
           <w:b/>
           <w:bCs/>
         </w:rPr>
-        <w:t>Cabrera Kowalsky Sofia Abril</w:t>
-      </w:r>
-    </w:p>
-    <w:p>
-      <w:pPr>
-        <w:rPr>
-          <w:rFonts w:ascii="Segoe UI Emoji" w:hAnsi="Segoe UI Emoji" w:cs="Segoe UI Emoji"/>
-          <w:b/>
-          <w:bCs/>
-        </w:rPr>
-      </w:pPr>
-    </w:p>
-    <w:p>
-      <w:pPr>
-        <w:rPr>
-          <w:rFonts w:ascii="Segoe UI Emoji" w:hAnsi="Segoe UI Emoji" w:cs="Segoe UI Emoji"/>
-          <w:b/>
-          <w:bCs/>
-        </w:rPr>
-      </w:pPr>
-    </w:p>
-    <w:p>
-      <w:pPr>
-        <w:rPr>
-          <w:rFonts w:ascii="Segoe UI Emoji" w:hAnsi="Segoe UI Emoji" w:cs="Segoe UI Emoji"/>
-        </w:rPr>
-      </w:pPr>
+        <w:t xml:space="preserve">Cabrera </w:t>
+      </w:r>
+      <w:proofErr w:type="spellStart"/>
+      <w:r>
+        <w:rPr>
+          <w:rFonts w:ascii="Segoe UI Emoji" w:hAnsi="Segoe UI Emoji" w:cs="Segoe UI Emoji"/>
+          <w:b/>
+          <w:bCs/>
+        </w:rPr>
+        <w:t>Kowalsky</w:t>
+      </w:r>
+      <w:proofErr w:type="spellEnd"/>
+      <w:r>
+        <w:rPr>
+          <w:rFonts w:ascii="Segoe UI Emoji" w:hAnsi="Segoe UI Emoji" w:cs="Segoe UI Emoji"/>
+          <w:b/>
+          <w:bCs/>
+        </w:rPr>
+        <w:t xml:space="preserve"> Sofia Abril</w:t>
+      </w:r>
+    </w:p>
+    <w:p>
+      <w:pPr>
+        <w:rPr>
+          <w:rFonts w:ascii="Segoe UI Emoji" w:hAnsi="Segoe UI Emoji" w:cs="Segoe UI Emoji"/>
+          <w:b/>
+          <w:bCs/>
+        </w:rPr>
+      </w:pPr>
+    </w:p>
+    <w:p>
+      <w:pPr>
+        <w:rPr>
+          <w:rFonts w:ascii="Segoe UI Emoji" w:hAnsi="Segoe UI Emoji" w:cs="Segoe UI Emoji"/>
+          <w:b/>
+          <w:bCs/>
+        </w:rPr>
+      </w:pPr>
+    </w:p>
+    <w:p>
+      <w:pPr>
+        <w:rPr>
+          <w:rFonts w:ascii="Segoe UI Emoji" w:hAnsi="Segoe UI Emoji" w:cs="Segoe UI Emoji"/>
+        </w:rPr>
+      </w:pPr>
+      <w:proofErr w:type="gramStart"/>
       <w:r>
         <w:rPr>
           <w:rFonts w:ascii="Segoe UI Emoji" w:hAnsi="Segoe UI Emoji" w:cs="Segoe UI Emoji"/>
@@ -2216,7 +2887,11 @@
         <w:t>🎉</w:t>
       </w:r>
       <w:r>
-        <w:t xml:space="preserve">¡Felicitaciones por la entrega del Desafío 04! </w:t>
+        <w:t>¡</w:t>
+      </w:r>
+      <w:proofErr w:type="gramEnd"/>
+      <w:r>
+        <w:t xml:space="preserve">Felicitaciones por la entrega del Desafío 04! </w:t>
       </w:r>
       <w:r>
         <w:rPr>
@@ -2228,16 +2903,37 @@
     <w:p/>
     <w:p>
       <w:r>
-        <w:t>Sofia</w:t>
-      </w:r>
-      <w:r>
-        <w:t>, muy buen trabajo, te felicito. Destaco la prolijidad de tu proyecto.</w:t>
-      </w:r>
-    </w:p>
-    <w:p/>
-    <w:p>
-      <w:r>
-        <w:t>La estructura HTML esta impecable, destaco la correcta implementación de contenedores semánticos como main, section, footer, etc.</w:t>
+        <w:t>Sofia, muy buen trabajo, te felicito. Destaco la prolijidad de tu proyecto.</w:t>
+      </w:r>
+    </w:p>
+    <w:p/>
+    <w:p>
+      <w:r>
+        <w:t xml:space="preserve">La estructura HTML esta impecable, destaco la correcta implementación de contenedores semánticos como </w:t>
+      </w:r>
+      <w:proofErr w:type="spellStart"/>
+      <w:r>
+        <w:t>main</w:t>
+      </w:r>
+      <w:proofErr w:type="spellEnd"/>
+      <w:r>
+        <w:t xml:space="preserve">, </w:t>
+      </w:r>
+      <w:proofErr w:type="spellStart"/>
+      <w:r>
+        <w:t>section</w:t>
+      </w:r>
+      <w:proofErr w:type="spellEnd"/>
+      <w:r>
+        <w:t xml:space="preserve">, </w:t>
+      </w:r>
+      <w:proofErr w:type="spellStart"/>
+      <w:r>
+        <w:t>footer</w:t>
+      </w:r>
+      <w:proofErr w:type="spellEnd"/>
+      <w:r>
+        <w:t>, etc.</w:t>
       </w:r>
     </w:p>
     <w:p/>
@@ -2249,7 +2945,15 @@
     <w:p/>
     <w:p>
       <w:r>
-        <w:t>La disposición de elementos en la landing page quedo tal cual lo solicitado con la herramienta Flex.</w:t>
+        <w:t xml:space="preserve">La disposición de elementos en la </w:t>
+      </w:r>
+      <w:proofErr w:type="spellStart"/>
+      <w:r>
+        <w:t>landing</w:t>
+      </w:r>
+      <w:proofErr w:type="spellEnd"/>
+      <w:r>
+        <w:t xml:space="preserve"> page quedo tal cual lo solicitado con la herramienta Flex.</w:t>
       </w:r>
     </w:p>
     <w:p/>
@@ -2261,7 +2965,23 @@
     <w:p/>
     <w:p>
       <w:r>
-        <w:t>En los estilos los colores, tipografías y espaciado quedaron ok, falto agregar efectos hover en la barra de navegación principal y en las cards de productos.</w:t>
+        <w:t xml:space="preserve">En los estilos los colores, tipografías y espaciado quedaron ok, falto agregar efectos </w:t>
+      </w:r>
+      <w:proofErr w:type="spellStart"/>
+      <w:r>
+        <w:t>hover</w:t>
+      </w:r>
+      <w:proofErr w:type="spellEnd"/>
+      <w:r>
+        <w:t xml:space="preserve"> en la barra de navegación principal y en las </w:t>
+      </w:r>
+      <w:proofErr w:type="spellStart"/>
+      <w:r>
+        <w:t>cards</w:t>
+      </w:r>
+      <w:proofErr w:type="spellEnd"/>
+      <w:r>
+        <w:t xml:space="preserve"> de productos.</w:t>
       </w:r>
     </w:p>
     <w:p/>
@@ -2321,111 +3041,165 @@
           <w:bCs/>
         </w:rPr>
       </w:pPr>
-      <w:r>
-        <w:rPr>
-          <w:rFonts w:ascii="Segoe UI Emoji" w:hAnsi="Segoe UI Emoji" w:cs="Segoe UI Emoji"/>
-          <w:b/>
-          <w:bCs/>
-        </w:rPr>
-        <w:t>Imas Guerrero Catalina Eva</w:t>
-      </w:r>
-    </w:p>
-    <w:p>
-      <w:pPr>
-        <w:rPr>
-          <w:rFonts w:ascii="Segoe UI Emoji" w:hAnsi="Segoe UI Emoji" w:cs="Segoe UI Emoji"/>
-          <w:b/>
-          <w:bCs/>
-        </w:rPr>
-      </w:pPr>
-    </w:p>
-    <w:p>
-      <w:pPr>
-        <w:rPr>
-          <w:rFonts w:ascii="Segoe UI Emoji" w:hAnsi="Segoe UI Emoji" w:cs="Segoe UI Emoji"/>
-        </w:rPr>
-      </w:pPr>
-      <w:r>
-        <w:rPr>
-          <w:rFonts w:ascii="Segoe UI Emoji" w:hAnsi="Segoe UI Emoji" w:cs="Segoe UI Emoji"/>
-        </w:rPr>
+      <w:proofErr w:type="spellStart"/>
+      <w:r>
+        <w:rPr>
+          <w:rFonts w:ascii="Segoe UI Emoji" w:hAnsi="Segoe UI Emoji" w:cs="Segoe UI Emoji"/>
+          <w:b/>
+          <w:bCs/>
+        </w:rPr>
+        <w:t>Imas</w:t>
+      </w:r>
+      <w:proofErr w:type="spellEnd"/>
+      <w:r>
+        <w:rPr>
+          <w:rFonts w:ascii="Segoe UI Emoji" w:hAnsi="Segoe UI Emoji" w:cs="Segoe UI Emoji"/>
+          <w:b/>
+          <w:bCs/>
+        </w:rPr>
+        <w:t xml:space="preserve"> Guerrero Catalina Eva</w:t>
+      </w:r>
+    </w:p>
+    <w:p>
+      <w:pPr>
+        <w:rPr>
+          <w:rFonts w:ascii="Segoe UI Emoji" w:hAnsi="Segoe UI Emoji" w:cs="Segoe UI Emoji"/>
+          <w:b/>
+          <w:bCs/>
+        </w:rPr>
+      </w:pPr>
+    </w:p>
+    <w:p>
+      <w:pPr>
+        <w:rPr>
+          <w:rFonts w:ascii="Segoe UI Emoji" w:hAnsi="Segoe UI Emoji" w:cs="Segoe UI Emoji"/>
+        </w:rPr>
+      </w:pPr>
+      <w:proofErr w:type="gramStart"/>
+      <w:r>
+        <w:rPr>
+          <w:rFonts w:ascii="Segoe UI Emoji" w:hAnsi="Segoe UI Emoji" w:cs="Segoe UI Emoji"/>
+        </w:rPr>
+        <w:t>🎉</w:t>
+      </w:r>
+      <w:r>
+        <w:t>¡</w:t>
+      </w:r>
+      <w:proofErr w:type="gramEnd"/>
+      <w:r>
+        <w:t xml:space="preserve">Felicitaciones por la entrega del Desafío 04! </w:t>
+      </w:r>
+      <w:r>
+        <w:rPr>
+          <w:rFonts w:ascii="Segoe UI Emoji" w:hAnsi="Segoe UI Emoji" w:cs="Segoe UI Emoji"/>
+        </w:rPr>
+        <w:t>🎉</w:t>
+      </w:r>
+    </w:p>
+    <w:p/>
+    <w:p>
+      <w:r>
+        <w:t xml:space="preserve">Catalina, </w:t>
+      </w:r>
+      <w:r>
+        <w:t>muy buen</w:t>
+      </w:r>
+      <w:r>
+        <w:t xml:space="preserve"> trabajo, te felicito. Destaco la prolijidad de tu proyecto.</w:t>
+      </w:r>
+    </w:p>
+    <w:p/>
+    <w:p>
+      <w:r>
+        <w:t>En l</w:t>
+      </w:r>
+      <w:r>
+        <w:t xml:space="preserve">a estructura HTML </w:t>
+      </w:r>
+      <w:r>
+        <w:t xml:space="preserve">solo falto contener la </w:t>
+      </w:r>
+      <w:proofErr w:type="spellStart"/>
+      <w:r>
+        <w:t>info</w:t>
+      </w:r>
+      <w:proofErr w:type="spellEnd"/>
+      <w:r>
+        <w:t xml:space="preserve"> principal en la etiqueta &lt;</w:t>
+      </w:r>
+      <w:proofErr w:type="spellStart"/>
+      <w:r>
+        <w:t>main</w:t>
+      </w:r>
+      <w:proofErr w:type="spellEnd"/>
+      <w:r>
+        <w:t>&gt;</w:t>
+      </w:r>
+      <w:r>
+        <w:t xml:space="preserve">, </w:t>
+      </w:r>
+      <w:r>
+        <w:t>luego</w:t>
+      </w:r>
+      <w:r>
+        <w:t xml:space="preserve"> </w:t>
+      </w:r>
+      <w:r>
+        <w:t>es</w:t>
+      </w:r>
+      <w:r>
+        <w:t xml:space="preserve"> correcta </w:t>
+      </w:r>
+      <w:r>
+        <w:t xml:space="preserve">la </w:t>
+      </w:r>
+      <w:r>
+        <w:t xml:space="preserve">implementación de contenedores semánticos como </w:t>
+      </w:r>
+      <w:proofErr w:type="spellStart"/>
+      <w:r>
+        <w:t>header</w:t>
+      </w:r>
+      <w:proofErr w:type="spellEnd"/>
+      <w:r>
+        <w:t xml:space="preserve">, </w:t>
+      </w:r>
+      <w:proofErr w:type="spellStart"/>
+      <w:r>
+        <w:t>section</w:t>
+      </w:r>
+      <w:proofErr w:type="spellEnd"/>
+      <w:r>
+        <w:t xml:space="preserve">, </w:t>
+      </w:r>
+      <w:proofErr w:type="spellStart"/>
+      <w:r>
+        <w:t>footer</w:t>
+      </w:r>
+      <w:proofErr w:type="spellEnd"/>
+      <w:r>
+        <w:t>, etc.</w:t>
+      </w:r>
+    </w:p>
+    <w:p/>
+    <w:p>
+      <w:r>
         <w:lastRenderedPageBreak/>
-        <w:t>🎉</w:t>
-      </w:r>
-      <w:r>
-        <w:t xml:space="preserve">¡Felicitaciones por la entrega del Desafío 04! </w:t>
-      </w:r>
-      <w:r>
-        <w:rPr>
-          <w:rFonts w:ascii="Segoe UI Emoji" w:hAnsi="Segoe UI Emoji" w:cs="Segoe UI Emoji"/>
-        </w:rPr>
-        <w:t>🎉</w:t>
-      </w:r>
-    </w:p>
-    <w:p/>
-    <w:p>
-      <w:r>
-        <w:t>Catalina</w:t>
-      </w:r>
-      <w:r>
-        <w:t xml:space="preserve">, </w:t>
-      </w:r>
-      <w:r>
-        <w:t>muy buen</w:t>
-      </w:r>
-      <w:r>
-        <w:t xml:space="preserve"> trabajo, te felicito. Destaco la prolijidad de tu proyecto.</w:t>
-      </w:r>
-    </w:p>
-    <w:p/>
-    <w:p>
-      <w:r>
-        <w:t>En l</w:t>
-      </w:r>
-      <w:r>
-        <w:t xml:space="preserve">a estructura HTML </w:t>
-      </w:r>
-      <w:r>
-        <w:t>solo falto contener la info principal en la etiqueta &lt;main&gt;</w:t>
-      </w:r>
-      <w:r>
-        <w:t xml:space="preserve">, </w:t>
-      </w:r>
-      <w:r>
-        <w:t>luego</w:t>
-      </w:r>
-      <w:r>
-        <w:t xml:space="preserve"> </w:t>
-      </w:r>
-      <w:r>
-        <w:t>es</w:t>
-      </w:r>
-      <w:r>
-        <w:t xml:space="preserve"> correcta </w:t>
-      </w:r>
-      <w:r>
-        <w:t xml:space="preserve">la </w:t>
-      </w:r>
-      <w:r>
-        <w:t xml:space="preserve">implementación de contenedores semánticos como </w:t>
-      </w:r>
-      <w:r>
-        <w:t xml:space="preserve">header, </w:t>
-      </w:r>
-      <w:r>
-        <w:t>section, footer, etc.</w:t>
-      </w:r>
-    </w:p>
-    <w:p/>
-    <w:p>
-      <w:r>
         <w:t xml:space="preserve">La implementación de position para superponer el banner quedo perfecto. </w:t>
       </w:r>
     </w:p>
     <w:p/>
     <w:p>
       <w:r>
-        <w:t>La disposición de elementos en la landing page quedo tal cual lo solicitado con la herramienta Flex.</w:t>
+        <w:t xml:space="preserve">La disposición de elementos en la </w:t>
+      </w:r>
+      <w:proofErr w:type="spellStart"/>
+      <w:r>
+        <w:t>landing</w:t>
+      </w:r>
+      <w:proofErr w:type="spellEnd"/>
+      <w:r>
+        <w:t xml:space="preserve"> page quedo tal cual lo solicitado con la herramienta Flex.</w:t>
       </w:r>
     </w:p>
     <w:p/>
@@ -2501,6 +3275,7 @@
           <w:rFonts w:ascii="Segoe UI Emoji" w:hAnsi="Segoe UI Emoji" w:cs="Segoe UI Emoji"/>
         </w:rPr>
       </w:pPr>
+      <w:proofErr w:type="gramStart"/>
       <w:r>
         <w:rPr>
           <w:rFonts w:ascii="Segoe UI Emoji" w:hAnsi="Segoe UI Emoji" w:cs="Segoe UI Emoji"/>
@@ -2508,7 +3283,11 @@
         <w:t>🎉</w:t>
       </w:r>
       <w:r>
-        <w:t xml:space="preserve">¡Felicitaciones por la entrega del Desafío 04! </w:t>
+        <w:t>¡</w:t>
+      </w:r>
+      <w:proofErr w:type="gramEnd"/>
+      <w:r>
+        <w:t xml:space="preserve">Felicitaciones por la entrega del Desafío 04! </w:t>
       </w:r>
       <w:r>
         <w:rPr>
@@ -2520,16 +3299,37 @@
     <w:p/>
     <w:p>
       <w:r>
-        <w:t>Micaela</w:t>
-      </w:r>
-      <w:r>
-        <w:t>, excelente trabajo, te felicito. Destaco la prolijidad de tu proyecto.</w:t>
-      </w:r>
-    </w:p>
-    <w:p/>
-    <w:p>
-      <w:r>
-        <w:t>La estructura HTML esta impecable, destaco la correcta implementación de contenedores semánticos como main, section, footer, etc.</w:t>
+        <w:t>Micaela, excelente trabajo, te felicito. Destaco la prolijidad de tu proyecto.</w:t>
+      </w:r>
+    </w:p>
+    <w:p/>
+    <w:p>
+      <w:r>
+        <w:t xml:space="preserve">La estructura HTML esta impecable, destaco la correcta implementación de contenedores semánticos como </w:t>
+      </w:r>
+      <w:proofErr w:type="spellStart"/>
+      <w:r>
+        <w:t>main</w:t>
+      </w:r>
+      <w:proofErr w:type="spellEnd"/>
+      <w:r>
+        <w:t xml:space="preserve">, </w:t>
+      </w:r>
+      <w:proofErr w:type="spellStart"/>
+      <w:r>
+        <w:t>section</w:t>
+      </w:r>
+      <w:proofErr w:type="spellEnd"/>
+      <w:r>
+        <w:t xml:space="preserve">, </w:t>
+      </w:r>
+      <w:proofErr w:type="spellStart"/>
+      <w:r>
+        <w:t>footer</w:t>
+      </w:r>
+      <w:proofErr w:type="spellEnd"/>
+      <w:r>
+        <w:t>, etc.</w:t>
       </w:r>
     </w:p>
     <w:p/>
@@ -2541,7 +3341,15 @@
     <w:p/>
     <w:p>
       <w:r>
-        <w:t>La disposición de elementos en la landing page quedo tal cual lo solicitado con la herramienta Flex.</w:t>
+        <w:t xml:space="preserve">La disposición de elementos en la </w:t>
+      </w:r>
+      <w:proofErr w:type="spellStart"/>
+      <w:r>
+        <w:t>landing</w:t>
+      </w:r>
+      <w:proofErr w:type="spellEnd"/>
+      <w:r>
+        <w:t xml:space="preserve"> page quedo tal cual lo solicitado con la herramienta Flex.</w:t>
       </w:r>
     </w:p>
     <w:p/>
@@ -2554,6 +3362,7 @@
     <w:p/>
     <w:p>
       <w:r>
+        <w:lastRenderedPageBreak/>
         <w:t>Excelente trabajo ¡</w:t>
       </w:r>
     </w:p>
@@ -2611,6 +3420,7 @@
           <w:rFonts w:ascii="Segoe UI Emoji" w:hAnsi="Segoe UI Emoji" w:cs="Segoe UI Emoji"/>
         </w:rPr>
       </w:pPr>
+      <w:proofErr w:type="gramStart"/>
       <w:r>
         <w:rPr>
           <w:rFonts w:ascii="Segoe UI Emoji" w:hAnsi="Segoe UI Emoji" w:cs="Segoe UI Emoji"/>
@@ -2618,7 +3428,11 @@
         <w:t>🎉</w:t>
       </w:r>
       <w:r>
-        <w:t xml:space="preserve">¡Felicitaciones por la entrega del Desafío 03! </w:t>
+        <w:t>¡</w:t>
+      </w:r>
+      <w:proofErr w:type="gramEnd"/>
+      <w:r>
+        <w:t xml:space="preserve">Felicitaciones por la entrega del Desafío 03! </w:t>
       </w:r>
       <w:r>
         <w:rPr>
@@ -2636,13 +3450,45 @@
     <w:p/>
     <w:p>
       <w:r>
-        <w:t>La estructura HTML esta impecable, destaco la correcta implementación de contenedores semánticos como main, section, footer, etc. El manejo de listas, textos y títulos es correcto.</w:t>
-      </w:r>
-    </w:p>
-    <w:p/>
-    <w:p>
-      <w:r>
-        <w:t>La barra de navegación principal quedo ok, los links configurados con estado hover como se solicitó.</w:t>
+        <w:t xml:space="preserve">La estructura HTML esta impecable, destaco la correcta implementación de contenedores semánticos como </w:t>
+      </w:r>
+      <w:proofErr w:type="spellStart"/>
+      <w:r>
+        <w:t>main</w:t>
+      </w:r>
+      <w:proofErr w:type="spellEnd"/>
+      <w:r>
+        <w:t xml:space="preserve">, </w:t>
+      </w:r>
+      <w:proofErr w:type="spellStart"/>
+      <w:r>
+        <w:t>section</w:t>
+      </w:r>
+      <w:proofErr w:type="spellEnd"/>
+      <w:r>
+        <w:t xml:space="preserve">, </w:t>
+      </w:r>
+      <w:proofErr w:type="spellStart"/>
+      <w:r>
+        <w:t>footer</w:t>
+      </w:r>
+      <w:proofErr w:type="spellEnd"/>
+      <w:r>
+        <w:t>, etc. El manejo de listas, textos y títulos es correcto.</w:t>
+      </w:r>
+    </w:p>
+    <w:p/>
+    <w:p>
+      <w:r>
+        <w:t xml:space="preserve">La barra de navegación principal quedo ok, los links configurados con estado </w:t>
+      </w:r>
+      <w:proofErr w:type="spellStart"/>
+      <w:r>
+        <w:t>hover</w:t>
+      </w:r>
+      <w:proofErr w:type="spellEnd"/>
+      <w:r>
+        <w:t xml:space="preserve"> como se solicitó.</w:t>
       </w:r>
     </w:p>
     <w:p/>
@@ -2654,14 +3500,29 @@
     <w:p/>
     <w:p>
       <w:r>
-        <w:t>Los estilos solicitados tanto en colores, fuentes y dimensiones quedaron ok, también aplicaste correctamente las propiedades de box model. EL layout quedó responsivo como se solicitó en enunciado.</w:t>
-      </w:r>
-    </w:p>
-    <w:p/>
-    <w:p/>
-    <w:p>
-      <w:r>
-        <w:lastRenderedPageBreak/>
+        <w:t xml:space="preserve">Los estilos solicitados tanto en colores, fuentes y dimensiones quedaron ok, también aplicaste correctamente las propiedades de box </w:t>
+      </w:r>
+      <w:proofErr w:type="spellStart"/>
+      <w:r>
+        <w:t>model</w:t>
+      </w:r>
+      <w:proofErr w:type="spellEnd"/>
+      <w:r>
+        <w:t xml:space="preserve">. EL </w:t>
+      </w:r>
+      <w:proofErr w:type="spellStart"/>
+      <w:r>
+        <w:t>layout</w:t>
+      </w:r>
+      <w:proofErr w:type="spellEnd"/>
+      <w:r>
+        <w:t xml:space="preserve"> quedó responsivo como se solicitó en enunciado.</w:t>
+      </w:r>
+    </w:p>
+    <w:p/>
+    <w:p/>
+    <w:p>
+      <w:r>
         <w:t xml:space="preserve">Tu nota en el Desafío 03 es: </w:t>
       </w:r>
       <w:r>
@@ -2695,30 +3556,59 @@
           <w:bCs/>
         </w:rPr>
       </w:pPr>
-      <w:r>
-        <w:rPr>
-          <w:rFonts w:ascii="Segoe UI Emoji" w:hAnsi="Segoe UI Emoji" w:cs="Segoe UI Emoji"/>
-          <w:b/>
-          <w:bCs/>
-        </w:rPr>
-        <w:t>Pousadas Bernardis Juan Manuel</w:t>
-      </w:r>
-    </w:p>
-    <w:p>
-      <w:pPr>
-        <w:rPr>
-          <w:rFonts w:ascii="Segoe UI Emoji" w:hAnsi="Segoe UI Emoji" w:cs="Segoe UI Emoji"/>
-          <w:b/>
-          <w:bCs/>
-        </w:rPr>
-      </w:pPr>
-    </w:p>
-    <w:p>
-      <w:pPr>
-        <w:rPr>
-          <w:rFonts w:ascii="Segoe UI Emoji" w:hAnsi="Segoe UI Emoji" w:cs="Segoe UI Emoji"/>
-        </w:rPr>
-      </w:pPr>
+      <w:proofErr w:type="spellStart"/>
+      <w:r>
+        <w:rPr>
+          <w:rFonts w:ascii="Segoe UI Emoji" w:hAnsi="Segoe UI Emoji" w:cs="Segoe UI Emoji"/>
+          <w:b/>
+          <w:bCs/>
+        </w:rPr>
+        <w:t>Pousadas</w:t>
+      </w:r>
+      <w:proofErr w:type="spellEnd"/>
+      <w:r>
+        <w:rPr>
+          <w:rFonts w:ascii="Segoe UI Emoji" w:hAnsi="Segoe UI Emoji" w:cs="Segoe UI Emoji"/>
+          <w:b/>
+          <w:bCs/>
+        </w:rPr>
+        <w:t xml:space="preserve"> </w:t>
+      </w:r>
+      <w:proofErr w:type="spellStart"/>
+      <w:r>
+        <w:rPr>
+          <w:rFonts w:ascii="Segoe UI Emoji" w:hAnsi="Segoe UI Emoji" w:cs="Segoe UI Emoji"/>
+          <w:b/>
+          <w:bCs/>
+        </w:rPr>
+        <w:t>Bernardis</w:t>
+      </w:r>
+      <w:proofErr w:type="spellEnd"/>
+      <w:r>
+        <w:rPr>
+          <w:rFonts w:ascii="Segoe UI Emoji" w:hAnsi="Segoe UI Emoji" w:cs="Segoe UI Emoji"/>
+          <w:b/>
+          <w:bCs/>
+        </w:rPr>
+        <w:t xml:space="preserve"> Juan Manuel</w:t>
+      </w:r>
+    </w:p>
+    <w:p>
+      <w:pPr>
+        <w:rPr>
+          <w:rFonts w:ascii="Segoe UI Emoji" w:hAnsi="Segoe UI Emoji" w:cs="Segoe UI Emoji"/>
+          <w:b/>
+          <w:bCs/>
+        </w:rPr>
+      </w:pPr>
+    </w:p>
+    <w:p>
+      <w:pPr>
+        <w:rPr>
+          <w:rFonts w:ascii="Segoe UI Emoji" w:hAnsi="Segoe UI Emoji" w:cs="Segoe UI Emoji"/>
+        </w:rPr>
+      </w:pPr>
+      <w:proofErr w:type="gramStart"/>
       <w:r>
         <w:rPr>
           <w:rFonts w:ascii="Segoe UI Emoji" w:hAnsi="Segoe UI Emoji" w:cs="Segoe UI Emoji"/>
@@ -2726,7 +3616,11 @@
         <w:t>🎉</w:t>
       </w:r>
       <w:r>
-        <w:t xml:space="preserve">¡Felicitaciones por la entrega del Desafío 04! </w:t>
+        <w:t>¡</w:t>
+      </w:r>
+      <w:proofErr w:type="gramEnd"/>
+      <w:r>
+        <w:t xml:space="preserve">Felicitaciones por la entrega del Desafío 04! </w:t>
       </w:r>
       <w:r>
         <w:rPr>
@@ -2738,16 +3632,37 @@
     <w:p/>
     <w:p>
       <w:r>
-        <w:t>Juan Manuel</w:t>
-      </w:r>
-      <w:r>
-        <w:t>, excelente trabajo, te felicito. Destaco la prolijidad de tu proyecto.</w:t>
-      </w:r>
-    </w:p>
-    <w:p/>
-    <w:p>
-      <w:r>
-        <w:t>La estructura HTML esta impecable, destaco la correcta implementación de contenedores semánticos como main, section, footer, etc.</w:t>
+        <w:t>Juan Manuel, excelente trabajo, te felicito. Destaco la prolijidad de tu proyecto.</w:t>
+      </w:r>
+    </w:p>
+    <w:p/>
+    <w:p>
+      <w:r>
+        <w:t xml:space="preserve">La estructura HTML esta impecable, destaco la correcta implementación de contenedores semánticos como </w:t>
+      </w:r>
+      <w:proofErr w:type="spellStart"/>
+      <w:r>
+        <w:t>main</w:t>
+      </w:r>
+      <w:proofErr w:type="spellEnd"/>
+      <w:r>
+        <w:t xml:space="preserve">, </w:t>
+      </w:r>
+      <w:proofErr w:type="spellStart"/>
+      <w:r>
+        <w:t>section</w:t>
+      </w:r>
+      <w:proofErr w:type="spellEnd"/>
+      <w:r>
+        <w:t xml:space="preserve">, </w:t>
+      </w:r>
+      <w:proofErr w:type="spellStart"/>
+      <w:r>
+        <w:t>footer</w:t>
+      </w:r>
+      <w:proofErr w:type="spellEnd"/>
+      <w:r>
+        <w:t>, etc.</w:t>
       </w:r>
     </w:p>
     <w:p/>
@@ -2759,7 +3674,15 @@
     <w:p/>
     <w:p>
       <w:r>
-        <w:t>La disposición de elementos en la landing page quedo tal cual lo solicitado con la herramienta Flex.</w:t>
+        <w:t xml:space="preserve">La disposición de elementos en la </w:t>
+      </w:r>
+      <w:proofErr w:type="spellStart"/>
+      <w:r>
+        <w:t>landing</w:t>
+      </w:r>
+      <w:proofErr w:type="spellEnd"/>
+      <w:r>
+        <w:t xml:space="preserve"> page quedo tal cual lo solicitado con la herramienta Flex.</w:t>
       </w:r>
     </w:p>
     <w:p/>
@@ -2771,7 +3694,23 @@
     <w:p/>
     <w:p>
       <w:r>
-        <w:t>En los estilos los colores, tipografías y espaciado quedaron ok, falto agregar efectos hover en la barra de navegación principal y en las cards de productos.</w:t>
+        <w:t xml:space="preserve">En los estilos los colores, tipografías y espaciado quedaron ok, falto agregar efectos </w:t>
+      </w:r>
+      <w:proofErr w:type="spellStart"/>
+      <w:r>
+        <w:t>hover</w:t>
+      </w:r>
+      <w:proofErr w:type="spellEnd"/>
+      <w:r>
+        <w:t xml:space="preserve"> en la barra de navegación principal y en las </w:t>
+      </w:r>
+      <w:proofErr w:type="spellStart"/>
+      <w:r>
+        <w:t>cards</w:t>
+      </w:r>
+      <w:proofErr w:type="spellEnd"/>
+      <w:r>
+        <w:t xml:space="preserve"> de productos.</w:t>
       </w:r>
     </w:p>
     <w:p/>
@@ -2817,23 +3756,34 @@
           <w:bCs/>
         </w:rPr>
       </w:pPr>
-      <w:r>
-        <w:rPr>
-          <w:rFonts w:ascii="Segoe UI Emoji" w:hAnsi="Segoe UI Emoji" w:cs="Segoe UI Emoji"/>
-          <w:b/>
-          <w:bCs/>
-        </w:rPr>
-        <w:t>Guzman de la Cruz Adriano Arturo</w:t>
-      </w:r>
-    </w:p>
-    <w:p/>
-    <w:p/>
-    <w:p>
-      <w:pPr>
-        <w:rPr>
-          <w:rFonts w:ascii="Segoe UI Emoji" w:hAnsi="Segoe UI Emoji" w:cs="Segoe UI Emoji"/>
-        </w:rPr>
-      </w:pPr>
+      <w:proofErr w:type="spellStart"/>
+      <w:r>
+        <w:rPr>
+          <w:rFonts w:ascii="Segoe UI Emoji" w:hAnsi="Segoe UI Emoji" w:cs="Segoe UI Emoji"/>
+          <w:b/>
+          <w:bCs/>
+        </w:rPr>
+        <w:t>Guzman</w:t>
+      </w:r>
+      <w:proofErr w:type="spellEnd"/>
+      <w:r>
+        <w:rPr>
+          <w:rFonts w:ascii="Segoe UI Emoji" w:hAnsi="Segoe UI Emoji" w:cs="Segoe UI Emoji"/>
+          <w:b/>
+          <w:bCs/>
+        </w:rPr>
+        <w:t xml:space="preserve"> de la Cruz Adriano Arturo</w:t>
+      </w:r>
+    </w:p>
+    <w:p/>
+    <w:p/>
+    <w:p>
+      <w:pPr>
+        <w:rPr>
+          <w:rFonts w:ascii="Segoe UI Emoji" w:hAnsi="Segoe UI Emoji" w:cs="Segoe UI Emoji"/>
+        </w:rPr>
+      </w:pPr>
+      <w:proofErr w:type="gramStart"/>
       <w:r>
         <w:rPr>
           <w:rFonts w:ascii="Segoe UI Emoji" w:hAnsi="Segoe UI Emoji" w:cs="Segoe UI Emoji"/>
@@ -2841,7 +3791,11 @@
         <w:t>🎉</w:t>
       </w:r>
       <w:r>
-        <w:t xml:space="preserve">¡Felicitaciones por la entrega del Desafío 02! </w:t>
+        <w:t>¡</w:t>
+      </w:r>
+      <w:proofErr w:type="gramEnd"/>
+      <w:r>
+        <w:t xml:space="preserve">Felicitaciones por la entrega del Desafío 04! </w:t>
       </w:r>
       <w:r>
         <w:rPr>
@@ -2853,61 +3807,158 @@
     <w:p/>
     <w:p>
       <w:r>
-        <w:t>Adrian</w:t>
-      </w:r>
-      <w:r>
-        <w:t>o, excelente trabajo, el resultado es el que se solicitó en enunciado.</w:t>
-      </w:r>
-    </w:p>
-    <w:p/>
-    <w:p>
-      <w:r>
-        <w:t>La estructura HTML esta impecable, destaco la correcta implementación de contenedores semánticos como main, section, footer, etc. El manejo de listas, textos y títulos es correcto</w:t>
-      </w:r>
-    </w:p>
-    <w:p/>
-    <w:p>
-      <w:r>
-        <w:t>La manipulación de enlaces relativos o absolutos quedo perfecto. Genial que aplicaste pseudoclases para los enlaces.</w:t>
-      </w:r>
-    </w:p>
-    <w:p/>
-    <w:p>
-      <w:r>
-        <w:t>La vinculación de la página de estilos externa es correcta, buenisimo que usaste clases e id’s, quedo genial.</w:t>
-      </w:r>
-    </w:p>
-    <w:p/>
-    <w:p>
-      <w:r>
-        <w:t>Destaco que completaste los atributos alt de las imágenes, esto ayuda a mejorar la accesibilidad de sito web.</w:t>
-      </w:r>
-    </w:p>
-    <w:p/>
-    <w:p>
-      <w:r>
-        <w:t>Observaciones:</w:t>
-      </w:r>
-    </w:p>
-    <w:p/>
-    <w:p>
-      <w:pPr>
-        <w:pStyle w:val="Prrafodelista"/>
-        <w:numPr>
-          <w:ilvl w:val="0"/>
-          <w:numId w:val="1"/>
-        </w:numPr>
-      </w:pPr>
-      <w:r>
-        <w:t>Recordá cambiar el lenguaje a español &lt;html lang="es"&gt; porque esto le dice a los motores de búsqueda en que idioma esta tu sitio web.</w:t>
-      </w:r>
-    </w:p>
-    <w:p/>
-    <w:p/>
-    <w:p/>
-    <w:p>
-      <w:r>
-        <w:t xml:space="preserve">Tu nota en el Desafío 02 es: </w:t>
+        <w:t>Adriano</w:t>
+      </w:r>
+      <w:r>
+        <w:t>, excelente trabajo, te felicito. Destaco la prolijidad de tu proyecto.</w:t>
+      </w:r>
+    </w:p>
+    <w:p/>
+    <w:p>
+      <w:r>
+        <w:t xml:space="preserve">La estructura HTML esta impecable, destaco la correcta implementación de contenedores semánticos como </w:t>
+      </w:r>
+      <w:proofErr w:type="spellStart"/>
+      <w:r>
+        <w:t>main</w:t>
+      </w:r>
+      <w:proofErr w:type="spellEnd"/>
+      <w:r>
+        <w:t xml:space="preserve">, </w:t>
+      </w:r>
+      <w:proofErr w:type="spellStart"/>
+      <w:r>
+        <w:t>section</w:t>
+      </w:r>
+      <w:proofErr w:type="spellEnd"/>
+      <w:r>
+        <w:t xml:space="preserve">, </w:t>
+      </w:r>
+      <w:proofErr w:type="spellStart"/>
+      <w:r>
+        <w:t>footer</w:t>
+      </w:r>
+      <w:proofErr w:type="spellEnd"/>
+      <w:r>
+        <w:t>, etc.</w:t>
+      </w:r>
+    </w:p>
+    <w:p/>
+    <w:p>
+      <w:r>
+        <w:t xml:space="preserve">En la parte del banner para que quede como en las imágenes de referencias iría </w:t>
+      </w:r>
+      <w:proofErr w:type="spellStart"/>
+      <w:r>
+        <w:t>background</w:t>
+      </w:r>
+      <w:proofErr w:type="spellEnd"/>
+      <w:r>
+        <w:t xml:space="preserve">-color: </w:t>
+      </w:r>
+      <w:proofErr w:type="spellStart"/>
+      <w:proofErr w:type="gramStart"/>
+      <w:r>
+        <w:t>rgba</w:t>
+      </w:r>
+      <w:proofErr w:type="spellEnd"/>
+      <w:r>
+        <w:t>(</w:t>
+      </w:r>
+      <w:proofErr w:type="gramEnd"/>
+      <w:r>
+        <w:t xml:space="preserve">0, 0, 0, 0.65) y </w:t>
+      </w:r>
+      <w:proofErr w:type="spellStart"/>
+      <w:r>
+        <w:t>rendondear</w:t>
+      </w:r>
+      <w:proofErr w:type="spellEnd"/>
+      <w:r>
+        <w:t xml:space="preserve"> los bordes con </w:t>
+      </w:r>
+      <w:proofErr w:type="spellStart"/>
+      <w:r>
+        <w:t>border-radius</w:t>
+      </w:r>
+      <w:proofErr w:type="spellEnd"/>
+      <w:r>
+        <w:t>.</w:t>
+      </w:r>
+    </w:p>
+    <w:p/>
+    <w:p>
+      <w:proofErr w:type="spellStart"/>
+      <w:r>
+        <w:t>Recordá</w:t>
+      </w:r>
+      <w:proofErr w:type="spellEnd"/>
+      <w:r>
+        <w:t xml:space="preserve"> cambiar el lenguaje a español &lt;</w:t>
+      </w:r>
+      <w:proofErr w:type="spellStart"/>
+      <w:r>
+        <w:t>html</w:t>
+      </w:r>
+      <w:proofErr w:type="spellEnd"/>
+      <w:r>
+        <w:t xml:space="preserve"> </w:t>
+      </w:r>
+      <w:proofErr w:type="spellStart"/>
+      <w:r>
+        <w:t>lang</w:t>
+      </w:r>
+      <w:proofErr w:type="spellEnd"/>
+      <w:r>
+        <w:t xml:space="preserve">="es"&gt; porque esto </w:t>
+      </w:r>
+      <w:proofErr w:type="gramStart"/>
+      <w:r>
+        <w:t>le</w:t>
+      </w:r>
+      <w:proofErr w:type="gramEnd"/>
+      <w:r>
+        <w:t xml:space="preserve"> dice a los motores de búsqueda en que idioma esta tu sitio web.</w:t>
+      </w:r>
+    </w:p>
+    <w:p/>
+    <w:p/>
+    <w:p>
+      <w:r>
+        <w:t xml:space="preserve">La implementación de position para superponer el banner quedo perfecto. </w:t>
+      </w:r>
+    </w:p>
+    <w:p/>
+    <w:p>
+      <w:r>
+        <w:t xml:space="preserve">La disposición de elementos en la </w:t>
+      </w:r>
+      <w:proofErr w:type="spellStart"/>
+      <w:r>
+        <w:t>landing</w:t>
+      </w:r>
+      <w:proofErr w:type="spellEnd"/>
+      <w:r>
+        <w:t xml:space="preserve"> page quedo tal cual lo solicitado con la herramienta Flex.</w:t>
+      </w:r>
+    </w:p>
+    <w:p/>
+    <w:p>
+      <w:r>
+        <w:t>Correctamente creadas la tabla y recurso de video. Los estilos tal cual los solicitados en imágenes de referencia.</w:t>
+      </w:r>
+    </w:p>
+    <w:p/>
+    <w:p/>
+    <w:p>
+      <w:r>
+        <w:t>Excelente trabajo ¡</w:t>
+      </w:r>
+    </w:p>
+    <w:p/>
+    <w:p>
+      <w:r>
+        <w:t xml:space="preserve">Tu nota en el Desafío 04 es: </w:t>
       </w:r>
       <w:r>
         <w:rPr>
@@ -2929,7 +3980,7 @@
 </file>
 
 <file path=word/numbering.xml><?xml version="1.0" encoding="utf-8"?>
-<w:numbering xmlns:wpc="http://schemas.microsoft.com/office/word/2010/wordprocessingCanvas" xmlns:cx="http://schemas.microsoft.com/office/drawing/2014/chartex" xmlns:cx1="http://schemas.microsoft.com/office/drawing/2015/9/8/chartex" xmlns:cx2="http://schemas.microsoft.com/office/drawing/2015/10/21/chartex" xmlns:cx3="http://schemas.microsoft.com/office/drawing/2016/5/9/chartex" xmlns:cx4="http://schemas.microsoft.com/office/drawing/2016/5/10/chartex" xmlns:cx5="http://schemas.microsoft.com/office/drawing/2016/5/11/chartex" xmlns:cx6="http://schemas.microsoft.com/office/drawing/2016/5/12/chartex" xmlns:cx7="http://schemas.microsoft.com/office/drawing/2016/5/13/chartex" xmlns:cx8="http://schemas.microsoft.com/office/drawing/2016/5/14/chartex" xmlns:mc="http://schemas.openxmlformats.org/markup-compatibility/2006" xmlns:aink="http://schemas.microsoft.com/office/drawing/2016/ink" xmlns:am3d="http://schemas.microsoft.com/office/drawing/2017/model3d" xmlns:o="urn:schemas-microsoft-com:office:office" xmlns:oel="http://schemas.microsoft.com/office/2019/extlst" xmlns:r="http://schemas.openxmlformats.org/officeDocument/2006/relationships" xmlns:m="http://schemas.openxmlformats.org/officeDocument/2006/math" xmlns:v="urn:schemas-microsoft-com:vml" xmlns:wp14="http://schemas.microsoft.com/office/word/2010/wordprocessingDrawing" xmlns:wp="http://schemas.openxmlformats.org/drawingml/2006/wordprocessingDrawing" xmlns:w10="urn:schemas-microsoft-com:office:word" xmlns:w="http://schemas.openxmlformats.org/wordprocessingml/2006/main" xmlns:w14="http://schemas.microsoft.com/office/word/2010/wordml" xmlns:w15="http://schemas.microsoft.com/office/word/2012/wordml" xmlns:w16cex="http://schemas.microsoft.com/office/word/2018/wordml/cex" xmlns:w16cid="http://schemas.microsoft.com/office/word/2016/wordml/cid" xmlns:w16="http://schemas.microsoft.com/office/word/2018/wordml" xmlns:w16du="http://schemas.microsoft.com/office/word/2023/wordml/word16du" xmlns:w16sdtdh="http://schemas.microsoft.com/office/word/2020/wordml/sdtdatahash" xmlns:w16sdtfl="http://schemas.microsoft.com/office/word/2024/wordml/sdtformatlock" xmlns:w16se="http://schemas.microsoft.com/office/word/2015/wordml/symex" xmlns:wpg="http://schemas.microsoft.com/office/word/2010/wordprocessingGroup" xmlns:wpi="http://schemas.microsoft.com/office/word/2010/wordprocessingInk" xmlns:wne="http://schemas.microsoft.com/office/word/2006/wordml" xmlns:wps="http://schemas.microsoft.com/office/word/2010/wordprocessingShape" mc:Ignorable="w14 w15 w16se w16cid w16 w16cex w16sdtdh w16sdtfl w16du wp14">
+<w:numbering xmlns:wpc="http://schemas.microsoft.com/office/word/2010/wordprocessingCanvas" xmlns:cx="http://schemas.microsoft.com/office/drawing/2014/chartex" xmlns:cx1="http://schemas.microsoft.com/office/drawing/2015/9/8/chartex" xmlns:cx2="http://schemas.microsoft.com/office/drawing/2015/10/21/chartex" xmlns:cx3="http://schemas.microsoft.com/office/drawing/2016/5/9/chartex" xmlns:cx4="http://schemas.microsoft.com/office/drawing/2016/5/10/chartex" xmlns:cx5="http://schemas.microsoft.com/office/drawing/2016/5/11/chartex" xmlns:cx6="http://schemas.microsoft.com/office/drawing/2016/5/12/chartex" xmlns:cx7="http://schemas.microsoft.com/office/drawing/2016/5/13/chartex" xmlns:cx8="http://schemas.microsoft.com/office/drawing/2016/5/14/chartex" xmlns:mc="http://schemas.openxmlformats.org/markup-compatibility/2006" xmlns:aink="http://schemas.microsoft.com/office/drawing/2016/ink" xmlns:am3d="http://schemas.microsoft.com/office/drawing/2017/model3d" xmlns:o="urn:schemas-microsoft-com:office:office" xmlns:oel="http://schemas.microsoft.com/office/2019/extlst" xmlns:r="http://schemas.openxmlformats.org/officeDocument/2006/relationships" xmlns:m="http://schemas.openxmlformats.org/officeDocument/2006/math" xmlns:v="urn:schemas-microsoft-com:vml" xmlns:wp14="http://schemas.microsoft.com/office/word/2010/wordprocessingDrawing" xmlns:wp="http://schemas.openxmlformats.org/drawingml/2006/wordprocessingDrawing" xmlns:w10="urn:schemas-microsoft-com:office:word" xmlns:w="http://schemas.openxmlformats.org/wordprocessingml/2006/main" xmlns:w14="http://schemas.microsoft.com/office/word/2010/wordml" xmlns:w15="http://schemas.microsoft.com/office/word/2012/wordml" xmlns:w16cex="http://schemas.microsoft.com/office/word/2018/wordml/cex" xmlns:w16cid="http://schemas.microsoft.com/office/word/2016/wordml/cid" xmlns:w16="http://schemas.microsoft.com/office/word/2018/wordml" xmlns:w16sdtdh="http://schemas.microsoft.com/office/word/2020/wordml/sdtdatahash" xmlns:w16se="http://schemas.microsoft.com/office/word/2015/wordml/symex" xmlns:wpg="http://schemas.microsoft.com/office/word/2010/wordprocessingGroup" xmlns:wpi="http://schemas.microsoft.com/office/word/2010/wordprocessingInk" xmlns:wne="http://schemas.microsoft.com/office/word/2006/wordml" xmlns:wps="http://schemas.microsoft.com/office/word/2010/wordprocessingShape" mc:Ignorable="w14 w15 w16se w16cid w16 w16cex w16sdtdh wp14">
   <w:abstractNum w:abstractNumId="0" w15:restartNumberingAfterBreak="0">
     <w:nsid w:val="14BF2A4A"/>
     <w:multiLevelType w:val="hybridMultilevel"/>
@@ -3282,7 +4333,7 @@
 </file>
 
 <file path=word/styles.xml><?xml version="1.0" encoding="utf-8"?>
-<w:styles xmlns:mc="http://schemas.openxmlformats.org/markup-compatibility/2006" xmlns:r="http://schemas.openxmlformats.org/officeDocument/2006/relationships" xmlns:w="http://schemas.openxmlformats.org/wordprocessingml/2006/main" xmlns:w14="http://schemas.microsoft.com/office/word/2010/wordml" xmlns:w15="http://schemas.microsoft.com/office/word/2012/wordml" xmlns:w16cex="http://schemas.microsoft.com/office/word/2018/wordml/cex" xmlns:w16cid="http://schemas.microsoft.com/office/word/2016/wordml/cid" xmlns:w16="http://schemas.microsoft.com/office/word/2018/wordml" xmlns:w16du="http://schemas.microsoft.com/office/word/2023/wordml/word16du" xmlns:w16sdtdh="http://schemas.microsoft.com/office/word/2020/wordml/sdtdatahash" xmlns:w16sdtfl="http://schemas.microsoft.com/office/word/2024/wordml/sdtformatlock" xmlns:w16se="http://schemas.microsoft.com/office/word/2015/wordml/symex" mc:Ignorable="w14 w15 w16se w16cid w16 w16cex w16sdtdh w16sdtfl w16du">
+<w:styles xmlns:mc="http://schemas.openxmlformats.org/markup-compatibility/2006" xmlns:r="http://schemas.openxmlformats.org/officeDocument/2006/relationships" xmlns:w="http://schemas.openxmlformats.org/wordprocessingml/2006/main" xmlns:w14="http://schemas.microsoft.com/office/word/2010/wordml" xmlns:w15="http://schemas.microsoft.com/office/word/2012/wordml" xmlns:w16cex="http://schemas.microsoft.com/office/word/2018/wordml/cex" xmlns:w16cid="http://schemas.microsoft.com/office/word/2016/wordml/cid" xmlns:w16="http://schemas.microsoft.com/office/word/2018/wordml" xmlns:w16sdtdh="http://schemas.microsoft.com/office/word/2020/wordml/sdtdatahash" xmlns:w16se="http://schemas.microsoft.com/office/word/2015/wordml/symex" mc:Ignorable="w14 w15 w16se w16cid w16 w16cex w16sdtdh">
   <w:docDefaults>
     <w:rPrDefault>
       <w:rPr>

</xml_diff>

<commit_message>
Correccion 04 - Terminado hasta Segovia Estefi
</commit_message>
<xml_diff>
--- a/Practicos/Notas y Devoluciones 04.docx
+++ b/Practicos/Notas y Devoluciones 04.docx
@@ -239,7 +239,7 @@
       </w:r>
       <w:proofErr w:type="gramEnd"/>
       <w:r>
-        <w:t xml:space="preserve">Felicitaciones por la entrega del Desafío 03! </w:t>
+        <w:t xml:space="preserve">Felicitaciones por la entrega del Desafío 04! </w:t>
       </w:r>
       <w:r>
         <w:rPr>
@@ -251,13 +251,24 @@
     <w:p/>
     <w:p>
       <w:r>
-        <w:t>Diego, el trabajo realizado es excelente. Destaco la prolijidad del documento ¡</w:t>
-      </w:r>
-    </w:p>
-    <w:p/>
-    <w:p>
-      <w:r>
-        <w:t xml:space="preserve">La estructura HTML esta impecable, destaco la correcta implementación de contenedores semánticos como </w:t>
+        <w:t>Diego</w:t>
+      </w:r>
+      <w:r>
+        <w:t>, muy buen trabajo, te felicito. Destaco la prolijidad de tu proyecto.</w:t>
+      </w:r>
+    </w:p>
+    <w:p/>
+    <w:p>
+      <w:r>
+        <w:t xml:space="preserve">En la estructura HTML solo falto contener la </w:t>
+      </w:r>
+      <w:proofErr w:type="spellStart"/>
+      <w:r>
+        <w:t>info</w:t>
+      </w:r>
+      <w:proofErr w:type="spellEnd"/>
+      <w:r>
+        <w:t xml:space="preserve"> principal en la etiqueta &lt;</w:t>
       </w:r>
       <w:proofErr w:type="spellStart"/>
       <w:r>
@@ -265,6 +276,14 @@
       </w:r>
       <w:proofErr w:type="spellEnd"/>
       <w:r>
+        <w:t xml:space="preserve">&gt;, luego es correcta la implementación de contenedores semánticos como </w:t>
+      </w:r>
+      <w:proofErr w:type="spellStart"/>
+      <w:r>
+        <w:t>header</w:t>
+      </w:r>
+      <w:proofErr w:type="spellEnd"/>
+      <w:r>
         <w:t xml:space="preserve">, </w:t>
       </w:r>
       <w:proofErr w:type="spellStart"/>
@@ -281,84 +300,46 @@
       </w:r>
       <w:proofErr w:type="spellEnd"/>
       <w:r>
-        <w:t>, etc. El manejo de listas, textos y títulos es correcto.</w:t>
-      </w:r>
-    </w:p>
-    <w:p/>
-    <w:p>
-      <w:r>
-        <w:t xml:space="preserve">La barra de navegación principal quedo ok, los links configurados con estado </w:t>
-      </w:r>
-      <w:proofErr w:type="spellStart"/>
-      <w:r>
-        <w:t>hover</w:t>
-      </w:r>
-      <w:proofErr w:type="spellEnd"/>
-      <w:r>
-        <w:t xml:space="preserve"> como se solicitó.</w:t>
-      </w:r>
-    </w:p>
-    <w:p/>
-    <w:p>
-      <w:pPr>
-        <w:ind w:left="708" w:hanging="708"/>
-      </w:pPr>
-      <w:r>
-        <w:t xml:space="preserve">La implementación de Formularios es correcta, los campos con sus tipos de datos respectivos. Acá </w:t>
-      </w:r>
-      <w:r>
-        <w:t xml:space="preserve">la asociación de </w:t>
-      </w:r>
-      <w:proofErr w:type="spellStart"/>
-      <w:r>
-        <w:t>label</w:t>
-      </w:r>
-      <w:proofErr w:type="spellEnd"/>
-      <w:r>
-        <w:t xml:space="preserve"> e input a través de atributo </w:t>
-      </w:r>
-      <w:proofErr w:type="spellStart"/>
-      <w:r>
-        <w:t>for</w:t>
-      </w:r>
-      <w:proofErr w:type="spellEnd"/>
-      <w:r>
-        <w:t xml:space="preserve"> </w:t>
-      </w:r>
-      <w:r>
-        <w:t>e</w:t>
-      </w:r>
-      <w:r>
-        <w:t xml:space="preserve"> id respectivamente ayuda a mejorar la accesibilidad de tu sitio web.</w:t>
-      </w:r>
-    </w:p>
-    <w:p/>
-    <w:p>
-      <w:r>
-        <w:t xml:space="preserve">Los estilos solicitados tanto en colores, fuentes y dimensiones quedaron ok, también aplicaste correctamente las propiedades de box </w:t>
-      </w:r>
-      <w:proofErr w:type="spellStart"/>
-      <w:r>
-        <w:t>model</w:t>
-      </w:r>
-      <w:proofErr w:type="spellEnd"/>
-      <w:r>
-        <w:t xml:space="preserve">. EL </w:t>
-      </w:r>
-      <w:proofErr w:type="spellStart"/>
-      <w:r>
-        <w:t>layout</w:t>
-      </w:r>
-      <w:proofErr w:type="spellEnd"/>
-      <w:r>
-        <w:t xml:space="preserve"> quedó responsivo como se solicitó en enunciado.</w:t>
-      </w:r>
-    </w:p>
-    <w:p/>
-    <w:p/>
-    <w:p>
-      <w:r>
-        <w:t xml:space="preserve">Tu nota en el Desafío 03 es: </w:t>
+        <w:t>, etc.</w:t>
+      </w:r>
+    </w:p>
+    <w:p/>
+    <w:p>
+      <w:r>
+        <w:t xml:space="preserve">La implementación de position para superponer el banner quedo perfecto. </w:t>
+      </w:r>
+    </w:p>
+    <w:p/>
+    <w:p>
+      <w:r>
+        <w:t xml:space="preserve">La disposición de elementos en la </w:t>
+      </w:r>
+      <w:proofErr w:type="spellStart"/>
+      <w:r>
+        <w:t>landing</w:t>
+      </w:r>
+      <w:proofErr w:type="spellEnd"/>
+      <w:r>
+        <w:t xml:space="preserve"> page quedo tal cual lo solicitado con la herramienta Flex.</w:t>
+      </w:r>
+    </w:p>
+    <w:p/>
+    <w:p>
+      <w:r>
+        <w:t>Correctamente creadas la tabla y recurso de video. Los estilos tal cual los solicitados en imágenes de referencia.</w:t>
+      </w:r>
+    </w:p>
+    <w:p/>
+    <w:p/>
+    <w:p>
+      <w:r>
+        <w:t>Excelente trabajo ¡</w:t>
+      </w:r>
+    </w:p>
+    <w:p/>
+    <w:p>
+      <w:r>
+        <w:t xml:space="preserve">Tu nota en el Desafío 04 es: </w:t>
       </w:r>
       <w:r>
         <w:rPr>
@@ -1018,7 +999,7 @@
       </w:r>
       <w:proofErr w:type="gramEnd"/>
       <w:r>
-        <w:t xml:space="preserve">Felicitaciones por la entrega del Desafío 03! </w:t>
+        <w:t xml:space="preserve">Felicitaciones por la entrega del Desafío 04! </w:t>
       </w:r>
       <w:r>
         <w:rPr>
@@ -1035,7 +1016,7 @@
       </w:r>
       <w:proofErr w:type="spellEnd"/>
       <w:r>
-        <w:t>, el trabajo realizado es excelente.</w:t>
+        <w:t xml:space="preserve">, excelente trabajo, te felicito. </w:t>
       </w:r>
     </w:p>
     <w:p/>
@@ -1065,224 +1046,53 @@
       </w:r>
       <w:proofErr w:type="spellEnd"/>
       <w:r>
-        <w:t>, etc. El manejo de listas, textos y títulos es correcto.</w:t>
-      </w:r>
-    </w:p>
-    <w:p/>
-    <w:p>
-      <w:r>
-        <w:lastRenderedPageBreak/>
-        <w:t xml:space="preserve">La barra de navegación principal quedo ok, los links configurados con estado </w:t>
-      </w:r>
-      <w:proofErr w:type="spellStart"/>
-      <w:r>
-        <w:t>hover</w:t>
-      </w:r>
-      <w:proofErr w:type="spellEnd"/>
-      <w:r>
-        <w:t xml:space="preserve"> como se solicitó.</w:t>
-      </w:r>
-    </w:p>
-    <w:p/>
-    <w:p>
-      <w:r>
-        <w:t xml:space="preserve">La implementación de Formularios es correcta, los campos con sus tipos de datos respectivos. </w:t>
-      </w:r>
-    </w:p>
-    <w:p/>
-    <w:p>
-      <w:r>
-        <w:t xml:space="preserve">Los estilos solicitados tanto en colores, fuentes y dimensiones quedaron ok, también aplicaste correctamente las propiedades de box </w:t>
-      </w:r>
-      <w:proofErr w:type="spellStart"/>
-      <w:r>
-        <w:t>model</w:t>
-      </w:r>
-      <w:proofErr w:type="spellEnd"/>
-      <w:r>
-        <w:t xml:space="preserve">. EL </w:t>
-      </w:r>
-      <w:proofErr w:type="spellStart"/>
-      <w:r>
-        <w:t>layout</w:t>
-      </w:r>
-      <w:proofErr w:type="spellEnd"/>
-      <w:r>
-        <w:t xml:space="preserve"> quedó responsivo como se solicitó en enunciado.</w:t>
-      </w:r>
-    </w:p>
-    <w:p/>
-    <w:p/>
-    <w:p>
-      <w:r>
-        <w:t>Observaciones:</w:t>
-      </w:r>
-    </w:p>
-    <w:p/>
-    <w:p>
-      <w:pPr>
-        <w:pStyle w:val="Prrafodelista"/>
-        <w:numPr>
-          <w:ilvl w:val="0"/>
-          <w:numId w:val="1"/>
-        </w:numPr>
-      </w:pPr>
-      <w:proofErr w:type="spellStart"/>
-      <w:r>
-        <w:t>Recordá</w:t>
-      </w:r>
-      <w:proofErr w:type="spellEnd"/>
-      <w:r>
-        <w:t xml:space="preserve"> cambiar el lenguaje a español &lt;</w:t>
-      </w:r>
-      <w:proofErr w:type="spellStart"/>
-      <w:r>
-        <w:t>html</w:t>
-      </w:r>
-      <w:proofErr w:type="spellEnd"/>
-      <w:r>
-        <w:t xml:space="preserve"> </w:t>
-      </w:r>
-      <w:proofErr w:type="spellStart"/>
-      <w:r>
-        <w:t>lang</w:t>
-      </w:r>
-      <w:proofErr w:type="spellEnd"/>
-      <w:r>
-        <w:t xml:space="preserve">="es"&gt; porque esto </w:t>
-      </w:r>
-      <w:proofErr w:type="gramStart"/>
-      <w:r>
-        <w:t>le</w:t>
-      </w:r>
-      <w:proofErr w:type="gramEnd"/>
-      <w:r>
-        <w:t xml:space="preserve"> dice a los motores de búsqueda en que idioma esta tu sitio web.</w:t>
-      </w:r>
-    </w:p>
-    <w:p>
-      <w:pPr>
-        <w:pStyle w:val="Prrafodelista"/>
-      </w:pPr>
-    </w:p>
-    <w:p>
-      <w:pPr>
-        <w:pStyle w:val="Prrafodelista"/>
-        <w:numPr>
-          <w:ilvl w:val="0"/>
-          <w:numId w:val="1"/>
-        </w:numPr>
-      </w:pPr>
-      <w:r>
-        <w:t>M</w:t>
-      </w:r>
-      <w:r>
-        <w:t>ejora la accesibilidad de tu formulario asociar la etiqueta &lt;</w:t>
-      </w:r>
-      <w:proofErr w:type="spellStart"/>
-      <w:r>
-        <w:t>label</w:t>
-      </w:r>
-      <w:proofErr w:type="spellEnd"/>
-      <w:r>
-        <w:t xml:space="preserve">&gt; con el elemento &lt;input&gt; (a través del atributo </w:t>
-      </w:r>
-      <w:proofErr w:type="spellStart"/>
-      <w:r>
-        <w:t>for</w:t>
-      </w:r>
-      <w:proofErr w:type="spellEnd"/>
-      <w:r>
-        <w:t xml:space="preserve"> en el </w:t>
-      </w:r>
-      <w:proofErr w:type="spellStart"/>
-      <w:r>
-        <w:t>label</w:t>
-      </w:r>
-      <w:proofErr w:type="spellEnd"/>
-      <w:r>
-        <w:t xml:space="preserve"> y el id en el </w:t>
-      </w:r>
-      <w:proofErr w:type="gramStart"/>
-      <w:r>
-        <w:t>input )</w:t>
-      </w:r>
-      <w:proofErr w:type="gramEnd"/>
-      <w:r>
-        <w:t xml:space="preserve"> :</w:t>
-      </w:r>
-    </w:p>
-    <w:p>
-      <w:pPr>
-        <w:pStyle w:val="Prrafodelista"/>
-      </w:pPr>
-    </w:p>
-    <w:p>
-      <w:pPr>
-        <w:pStyle w:val="Prrafodelista"/>
-        <w:ind w:left="1416"/>
-      </w:pPr>
-    </w:p>
-    <w:p>
-      <w:pPr>
-        <w:ind w:left="2124"/>
-        <w:rPr>
-          <w:lang w:val="en-US"/>
-        </w:rPr>
-      </w:pPr>
-      <w:r>
-        <w:rPr>
-          <w:lang w:val="en-US"/>
-        </w:rPr>
-        <w:t>&lt;label for="email"&gt;Email&lt;/label&gt;</w:t>
-      </w:r>
-    </w:p>
-    <w:p>
-      <w:pPr>
-        <w:ind w:left="2124"/>
-        <w:rPr>
-          <w:lang w:val="en-US"/>
-        </w:rPr>
-      </w:pPr>
-      <w:r>
-        <w:rPr>
-          <w:lang w:val="en-US"/>
-        </w:rPr>
-        <w:t>&lt;input type="email" id="email" required placeholder="ejemplo@correo.com" &gt;</w:t>
-      </w:r>
-    </w:p>
-    <w:p>
-      <w:pPr>
-        <w:ind w:left="1416"/>
-        <w:rPr>
-          <w:lang w:val="en-US"/>
-        </w:rPr>
-      </w:pPr>
-    </w:p>
-    <w:p>
-      <w:pPr>
-        <w:rPr>
-          <w:lang w:val="en-US"/>
-        </w:rPr>
-      </w:pPr>
-    </w:p>
-    <w:p>
-      <w:pPr>
-        <w:rPr>
-          <w:lang w:val="en-US"/>
-        </w:rPr>
-      </w:pPr>
-    </w:p>
-    <w:p>
-      <w:r>
-        <w:t xml:space="preserve">Tu nota en el Desafío 03 es: </w:t>
-      </w:r>
-      <w:r>
-        <w:rPr>
-          <w:b/>
-          <w:bCs/>
-        </w:rPr>
-        <w:t>9</w:t>
+        <w:t>, etc.</w:t>
+      </w:r>
+    </w:p>
+    <w:p/>
+    <w:p>
+      <w:r>
+        <w:t xml:space="preserve">La implementación de position para superponer el banner quedo perfecto. </w:t>
+      </w:r>
+    </w:p>
+    <w:p/>
+    <w:p>
+      <w:r>
+        <w:t xml:space="preserve">La disposición de elementos en la </w:t>
+      </w:r>
+      <w:proofErr w:type="spellStart"/>
+      <w:r>
+        <w:t>landing</w:t>
+      </w:r>
+      <w:proofErr w:type="spellEnd"/>
+      <w:r>
+        <w:t xml:space="preserve"> page quedo tal cual lo solicitado con la herramienta Flex.</w:t>
+      </w:r>
+    </w:p>
+    <w:p/>
+    <w:p>
+      <w:r>
+        <w:t>Correctamente creadas la tabla y recurso de video. Los estilos tal cual los solicitados en imágenes de referencia.</w:t>
+      </w:r>
+    </w:p>
+    <w:p/>
+    <w:p/>
+    <w:p>
+      <w:r>
+        <w:t>Excelente trabajo ¡</w:t>
+      </w:r>
+    </w:p>
+    <w:p/>
+    <w:p>
+      <w:r>
+        <w:t xml:space="preserve">Tu nota en el Desafío 04 es: </w:t>
+      </w:r>
+      <w:r>
+        <w:rPr>
+          <w:b/>
+          <w:bCs/>
+        </w:rPr>
+        <w:t>10</w:t>
       </w:r>
     </w:p>
     <w:p/>
@@ -1352,10 +1162,7 @@
     <w:p/>
     <w:p>
       <w:r>
-        <w:t>Carlos</w:t>
-      </w:r>
-      <w:r>
-        <w:t xml:space="preserve">, excelente trabajo, te felicito. </w:t>
+        <w:t xml:space="preserve">Carlos, excelente trabajo, te felicito. </w:t>
       </w:r>
     </w:p>
     <w:p/>
@@ -1551,7 +1358,6 @@
     <w:p/>
     <w:p>
       <w:r>
-        <w:lastRenderedPageBreak/>
         <w:t xml:space="preserve">La disposición de elementos en la </w:t>
       </w:r>
       <w:proofErr w:type="spellStart"/>
@@ -1634,14 +1440,51 @@
       </w:pPr>
     </w:p>
     <w:p>
-      <w:r>
-        <w:t>Santino, el resultado logrado es muy bueno, te felicito.</w:t>
-      </w:r>
-    </w:p>
-    <w:p/>
-    <w:p>
-      <w:r>
-        <w:t xml:space="preserve">La estructura HTML esta impecable, destaco la correcta implementación de contenedores semánticos como </w:t>
+      <w:pPr>
+        <w:rPr>
+          <w:rFonts w:ascii="Segoe UI Emoji" w:hAnsi="Segoe UI Emoji" w:cs="Segoe UI Emoji"/>
+        </w:rPr>
+      </w:pPr>
+      <w:proofErr w:type="gramStart"/>
+      <w:r>
+        <w:rPr>
+          <w:rFonts w:ascii="Segoe UI Emoji" w:hAnsi="Segoe UI Emoji" w:cs="Segoe UI Emoji"/>
+        </w:rPr>
+        <w:t>🎉</w:t>
+      </w:r>
+      <w:r>
+        <w:t>¡</w:t>
+      </w:r>
+      <w:proofErr w:type="gramEnd"/>
+      <w:r>
+        <w:t xml:space="preserve">Felicitaciones por la entrega del Desafío 04! </w:t>
+      </w:r>
+      <w:r>
+        <w:rPr>
+          <w:rFonts w:ascii="Segoe UI Emoji" w:hAnsi="Segoe UI Emoji" w:cs="Segoe UI Emoji"/>
+        </w:rPr>
+        <w:t>🎉</w:t>
+      </w:r>
+    </w:p>
+    <w:p/>
+    <w:p>
+      <w:r>
+        <w:t>Santino</w:t>
+      </w:r>
+      <w:r>
+        <w:t>, muy buen trabajo, te felicito. Destaco la prolijidad de tu proyecto.</w:t>
+      </w:r>
+    </w:p>
+    <w:p/>
+    <w:p>
+      <w:r>
+        <w:t xml:space="preserve">La estructura HTML esta </w:t>
+      </w:r>
+      <w:r>
+        <w:t>correcta</w:t>
+      </w:r>
+      <w:r>
+        <w:t xml:space="preserve">, destaco la correcta implementación de contenedores semánticos como </w:t>
       </w:r>
       <w:proofErr w:type="spellStart"/>
       <w:r>
@@ -1665,13 +1508,117 @@
       </w:r>
       <w:proofErr w:type="spellEnd"/>
       <w:r>
-        <w:t>, etc. El manejo de listas, textos y títulos es correcto.</w:t>
-      </w:r>
-    </w:p>
-    <w:p/>
-    <w:p>
-      <w:r>
-        <w:t xml:space="preserve">La barra de navegación principal quedo ok, los links configurados con estado </w:t>
+        <w:t>, etc.</w:t>
+      </w:r>
+      <w:r>
+        <w:t xml:space="preserve"> </w:t>
+      </w:r>
+    </w:p>
+    <w:p/>
+    <w:p>
+      <w:r>
+        <w:t>En la parte de Navegación principal recomiendo contener los &lt;</w:t>
+      </w:r>
+      <w:proofErr w:type="spellStart"/>
+      <w:r>
+        <w:t>li</w:t>
+      </w:r>
+      <w:proofErr w:type="spellEnd"/>
+      <w:r>
+        <w:t>&gt; en la etiqueta &lt;</w:t>
+      </w:r>
+      <w:proofErr w:type="spellStart"/>
+      <w:r>
+        <w:t>ul</w:t>
+      </w:r>
+      <w:proofErr w:type="spellEnd"/>
+      <w:r>
+        <w:t xml:space="preserve">&gt; queda </w:t>
+      </w:r>
+      <w:proofErr w:type="spellStart"/>
+      <w:r>
+        <w:t>mas</w:t>
+      </w:r>
+      <w:proofErr w:type="spellEnd"/>
+      <w:r>
+        <w:t xml:space="preserve"> correcto semánticamente.</w:t>
+      </w:r>
+    </w:p>
+    <w:p/>
+    <w:p>
+      <w:r>
+        <w:t xml:space="preserve">También </w:t>
+      </w:r>
+      <w:proofErr w:type="spellStart"/>
+      <w:r>
+        <w:t>r</w:t>
+      </w:r>
+      <w:r>
+        <w:t>ecordá</w:t>
+      </w:r>
+      <w:proofErr w:type="spellEnd"/>
+      <w:r>
+        <w:t xml:space="preserve"> cambiar el lenguaje a español &lt;</w:t>
+      </w:r>
+      <w:proofErr w:type="spellStart"/>
+      <w:r>
+        <w:t>html</w:t>
+      </w:r>
+      <w:proofErr w:type="spellEnd"/>
+      <w:r>
+        <w:t xml:space="preserve"> </w:t>
+      </w:r>
+      <w:proofErr w:type="spellStart"/>
+      <w:r>
+        <w:t>lang</w:t>
+      </w:r>
+      <w:proofErr w:type="spellEnd"/>
+      <w:r>
+        <w:t xml:space="preserve">="es"&gt; porque esto </w:t>
+      </w:r>
+      <w:proofErr w:type="gramStart"/>
+      <w:r>
+        <w:t>le</w:t>
+      </w:r>
+      <w:proofErr w:type="gramEnd"/>
+      <w:r>
+        <w:t xml:space="preserve"> dice a los motores de búsqueda en que idioma esta tu sitio web.</w:t>
+      </w:r>
+    </w:p>
+    <w:p/>
+    <w:p/>
+    <w:p/>
+    <w:p/>
+    <w:p/>
+    <w:p>
+      <w:r>
+        <w:t xml:space="preserve">La implementación de position para superponer el banner quedo perfecto. </w:t>
+      </w:r>
+    </w:p>
+    <w:p/>
+    <w:p>
+      <w:r>
+        <w:t xml:space="preserve">La disposición de elementos en la </w:t>
+      </w:r>
+      <w:proofErr w:type="spellStart"/>
+      <w:r>
+        <w:t>landing</w:t>
+      </w:r>
+      <w:proofErr w:type="spellEnd"/>
+      <w:r>
+        <w:t xml:space="preserve"> page quedo tal cual lo solicitado con la herramienta Flex.</w:t>
+      </w:r>
+    </w:p>
+    <w:p/>
+    <w:p>
+      <w:r>
+        <w:t xml:space="preserve">Correctamente creadas la tabla y recurso de video. </w:t>
+      </w:r>
+    </w:p>
+    <w:p/>
+    <w:p>
+      <w:r>
+        <w:t xml:space="preserve">En los estilos los colores, tipografías y espaciado quedaron ok, falto agregar efectos </w:t>
       </w:r>
       <w:proofErr w:type="spellStart"/>
       <w:r>
@@ -1679,100 +1626,28 @@
       </w:r>
       <w:proofErr w:type="spellEnd"/>
       <w:r>
-        <w:t xml:space="preserve"> como se solicitó.</w:t>
-      </w:r>
-    </w:p>
-    <w:p/>
-    <w:p>
-      <w:r>
-        <w:t xml:space="preserve">La implementación de Formularios es correcta, los campos con sus tipos de datos respectivos. </w:t>
-      </w:r>
-    </w:p>
-    <w:p/>
-    <w:p>
-      <w:r>
-        <w:t xml:space="preserve">Los estilos solicitados tanto en colores, fuentes y dimensiones quedaron ok, también aplicaste correctamente las propiedades de box </w:t>
-      </w:r>
-      <w:proofErr w:type="spellStart"/>
-      <w:r>
-        <w:t>model</w:t>
-      </w:r>
-      <w:proofErr w:type="spellEnd"/>
-      <w:r>
-        <w:t xml:space="preserve">. EL </w:t>
-      </w:r>
-      <w:proofErr w:type="spellStart"/>
-      <w:r>
-        <w:t>layout</w:t>
-      </w:r>
-      <w:proofErr w:type="spellEnd"/>
-      <w:r>
-        <w:t xml:space="preserve"> quedó responsivo como se solicitó en enunciado.</w:t>
-      </w:r>
-    </w:p>
-    <w:p/>
-    <w:p/>
-    <w:p>
-      <w:r>
-        <w:lastRenderedPageBreak/>
-        <w:t>Observaciones:</w:t>
-      </w:r>
-    </w:p>
-    <w:p/>
-    <w:p>
-      <w:pPr>
-        <w:pStyle w:val="Prrafodelista"/>
-      </w:pPr>
-    </w:p>
-    <w:p>
-      <w:pPr>
-        <w:pStyle w:val="Prrafodelista"/>
-        <w:numPr>
-          <w:ilvl w:val="0"/>
-          <w:numId w:val="3"/>
-        </w:numPr>
-      </w:pPr>
-      <w:r>
-        <w:t xml:space="preserve">Las imágenes están bien creadas, destaco que completaste el atributo </w:t>
-      </w:r>
-      <w:proofErr w:type="spellStart"/>
-      <w:r>
-        <w:t>alt</w:t>
-      </w:r>
-      <w:proofErr w:type="spellEnd"/>
-      <w:r>
-        <w:t xml:space="preserve"> de las mismas, una mejora para que no se deformen al redimensionar la pantalla es aplicar por </w:t>
-      </w:r>
-      <w:proofErr w:type="spellStart"/>
-      <w:r>
-        <w:t>css</w:t>
-      </w:r>
-      <w:proofErr w:type="spellEnd"/>
-      <w:r>
-        <w:t xml:space="preserve"> la propiedad “</w:t>
-      </w:r>
-      <w:proofErr w:type="spellStart"/>
-      <w:r>
-        <w:t>object-fit</w:t>
-      </w:r>
-      <w:proofErr w:type="spellEnd"/>
-      <w:r>
-        <w:t xml:space="preserve">: </w:t>
-      </w:r>
-      <w:proofErr w:type="spellStart"/>
-      <w:r>
-        <w:t>cover</w:t>
-      </w:r>
-      <w:proofErr w:type="spellEnd"/>
-      <w:r>
-        <w:t>” con esto te aseguras que sin importar que las proporciones de la imagen y el contenedor coincidan de ultima que la imagen se recorte pero que no llegue a deformarse.</w:t>
-      </w:r>
-    </w:p>
-    <w:p/>
-    <w:p/>
-    <w:p>
-      <w:r>
-        <w:t xml:space="preserve">Tu nota en el Desafío 03 es: </w:t>
+        <w:t xml:space="preserve"> en la barra de navegación principal y en las </w:t>
+      </w:r>
+      <w:proofErr w:type="spellStart"/>
+      <w:r>
+        <w:t>cards</w:t>
+      </w:r>
+      <w:proofErr w:type="spellEnd"/>
+      <w:r>
+        <w:t xml:space="preserve"> de productos.</w:t>
+      </w:r>
+    </w:p>
+    <w:p/>
+    <w:p/>
+    <w:p>
+      <w:r>
+        <w:t>Excelente trabajo ¡</w:t>
+      </w:r>
+    </w:p>
+    <w:p/>
+    <w:p>
+      <w:r>
+        <w:t xml:space="preserve">Tu nota en el Desafío 04 es: </w:t>
       </w:r>
       <w:r>
         <w:rPr>
@@ -1941,7 +1816,6 @@
     <w:p/>
     <w:p>
       <w:r>
-        <w:lastRenderedPageBreak/>
         <w:t xml:space="preserve">Tu nota en el Desafío 04 es: </w:t>
       </w:r>
       <w:r>
@@ -2176,49 +2050,49 @@
     <w:p/>
     <w:p>
       <w:r>
+        <w:t>Ariana, muy buen trabajo, te felicito. Destaco la prolijidad de tu proyecto.</w:t>
+      </w:r>
+    </w:p>
+    <w:p/>
+    <w:p>
+      <w:r>
+        <w:t xml:space="preserve">La estructura HTML esta impecable, destaco la correcta implementación de contenedores semánticos como </w:t>
+      </w:r>
+      <w:proofErr w:type="spellStart"/>
+      <w:r>
+        <w:t>main</w:t>
+      </w:r>
+      <w:proofErr w:type="spellEnd"/>
+      <w:r>
+        <w:t xml:space="preserve">, </w:t>
+      </w:r>
+      <w:proofErr w:type="spellStart"/>
+      <w:r>
+        <w:t>section</w:t>
+      </w:r>
+      <w:proofErr w:type="spellEnd"/>
+      <w:r>
+        <w:t xml:space="preserve">, </w:t>
+      </w:r>
+      <w:proofErr w:type="spellStart"/>
+      <w:r>
+        <w:t>footer</w:t>
+      </w:r>
+      <w:proofErr w:type="spellEnd"/>
+      <w:r>
+        <w:t>, etc.</w:t>
+      </w:r>
+    </w:p>
+    <w:p/>
+    <w:p>
+      <w:r>
+        <w:t xml:space="preserve">La implementación de position para superponer el banner quedo perfecto. </w:t>
+      </w:r>
+    </w:p>
+    <w:p/>
+    <w:p>
+      <w:r>
         <w:lastRenderedPageBreak/>
-        <w:t>Ariana, muy buen trabajo, te felicito. Destaco la prolijidad de tu proyecto.</w:t>
-      </w:r>
-    </w:p>
-    <w:p/>
-    <w:p>
-      <w:r>
-        <w:t xml:space="preserve">La estructura HTML esta impecable, destaco la correcta implementación de contenedores semánticos como </w:t>
-      </w:r>
-      <w:proofErr w:type="spellStart"/>
-      <w:r>
-        <w:t>main</w:t>
-      </w:r>
-      <w:proofErr w:type="spellEnd"/>
-      <w:r>
-        <w:t xml:space="preserve">, </w:t>
-      </w:r>
-      <w:proofErr w:type="spellStart"/>
-      <w:r>
-        <w:t>section</w:t>
-      </w:r>
-      <w:proofErr w:type="spellEnd"/>
-      <w:r>
-        <w:t xml:space="preserve">, </w:t>
-      </w:r>
-      <w:proofErr w:type="spellStart"/>
-      <w:r>
-        <w:t>footer</w:t>
-      </w:r>
-      <w:proofErr w:type="spellEnd"/>
-      <w:r>
-        <w:t>, etc.</w:t>
-      </w:r>
-    </w:p>
-    <w:p/>
-    <w:p>
-      <w:r>
-        <w:t xml:space="preserve">La implementación de position para superponer el banner quedo perfecto. </w:t>
-      </w:r>
-    </w:p>
-    <w:p/>
-    <w:p>
-      <w:r>
         <w:t xml:space="preserve">La disposición de elementos en la </w:t>
       </w:r>
       <w:proofErr w:type="spellStart"/>
@@ -2353,10 +2227,7 @@
     <w:p/>
     <w:p>
       <w:r>
-        <w:t>Franco</w:t>
-      </w:r>
-      <w:r>
-        <w:t xml:space="preserve">, excelente trabajo, te felicito. </w:t>
+        <w:t xml:space="preserve">Franco, excelente trabajo, te felicito. </w:t>
       </w:r>
     </w:p>
     <w:p/>
@@ -2419,6 +2290,7 @@
     <w:p/>
     <w:p>
       <w:r>
+        <w:lastRenderedPageBreak/>
         <w:t>Excelente trabajo ¡</w:t>
       </w:r>
     </w:p>
@@ -3184,7 +3056,6 @@
     <w:p/>
     <w:p>
       <w:r>
-        <w:lastRenderedPageBreak/>
         <w:t xml:space="preserve">La implementación de position para superponer el banner quedo perfecto. </w:t>
       </w:r>
     </w:p>
@@ -3362,7 +3233,6 @@
     <w:p/>
     <w:p>
       <w:r>
-        <w:lastRenderedPageBreak/>
         <w:t>Excelente trabajo ¡</w:t>
       </w:r>
     </w:p>
@@ -3402,6 +3272,7 @@
           <w:b/>
           <w:bCs/>
         </w:rPr>
+        <w:lastRenderedPageBreak/>
         <w:t>Zabala Pons Gonzalo</w:t>
       </w:r>
     </w:p>
@@ -3668,6 +3539,7 @@
     <w:p/>
     <w:p>
       <w:r>
+        <w:lastRenderedPageBreak/>
         <w:t xml:space="preserve">La implementación de position para superponer el banner quedo perfecto. </w:t>
       </w:r>
     </w:p>
@@ -3807,10 +3679,7 @@
     <w:p/>
     <w:p>
       <w:r>
-        <w:t>Adriano</w:t>
-      </w:r>
-      <w:r>
-        <w:t>, excelente trabajo, te felicito. Destaco la prolijidad de tu proyecto.</w:t>
+        <w:t>Adriano, excelente trabajo, te felicito. Destaco la prolijidad de tu proyecto.</w:t>
       </w:r>
     </w:p>
     <w:p/>

</xml_diff>